<commit_message>
Trim the handbook to a single-business doc
Regenerate Yardhand-Handbook.docx without the SaaS sales pitch and the
multi-tenant "sell to others" roadmap, since Yardhand is now only used for
Ext Professionals.

- Removed Part C (the pitch) entirely.
- Roadmap (now Part C) is trimmed to what matters for one business: turning on
  real payments (Stripe) and messaging (Twilio/email), plus the first-class
  reliability/data-safety and mobile work, with a data-safety checklist.
- Part A (resume) and Part D (technical) updated to drop operator/portal routes
  and the state.platform layer.
- Installed docx with --no-save so the app's dependencies are untouched.

Co-Authored-By: Claude Opus 4.8 <noreply@anthropic.com>
Claude-Session: https://claude.ai/code/session_01FEggkQBQsZanbMCUNRbcMq
</commit_message>
<xml_diff>
--- a/Yardhand-Handbook.docx
+++ b/Yardhand-Handbook.docx
@@ -29,7 +29,7 @@
           <w:sz w:val="32"/>
           <w:szCs w:val="32"/>
         </w:rPr>
-        <w:t xml:space="preserve">Master Handbook</w:t>
+        <w:t xml:space="preserve">Handbook</w:t>
       </w:r>
     </w:p>
     <w:p>
@@ -45,7 +45,7 @@
           <w:sz w:val="21"/>
           <w:szCs w:val="21"/>
         </w:rPr>
-        <w:t xml:space="preserve">Everything in one place — resume, how-to-use, the pitch, the roadmap, and the technical reference.</w:t>
+        <w:t xml:space="preserve">Everything for running Ext Professionals — how to use it, the roadmap, and the technical reference.</w:t>
       </w:r>
     </w:p>
     <w:p>
@@ -74,7 +74,7 @@
           <w:sz w:val="20"/>
           <w:szCs w:val="20"/>
         </w:rPr>
-        <w:t xml:space="preserve">A white-label booking, dispatch &amp; fleet platform for equipment-rental operators.</w:t>
+        <w:t xml:space="preserve">Booking, dispatch &amp; fleet for a dump-trailer / equipment rental business.</w:t>
       </w:r>
     </w:p>
     <w:p>
@@ -173,25 +173,25 @@
           <w:sz w:val="21"/>
           <w:szCs w:val="21"/>
         </w:rPr>
-        <w:t xml:space="preserve">Yardhand — a booking + operations app for a dump-trailer/equipment rental business (Ext Professionals), being built toward a </w:t>
-      </w:r>
-      <w:r>
-        <w:rPr>
-          <w:b/>
-          <w:bCs/>
-          <w:color w:val="222B30"/>
-          <w:sz w:val="21"/>
-          <w:szCs w:val="21"/>
-        </w:rPr>
-        <w:t xml:space="preserve">white-label SaaS</w:t>
-      </w:r>
-      <w:r>
-        <w:rPr>
-          <w:color w:val="222B30"/>
-          <w:sz w:val="21"/>
-          <w:szCs w:val="21"/>
-        </w:rPr>
-        <w:t xml:space="preserve"> other rental businesses can pay for. Not launched yet.</w:t>
+        <w:t xml:space="preserve">Yardhand — a booking + operations app for </w:t>
+      </w:r>
+      <w:r>
+        <w:rPr>
+          <w:b/>
+          <w:bCs/>
+          <w:color w:val="222B30"/>
+          <w:sz w:val="21"/>
+          <w:szCs w:val="21"/>
+        </w:rPr>
+        <w:t xml:space="preserve">Ext Professionals</w:t>
+      </w:r>
+      <w:r>
+        <w:rPr>
+          <w:color w:val="222B30"/>
+          <w:sz w:val="21"/>
+          <w:szCs w:val="21"/>
+        </w:rPr>
+        <w:t xml:space="preserve">, a dump-trailer / equipment rental business. Built and used for this one business (it is not sold to other companies).</w:t>
       </w:r>
     </w:p>
     <w:p>
@@ -289,7 +289,7 @@
           <w:sz w:val="21"/>
           <w:szCs w:val="21"/>
         </w:rPr>
-        <w:t xml:space="preserve">Stack: Next.js (App Router) single-file client app app/yardhand-app.jsx; server files app/layout.js, app/page.js, app/site-data.js, app/robots.js, app/sitemap.js; routes / (rental app), /book (embeddable booking), /operator (SaaS admin), /portal (chooser).</w:t>
+        <w:t xml:space="preserve">Stack: Next.js (App Router) single-file client app app/yardhand-app.jsx; server files app/layout.js, app/page.js, app/site-data.js, app/robots.js, app/sitemap.js; routes / (the app) and /book (embeddable booking page).</w:t>
       </w:r>
     </w:p>
     <w:p>
@@ -453,119 +453,63 @@
           <w:sz w:val="21"/>
           <w:szCs w:val="21"/>
         </w:rPr>
-        <w:t xml:space="preserve">standing weekly schedule + per-day overrides (availOn); auto/manual dispatch; sick-day auto-reassign.</w:t>
-      </w:r>
-    </w:p>
-    <w:p>
-      <w:pPr>
-        <w:pStyle w:val="ListParagraph"/>
-        <w:numPr>
-          <w:ilvl w:val="0"/>
-          <w:numId w:val="2"/>
-        </w:numPr>
-        <w:spacing w:after="70" w:line="272"/>
-      </w:pPr>
-      <w:r>
-        <w:rPr>
-          <w:b/>
-          <w:bCs/>
-          <w:color w:val="222B30"/>
-          <w:sz w:val="21"/>
-          <w:szCs w:val="21"/>
-        </w:rPr>
-        <w:t xml:space="preserve">Booking availability modes </w:t>
-      </w:r>
-      <w:r>
-        <w:rPr>
-          <w:color w:val="222B30"/>
-          <w:sz w:val="21"/>
-          <w:szCs w:val="21"/>
-        </w:rPr>
-        <w:t xml:space="preserve">(business.bookingMode: strict / flexible / hybrid) — customers can only book when someone qualified is working; “how far ahead you take bookings” window (bookHorizonDays).</w:t>
-      </w:r>
-    </w:p>
-    <w:p>
-      <w:pPr>
-        <w:pStyle w:val="ListParagraph"/>
-        <w:numPr>
-          <w:ilvl w:val="0"/>
-          <w:numId w:val="2"/>
-        </w:numPr>
-        <w:spacing w:after="70" w:line="272"/>
-      </w:pPr>
-      <w:r>
-        <w:rPr>
-          <w:b/>
-          <w:bCs/>
-          <w:color w:val="222B30"/>
-          <w:sz w:val="21"/>
-          <w:szCs w:val="21"/>
-        </w:rPr>
-        <w:t xml:space="preserve">Custom job roles/positions </w:t>
-      </w:r>
-      <w:r>
-        <w:rPr>
-          <w:color w:val="222B30"/>
-          <w:sz w:val="21"/>
-          <w:szCs w:val="21"/>
-        </w:rPr>
-        <w:t xml:space="preserve">(business.roles[] with drive/yard caps; contractor.roleId) gate dispatch — a Mechanic-type role is never dispatched but is still a scheduled/paid employee.</w:t>
-      </w:r>
-    </w:p>
-    <w:p>
-      <w:pPr>
-        <w:pStyle w:val="ListParagraph"/>
-        <w:numPr>
-          <w:ilvl w:val="0"/>
-          <w:numId w:val="2"/>
-        </w:numPr>
-        <w:spacing w:after="70" w:line="272"/>
-      </w:pPr>
-      <w:r>
-        <w:rPr>
-          <w:b/>
-          <w:bCs/>
-          <w:color w:val="222B30"/>
-          <w:sz w:val="21"/>
-          <w:szCs w:val="21"/>
-        </w:rPr>
-        <w:t xml:space="preserve">Per-employee PIN logins </w:t>
-      </w:r>
-      <w:r>
-        <w:rPr>
-          <w:color w:val="222B30"/>
-          <w:sz w:val="21"/>
-          <w:szCs w:val="21"/>
-        </w:rPr>
-        <w:t xml:space="preserve">(contractor.pin) — each crew member sees ONLY their own jobs/hours/pay. “Who sets work hours” (scheduleControl: worker/owner/both).</w:t>
-      </w:r>
-    </w:p>
-    <w:p>
-      <w:pPr>
-        <w:pStyle w:val="ListParagraph"/>
-        <w:numPr>
-          <w:ilvl w:val="0"/>
-          <w:numId w:val="2"/>
-        </w:numPr>
-        <w:spacing w:after="70" w:line="272"/>
-      </w:pPr>
-      <w:r>
-        <w:rPr>
-          <w:b/>
-          <w:bCs/>
-          <w:color w:val="222B30"/>
-          <w:sz w:val="21"/>
-          <w:szCs w:val="21"/>
-        </w:rPr>
-        <w:t xml:space="preserve">Flexible pay: </w:t>
-      </w:r>
-      <w:r>
-        <w:rPr>
-          <w:color w:val="222B30"/>
-          <w:sz w:val="21"/>
-          <w:szCs w:val="21"/>
-        </w:rPr>
-        <w:t xml:space="preserve">1099/W2 × per-job/hourly/salary; payroll views (payouts simulated). Marketing win-back texts (simulated send).</w:t>
+        <w:t xml:space="preserve">standing weekly schedule + per-day overrides (availOn); auto/manual dispatch; sick-day auto-reassign; booking availability modes (bookingMode: strict / flexible / hybrid); “how far ahead you take bookings” window.</w:t>
+      </w:r>
+    </w:p>
+    <w:p>
+      <w:pPr>
+        <w:pStyle w:val="ListParagraph"/>
+        <w:numPr>
+          <w:ilvl w:val="0"/>
+          <w:numId w:val="2"/>
+        </w:numPr>
+        <w:spacing w:after="70" w:line="272"/>
+      </w:pPr>
+      <w:r>
+        <w:rPr>
+          <w:b/>
+          <w:bCs/>
+          <w:color w:val="222B30"/>
+          <w:sz w:val="21"/>
+          <w:szCs w:val="21"/>
+        </w:rPr>
+        <w:t xml:space="preserve">Crew: </w:t>
+      </w:r>
+      <w:r>
+        <w:rPr>
+          <w:color w:val="222B30"/>
+          <w:sz w:val="21"/>
+          <w:szCs w:val="21"/>
+        </w:rPr>
+        <w:t xml:space="preserve">custom job roles/positions (drive/yard caps) that gate dispatch; per-employee PIN logins (each person sees only their own jobs/hours/pay); “who sets work hours” (worker/owner/both).</w:t>
+      </w:r>
+    </w:p>
+    <w:p>
+      <w:pPr>
+        <w:pStyle w:val="ListParagraph"/>
+        <w:numPr>
+          <w:ilvl w:val="0"/>
+          <w:numId w:val="2"/>
+        </w:numPr>
+        <w:spacing w:after="70" w:line="272"/>
+      </w:pPr>
+      <w:r>
+        <w:rPr>
+          <w:b/>
+          <w:bCs/>
+          <w:color w:val="222B30"/>
+          <w:sz w:val="21"/>
+          <w:szCs w:val="21"/>
+        </w:rPr>
+        <w:t xml:space="preserve">Money: </w:t>
+      </w:r>
+      <w:r>
+        <w:rPr>
+          <w:color w:val="222B30"/>
+          <w:sz w:val="21"/>
+          <w:szCs w:val="21"/>
+        </w:rPr>
+        <w:t xml:space="preserve">flexible pay (1099/W2 × per-job/hourly/salary) + payroll views; pricing/fees/deposit/waiver/tax/cancellation; marketing win-back texts (config).</w:t>
       </w:r>
     </w:p>
     <w:p>
@@ -593,35 +537,7 @@
           <w:sz w:val="21"/>
           <w:szCs w:val="21"/>
         </w:rPr>
-        <w:t xml:space="preserve">Settings → “Get found on Google” (seoTitle/seoDescription/seoKeywords + checklist) feeds generateMetadata (layout.js) + LocalBusiness JSON-LD (page.js) via app/site-data.js. Verified in server-rendered HTML.</w:t>
-      </w:r>
-    </w:p>
-    <w:p>
-      <w:pPr>
-        <w:pStyle w:val="ListParagraph"/>
-        <w:numPr>
-          <w:ilvl w:val="0"/>
-          <w:numId w:val="2"/>
-        </w:numPr>
-        <w:spacing w:after="70" w:line="272"/>
-      </w:pPr>
-      <w:r>
-        <w:rPr>
-          <w:b/>
-          <w:bCs/>
-          <w:color w:val="222B30"/>
-          <w:sz w:val="21"/>
-          <w:szCs w:val="21"/>
-        </w:rPr>
-        <w:t xml:space="preserve">Separate SaaS side: </w:t>
-      </w:r>
-      <w:r>
-        <w:rPr>
-          <w:color w:val="222B30"/>
-          <w:sz w:val="21"/>
-          <w:szCs w:val="21"/>
-        </w:rPr>
-        <w:t xml:space="preserve">/operator (passcode) + /portal chooser; simulated Platform Admin (subscribers, MRR/ARR/KPIs, editable Yardhand marketing site). /operator, /portal, /book are noindex.</w:t>
+        <w:t xml:space="preserve">Settings → “Get found on Google” (seoTitle/seoDescription/seoKeywords + checklist) feeds generateMetadata (layout.js) + LocalBusiness JSON-LD (page.js) via app/site-data.js.</w:t>
       </w:r>
     </w:p>
     <w:p>
@@ -637,153 +553,63 @@
           <w:sz w:val="24"/>
           <w:szCs w:val="24"/>
         </w:rPr>
-        <w:t xml:space="preserve">Simulated / not real yet — the gates to selling</w:t>
-      </w:r>
-    </w:p>
-    <w:p>
-      <w:pPr>
-        <w:pStyle w:val="ListParagraph"/>
-        <w:numPr>
-          <w:ilvl w:val="0"/>
-          <w:numId w:val="2"/>
-        </w:numPr>
-        <w:spacing w:after="70" w:line="272"/>
-      </w:pPr>
-      <w:r>
-        <w:rPr>
-          <w:color w:val="222B30"/>
-          <w:sz w:val="21"/>
-          <w:szCs w:val="21"/>
-        </w:rPr>
-        <w:t xml:space="preserve">Real </w:t>
-      </w:r>
-      <w:r>
-        <w:rPr>
-          <w:b/>
-          <w:bCs/>
-          <w:color w:val="222B30"/>
-          <w:sz w:val="21"/>
-          <w:szCs w:val="21"/>
-        </w:rPr>
-        <w:t xml:space="preserve">auth + multi-tenant data isolation</w:t>
-      </w:r>
-      <w:r>
-        <w:rPr>
-          <w:color w:val="222B30"/>
-          <w:sz w:val="21"/>
-          <w:szCs w:val="21"/>
-        </w:rPr>
-        <w:t xml:space="preserve"> (one shared workspace today) — Phases 1–2.</w:t>
-      </w:r>
-    </w:p>
-    <w:p>
-      <w:pPr>
-        <w:pStyle w:val="ListParagraph"/>
-        <w:numPr>
-          <w:ilvl w:val="0"/>
-          <w:numId w:val="2"/>
-        </w:numPr>
-        <w:spacing w:after="70" w:line="272"/>
-      </w:pPr>
-      <w:r>
-        <w:rPr>
-          <w:b/>
-          <w:bCs/>
-          <w:color w:val="222B30"/>
-          <w:sz w:val="21"/>
-          <w:szCs w:val="21"/>
-        </w:rPr>
-        <w:t xml:space="preserve">Payments</w:t>
-      </w:r>
-      <w:r>
-        <w:rPr>
-          <w:color w:val="222B30"/>
-          <w:sz w:val="21"/>
-          <w:szCs w:val="21"/>
-        </w:rPr>
-        <w:t xml:space="preserve"> (Stripe), </w:t>
-      </w:r>
-      <w:r>
-        <w:rPr>
-          <w:b/>
-          <w:bCs/>
-          <w:color w:val="222B30"/>
-          <w:sz w:val="21"/>
-          <w:szCs w:val="21"/>
-        </w:rPr>
-        <w:t xml:space="preserve">messaging</w:t>
-      </w:r>
-      <w:r>
-        <w:rPr>
-          <w:color w:val="222B30"/>
-          <w:sz w:val="21"/>
-          <w:szCs w:val="21"/>
-        </w:rPr>
-        <w:t xml:space="preserve"> (SMS/email), </w:t>
-      </w:r>
-      <w:r>
-        <w:rPr>
-          <w:b/>
-          <w:bCs/>
-          <w:color w:val="222B30"/>
-          <w:sz w:val="21"/>
-          <w:szCs w:val="21"/>
-        </w:rPr>
-        <w:t xml:space="preserve">SaaS subscription billing</w:t>
-      </w:r>
-      <w:r>
-        <w:rPr>
-          <w:color w:val="222B30"/>
-          <w:sz w:val="21"/>
-          <w:szCs w:val="21"/>
-        </w:rPr>
-        <w:t xml:space="preserve"> — all simulated.</w:t>
-      </w:r>
-    </w:p>
-    <w:p>
-      <w:pPr>
-        <w:pStyle w:val="ListParagraph"/>
-        <w:numPr>
-          <w:ilvl w:val="0"/>
-          <w:numId w:val="2"/>
-        </w:numPr>
-        <w:spacing w:after="70" w:line="272"/>
-      </w:pPr>
-      <w:r>
-        <w:rPr>
-          <w:b/>
-          <w:bCs/>
-          <w:color w:val="222B30"/>
-          <w:sz w:val="21"/>
-          <w:szCs w:val="21"/>
-        </w:rPr>
-        <w:t xml:space="preserve">Reliability &amp; data-safety</w:t>
-      </w:r>
-      <w:r>
-        <w:rPr>
-          <w:color w:val="222B30"/>
-          <w:sz w:val="21"/>
-          <w:szCs w:val="21"/>
-        </w:rPr>
-        <w:t xml:space="preserve"> and </w:t>
-      </w:r>
-      <w:r>
-        <w:rPr>
-          <w:b/>
-          <w:bCs/>
-          <w:color w:val="222B30"/>
-          <w:sz w:val="21"/>
-          <w:szCs w:val="21"/>
-        </w:rPr>
-        <w:t xml:space="preserve">mobile experience</w:t>
-      </w:r>
-      <w:r>
-        <w:rPr>
-          <w:color w:val="222B30"/>
-          <w:sz w:val="21"/>
-          <w:szCs w:val="21"/>
-        </w:rPr>
-        <w:t xml:space="preserve"> are FIRST-CLASS, launch-gating cross-cutting workstreams (don't defer to the end).</w:t>
+        <w:t xml:space="preserve">Still simulated (not yet connected)</w:t>
+      </w:r>
+    </w:p>
+    <w:p>
+      <w:pPr>
+        <w:pStyle w:val="ListParagraph"/>
+        <w:numPr>
+          <w:ilvl w:val="0"/>
+          <w:numId w:val="2"/>
+        </w:numPr>
+        <w:spacing w:after="70" w:line="272"/>
+      </w:pPr>
+      <w:r>
+        <w:rPr>
+          <w:b/>
+          <w:bCs/>
+          <w:color w:val="222B30"/>
+          <w:sz w:val="21"/>
+          <w:szCs w:val="21"/>
+        </w:rPr>
+        <w:t xml:space="preserve">Payments </w:t>
+      </w:r>
+      <w:r>
+        <w:rPr>
+          <w:color w:val="222B30"/>
+          <w:sz w:val="21"/>
+          <w:szCs w:val="21"/>
+        </w:rPr>
+        <w:t xml:space="preserve">(Stripe) — card charges, deposit holds, and crew payouts are set up as realistic previews until the payment service is connected.</w:t>
+      </w:r>
+    </w:p>
+    <w:p>
+      <w:pPr>
+        <w:pStyle w:val="ListParagraph"/>
+        <w:numPr>
+          <w:ilvl w:val="0"/>
+          <w:numId w:val="2"/>
+        </w:numPr>
+        <w:spacing w:after="70" w:line="272"/>
+      </w:pPr>
+      <w:r>
+        <w:rPr>
+          <w:b/>
+          <w:bCs/>
+          <w:color w:val="222B30"/>
+          <w:sz w:val="21"/>
+          <w:szCs w:val="21"/>
+        </w:rPr>
+        <w:t xml:space="preserve">Messaging </w:t>
+      </w:r>
+      <w:r>
+        <w:rPr>
+          <w:color w:val="222B30"/>
+          <w:sz w:val="21"/>
+          <w:szCs w:val="21"/>
+        </w:rPr>
+        <w:t xml:space="preserve">(SMS/email) — booking confirmations, reminders, driver job alerts, and review requests are staged until Twilio/email is connected.</w:t>
       </w:r>
     </w:p>
     <w:p>
@@ -799,7 +625,7 @@
           <w:sz w:val="24"/>
           <w:szCs w:val="24"/>
         </w:rPr>
-        <w:t xml:space="preserve">Honest positioning</w:t>
+        <w:t xml:space="preserve">Positioning</w:t>
       </w:r>
     </w:p>
     <w:p>
@@ -812,25 +638,7 @@
           <w:sz w:val="21"/>
           <w:szCs w:val="21"/>
         </w:rPr>
-        <w:t xml:space="preserve">A strong, well-modeled prototype. It becomes a genuinely competitive product for the small equipment/trailer-rental niche </w:t>
-      </w:r>
-      <w:r>
-        <w:rPr>
-          <w:b/>
-          <w:bCs/>
-          <w:color w:val="222B30"/>
-          <w:sz w:val="21"/>
-          <w:szCs w:val="21"/>
-        </w:rPr>
-        <w:t xml:space="preserve">once the backend (auth/multi-tenant/payments/messaging/billing) is real</w:t>
-      </w:r>
-      <w:r>
-        <w:rPr>
-          <w:color w:val="222B30"/>
-          <w:sz w:val="21"/>
-          <w:szCs w:val="21"/>
-        </w:rPr>
-        <w:t xml:space="preserve">, plus reliability and mobile polish. It won't out-feature Jobber/Housecall Pro on breadth — it wins the niche on fit, price, and the integrated storefront + booking + SEO. Highest-leverage next build = Phase 1–2.</w:t>
+        <w:t xml:space="preserve">A capable operations tool for running the business day to day. To take real money and send real messages, connect payments (Stripe) and messaging (Twilio/email). The two things that matter most on the way there: don't lose data (keep the Supabase project active + backed up) and a good phone experience for the field.</w:t>
       </w:r>
     </w:p>
     <w:tbl>
@@ -1726,25 +1534,7 @@
           <w:sz w:val="21"/>
           <w:szCs w:val="21"/>
         </w:rPr>
-        <w:t xml:space="preserve">Team sign-in → phone/email + personal PIN. Your </w:t>
-      </w:r>
-      <w:r>
-        <w:rPr>
-          <w:b/>
-          <w:bCs/>
-          <w:color w:val="222B30"/>
-          <w:sz w:val="21"/>
-          <w:szCs w:val="21"/>
-        </w:rPr>
-        <w:t xml:space="preserve">SaaS business</w:t>
-      </w:r>
-      <w:r>
-        <w:rPr>
-          <w:color w:val="222B30"/>
-          <w:sz w:val="21"/>
-          <w:szCs w:val="21"/>
-        </w:rPr>
-        <w:t xml:space="preserve"> (managing Yardhand as a product) is a separate door at /operator with its own passcode; use /portal to choose between them.</w:t>
+        <w:t xml:space="preserve">Team sign-in on your public site → phone/email + personal PIN.</w:t>
       </w:r>
     </w:p>
     <w:p>
@@ -1865,7 +1655,7 @@
           <w:sz w:val="32"/>
           <w:szCs w:val="32"/>
         </w:rPr>
-        <w:t xml:space="preserve">Part C — The Pitch</w:t>
+        <w:t xml:space="preserve">Part C — Roadmap &amp; What's Simulated</w:t>
       </w:r>
     </w:p>
     <w:p>
@@ -1880,62 +1670,9 @@
           <w:sz w:val="21"/>
           <w:szCs w:val="21"/>
         </w:rPr>
-        <w:t xml:space="preserve">For selling Yardhand to other rental businesses (white-label).</w:t>
-      </w:r>
-    </w:p>
-    <w:tbl>
-      <w:tblPr>
-        <w:tblW w:type="dxa" w:w="9360"/>
-        <w:tblBorders>
-          <w:top w:val="none" w:color="FFFFFF" w:sz="0"/>
-          <w:left w:val="single" w:color="B57A1F" w:sz="24"/>
-          <w:bottom w:val="none" w:color="FFFFFF" w:sz="0"/>
-          <w:right w:val="none" w:color="FFFFFF" w:sz="0"/>
-          <w:insideH w:val="none" w:color="FFFFFF" w:sz="0"/>
-          <w:insideV w:val="none" w:color="FFFFFF" w:sz="0"/>
-        </w:tblBorders>
-      </w:tblPr>
-      <w:tblGrid>
-        <w:gridCol w:w="9360"/>
-      </w:tblGrid>
-      <w:tr>
-        <w:tc>
-          <w:tcPr>
-            <w:tcW w:type="dxa" w:w="9360"/>
-            <w:shd w:fill="F6ECD8" w:color="auto" w:val="clear"/>
-            <w:tcMar>
-              <w:top w:type="dxa" w:w="130"/>
-              <w:left w:type="dxa" w:w="200"/>
-              <w:bottom w:type="dxa" w:w="130"/>
-              <w:right w:type="dxa" w:w="160"/>
-            </w:tcMar>
-          </w:tcPr>
-          <w:p>
-            <w:pPr>
-              <w:spacing w:after="0" w:line="268"/>
-            </w:pPr>
-            <w:r>
-              <w:rPr>
-                <w:b/>
-                <w:bCs/>
-                <w:color w:val="222B30"/>
-                <w:sz w:val="22"/>
-                <w:szCs w:val="22"/>
-              </w:rPr>
-              <w:t xml:space="preserve">Yardhand runs your entire rental yard — customer bookings, driver dispatch, fleet, and billing — from a single screen. </w:t>
-            </w:r>
-            <w:r>
-              <w:rPr>
-                <w:color w:val="222B30"/>
-                <w:sz w:val="22"/>
-                <w:szCs w:val="22"/>
-              </w:rPr>
-              <w:t xml:space="preserve">Built by a working rental operator, so it already speaks the business. You don't adapt to the software; the software adapts to you.</w:t>
-            </w:r>
-          </w:p>
-        </w:tc>
-      </w:tr>
-    </w:tbl>
+        <w:t xml:space="preserve">What's left to turn on for the business.</w:t>
+      </w:r>
+    </w:p>
     <w:p>
       <w:pPr>
         <w:pStyle w:val="Heading2"/>
@@ -1949,365 +1686,7 @@
           <w:sz w:val="24"/>
           <w:szCs w:val="24"/>
         </w:rPr>
-        <w:t xml:space="preserve">The problem we solve</w:t>
-      </w:r>
-    </w:p>
-    <w:p>
-      <w:pPr>
-        <w:spacing w:after="120" w:line="278"/>
-      </w:pPr>
-      <w:r>
-        <w:rPr>
-          <w:color w:val="222B30"/>
-          <w:sz w:val="21"/>
-          <w:szCs w:val="21"/>
-        </w:rPr>
-        <w:t xml:space="preserve">Most rental operations run on a wall calendar, a spreadsheet, and a stack of texts to drivers. It works until it doesn't — double-bookings, phone tag, forgotten returns, after-hours bookings lost to a competitor, and money that slips (deposits not held, fees not charged). Every one is a leak. Yardhand closes them.</w:t>
-      </w:r>
-    </w:p>
-    <w:p>
-      <w:pPr>
-        <w:pStyle w:val="Heading2"/>
-        <w:spacing w:after="80" w:before="220"/>
-      </w:pPr>
-      <w:r>
-        <w:rPr>
-          <w:b/>
-          <w:bCs/>
-          <w:color w:val="B57A1F"/>
-          <w:sz w:val="24"/>
-          <w:szCs w:val="24"/>
-        </w:rPr>
-        <w:t xml:space="preserve">What Yardhand does</w:t>
-      </w:r>
-    </w:p>
-    <w:p>
-      <w:pPr>
-        <w:pStyle w:val="ListParagraph"/>
-        <w:numPr>
-          <w:ilvl w:val="0"/>
-          <w:numId w:val="2"/>
-        </w:numPr>
-        <w:spacing w:after="70" w:line="272"/>
-      </w:pPr>
-      <w:r>
-        <w:rPr>
-          <w:b/>
-          <w:bCs/>
-          <w:color w:val="222B30"/>
-          <w:sz w:val="21"/>
-          <w:szCs w:val="21"/>
-        </w:rPr>
-        <w:t xml:space="preserve">Customers book themselves, 24/7 </w:t>
-      </w:r>
-      <w:r>
-        <w:rPr>
-          <w:color w:val="222B30"/>
-          <w:sz w:val="21"/>
-          <w:szCs w:val="21"/>
-        </w:rPr>
-        <w:t xml:space="preserve">— pick a unit, choose dates, delivery or self-pickup, sign, and pay; it lands on your dashboard instantly, with transparent itemized pricing.</w:t>
-      </w:r>
-    </w:p>
-    <w:p>
-      <w:pPr>
-        <w:pStyle w:val="ListParagraph"/>
-        <w:numPr>
-          <w:ilvl w:val="0"/>
-          <w:numId w:val="2"/>
-        </w:numPr>
-        <w:spacing w:after="70" w:line="272"/>
-      </w:pPr>
-      <w:r>
-        <w:rPr>
-          <w:b/>
-          <w:bCs/>
-          <w:color w:val="222B30"/>
-          <w:sz w:val="21"/>
-          <w:szCs w:val="21"/>
-        </w:rPr>
-        <w:t xml:space="preserve">You run the day from one dashboard </w:t>
-      </w:r>
-      <w:r>
-        <w:rPr>
-          <w:color w:val="222B30"/>
-          <w:sz w:val="21"/>
-          <w:szCs w:val="21"/>
-        </w:rPr>
-        <w:t xml:space="preserve">— today's pickups/returns, overdue units, and every run needing a driver, on one screen.</w:t>
-      </w:r>
-    </w:p>
-    <w:p>
-      <w:pPr>
-        <w:pStyle w:val="ListParagraph"/>
-        <w:numPr>
-          <w:ilvl w:val="0"/>
-          <w:numId w:val="2"/>
-        </w:numPr>
-        <w:spacing w:after="70" w:line="272"/>
-      </w:pPr>
-      <w:r>
-        <w:rPr>
-          <w:b/>
-          <w:bCs/>
-          <w:color w:val="222B30"/>
-          <w:sz w:val="21"/>
-          <w:szCs w:val="21"/>
-        </w:rPr>
-        <w:t xml:space="preserve">Dispatch that thinks like a dispatcher </w:t>
-      </w:r>
-      <w:r>
-        <w:rPr>
-          <w:color w:val="222B30"/>
-          <w:sz w:val="21"/>
-          <w:szCs w:val="21"/>
-        </w:rPr>
-        <w:t xml:space="preserve">— two independent trips per rental, availability-aware, one-click auto-assign.</w:t>
-      </w:r>
-    </w:p>
-    <w:p>
-      <w:pPr>
-        <w:pStyle w:val="ListParagraph"/>
-        <w:numPr>
-          <w:ilvl w:val="0"/>
-          <w:numId w:val="2"/>
-        </w:numPr>
-        <w:spacing w:after="70" w:line="272"/>
-      </w:pPr>
-      <w:r>
-        <w:rPr>
-          <w:b/>
-          <w:bCs/>
-          <w:color w:val="222B30"/>
-          <w:sz w:val="21"/>
-          <w:szCs w:val="21"/>
-        </w:rPr>
-        <w:t xml:space="preserve">Your crew, organized and private </w:t>
-      </w:r>
-      <w:r>
-        <w:rPr>
-          <w:color w:val="222B30"/>
-          <w:sz w:val="21"/>
-          <w:szCs w:val="21"/>
-        </w:rPr>
-        <w:t xml:space="preserve">— your own positions decide who gets which jobs; set each person's normal week once; every crew member gets a private personal sign-in and sees only their own work.</w:t>
-      </w:r>
-    </w:p>
-    <w:p>
-      <w:pPr>
-        <w:pStyle w:val="ListParagraph"/>
-        <w:numPr>
-          <w:ilvl w:val="0"/>
-          <w:numId w:val="2"/>
-        </w:numPr>
-        <w:spacing w:after="70" w:line="272"/>
-      </w:pPr>
-      <w:r>
-        <w:rPr>
-          <w:b/>
-          <w:bCs/>
-          <w:color w:val="222B30"/>
-          <w:sz w:val="21"/>
-          <w:szCs w:val="21"/>
-        </w:rPr>
-        <w:t xml:space="preserve">A real website — and found on Google </w:t>
-      </w:r>
-      <w:r>
-        <w:rPr>
-          <w:color w:val="222B30"/>
-          <w:sz w:val="21"/>
-          <w:szCs w:val="21"/>
-        </w:rPr>
-        <w:t xml:space="preserve">— a brandable public site with booking, or a booking link/embed for your existing site; technical SEO built in.</w:t>
-      </w:r>
-    </w:p>
-    <w:p>
-      <w:pPr>
-        <w:pStyle w:val="ListParagraph"/>
-        <w:numPr>
-          <w:ilvl w:val="0"/>
-          <w:numId w:val="2"/>
-        </w:numPr>
-        <w:spacing w:after="70" w:line="272"/>
-      </w:pPr>
-      <w:r>
-        <w:rPr>
-          <w:b/>
-          <w:bCs/>
-          <w:color w:val="222B30"/>
-          <w:sz w:val="21"/>
-          <w:szCs w:val="21"/>
-        </w:rPr>
-        <w:t xml:space="preserve">Fleet, counter &amp; money handled </w:t>
-      </w:r>
-      <w:r>
-        <w:rPr>
-          <w:color w:val="222B30"/>
-          <w:sz w:val="21"/>
-          <w:szCs w:val="21"/>
-        </w:rPr>
-        <w:t xml:space="preserve">— unit tracking, will-call handoffs, tiered pricing, deposit holds, damage waiver, tax, cancellation rules, running crew-pay tally.</w:t>
-      </w:r>
-    </w:p>
-    <w:p>
-      <w:pPr>
-        <w:pStyle w:val="ListParagraph"/>
-        <w:numPr>
-          <w:ilvl w:val="0"/>
-          <w:numId w:val="2"/>
-        </w:numPr>
-        <w:spacing w:after="70" w:line="272"/>
-      </w:pPr>
-      <w:r>
-        <w:rPr>
-          <w:b/>
-          <w:bCs/>
-          <w:color w:val="222B30"/>
-          <w:sz w:val="21"/>
-          <w:szCs w:val="21"/>
-        </w:rPr>
-        <w:t xml:space="preserve">Know your numbers </w:t>
-      </w:r>
-      <w:r>
-        <w:rPr>
-          <w:color w:val="222B30"/>
-          <w:sz w:val="21"/>
-          <w:szCs w:val="21"/>
-        </w:rPr>
-        <w:t xml:space="preserve">— revenue by month &amp; category, utilization, and ROI per unit, best/worst ranked.</w:t>
-      </w:r>
-    </w:p>
-    <w:p>
-      <w:pPr>
-        <w:pStyle w:val="ListParagraph"/>
-        <w:numPr>
-          <w:ilvl w:val="0"/>
-          <w:numId w:val="2"/>
-        </w:numPr>
-        <w:spacing w:after="70" w:line="272"/>
-      </w:pPr>
-      <w:r>
-        <w:rPr>
-          <w:b/>
-          <w:bCs/>
-          <w:color w:val="222B30"/>
-          <w:sz w:val="21"/>
-          <w:szCs w:val="21"/>
-        </w:rPr>
-        <w:t xml:space="preserve">Your brand, not ours </w:t>
-      </w:r>
-      <w:r>
-        <w:rPr>
-          <w:color w:val="222B30"/>
-          <w:sz w:val="21"/>
-          <w:szCs w:val="21"/>
-        </w:rPr>
-        <w:t xml:space="preserve">— your logo, colors, equipment photos; your dashboard behind a private login.</w:t>
-      </w:r>
-    </w:p>
-    <w:tbl>
-      <w:tblPr>
-        <w:tblW w:type="dxa" w:w="9360"/>
-        <w:tblBorders>
-          <w:top w:val="none" w:color="FFFFFF" w:sz="0"/>
-          <w:left w:val="single" w:color="3E5561" w:sz="24"/>
-          <w:bottom w:val="none" w:color="FFFFFF" w:sz="0"/>
-          <w:right w:val="none" w:color="FFFFFF" w:sz="0"/>
-          <w:insideH w:val="none" w:color="FFFFFF" w:sz="0"/>
-          <w:insideV w:val="none" w:color="FFFFFF" w:sz="0"/>
-        </w:tblBorders>
-      </w:tblPr>
-      <w:tblGrid>
-        <w:gridCol w:w="9360"/>
-      </w:tblGrid>
-      <w:tr>
-        <w:tc>
-          <w:tcPr>
-            <w:tcW w:type="dxa" w:w="9360"/>
-            <w:shd w:fill="EAF1F4" w:color="auto" w:val="clear"/>
-            <w:tcMar>
-              <w:top w:type="dxa" w:w="130"/>
-              <w:left w:type="dxa" w:w="200"/>
-              <w:bottom w:type="dxa" w:w="130"/>
-              <w:right w:type="dxa" w:w="160"/>
-            </w:tcMar>
-          </w:tcPr>
-          <w:p>
-            <w:pPr>
-              <w:spacing w:after="60"/>
-            </w:pPr>
-            <w:r>
-              <w:rPr>
-                <w:b/>
-                <w:bCs/>
-                <w:color w:val="26343C"/>
-                <w:sz w:val="20"/>
-                <w:szCs w:val="20"/>
-              </w:rPr>
-              <w:t xml:space="preserve">The bottom line for an owner</w:t>
-            </w:r>
-          </w:p>
-          <w:p>
-            <w:pPr>
-              <w:spacing w:after="0" w:line="268"/>
-            </w:pPr>
-            <w:r>
-              <w:rPr>
-                <w:b/>
-                <w:bCs/>
-                <w:color w:val="222B30"/>
-                <w:sz w:val="21"/>
-                <w:szCs w:val="21"/>
-              </w:rPr>
-              <w:t xml:space="preserve">Fewer mistakes, less phone time, more bookings captured, and a professional experience customers feel the first time they book. You run the yard — not the paperwork.</w:t>
-            </w:r>
-          </w:p>
-        </w:tc>
-      </w:tr>
-    </w:tbl>
-    <w:p>
-      <w:pPr>
-        <w:pStyle w:val="Heading2"/>
-        <w:spacing w:after="80" w:before="220"/>
-      </w:pPr>
-      <w:r>
-        <w:rPr>
-          <w:b/>
-          <w:bCs/>
-          <w:color w:val="B57A1F"/>
-          <w:sz w:val="24"/>
-          <w:szCs w:val="24"/>
-        </w:rPr>
-        <w:t xml:space="preserve">Made yours (multi-tenant, by design)</w:t>
-      </w:r>
-    </w:p>
-    <w:p>
-      <w:pPr>
-        <w:spacing w:after="120" w:line="278"/>
-      </w:pPr>
-      <w:r>
-        <w:rPr>
-          <w:color w:val="222B30"/>
-          <w:sz w:val="21"/>
-          <w:szCs w:val="21"/>
-        </w:rPr>
-        <w:t xml:space="preserve">Your version isn't a generic tool with your logo pasted on — your brand, equipment, pricing, fees, crew, and policies are all yours. The core idea (a unit goes out, comes back, someone moves it each way) fits equipment &amp; tool rental, containers &amp; storage, and event &amp; party rental — not just dump trailers. Full account-level data separation is the top near-term item before multiple companies run on it; we onboard pilot partners one at a time so data is handled right from day one.</w:t>
-      </w:r>
-    </w:p>
-    <w:p>
-      <w:pPr>
-        <w:pStyle w:val="Heading2"/>
-        <w:spacing w:after="80" w:before="220"/>
-      </w:pPr>
-      <w:r>
-        <w:rPr>
-          <w:b/>
-          <w:bCs/>
-          <w:color w:val="B57A1F"/>
-          <w:sz w:val="24"/>
-          <w:szCs w:val="24"/>
-        </w:rPr>
-        <w:t xml:space="preserve">Where it is today (honest)</w:t>
+        <w:t xml:space="preserve">What's simulated → becomes real</w:t>
       </w:r>
     </w:p>
     <w:tbl>
@@ -2356,7 +1735,7 @@
                 <w:sz w:val="19"/>
                 <w:szCs w:val="19"/>
               </w:rPr>
-              <w:t xml:space="preserve">Working today</w:t>
+              <w:t xml:space="preserve">Today (preview)</w:t>
             </w:r>
           </w:p>
         </w:tc>
@@ -2386,7 +1765,7 @@
                 <w:sz w:val="19"/>
                 <w:szCs w:val="19"/>
               </w:rPr>
-              <w:t xml:space="preserve">On the near-term roadmap</w:t>
+              <w:t xml:space="preserve">Becomes real when…</w:t>
             </w:r>
           </w:p>
         </w:tc>
@@ -2418,7 +1797,7 @@
                 <w:sz w:val="19"/>
                 <w:szCs w:val="19"/>
               </w:rPr>
-              <w:t xml:space="preserve">Full customer booking with transparent pricing</w:t>
+              <w:t xml:space="preserve">Card charges, deposit holds, crew payouts</w:t>
             </w:r>
           </w:p>
         </w:tc>
@@ -2448,7 +1827,7 @@
                 <w:sz w:val="19"/>
                 <w:szCs w:val="19"/>
               </w:rPr>
-              <w:t xml:space="preserve">Separate, walled-off accounts per business (multi-tenant)</w:t>
+              <w:t xml:space="preserve">Stripe (payments) is connected</w:t>
             </w:r>
           </w:p>
         </w:tc>
@@ -2481,7 +1860,7 @@
                 <w:sz w:val="19"/>
                 <w:szCs w:val="19"/>
               </w:rPr>
-              <w:t xml:space="preserve">Cloud data synced across your devices &amp; crew's</w:t>
+              <w:t xml:space="preserve">Booking confirmations &amp; reminders to customers</w:t>
             </w:r>
           </w:p>
         </w:tc>
@@ -2512,7 +1891,7 @@
                 <w:sz w:val="19"/>
                 <w:szCs w:val="19"/>
               </w:rPr>
-              <w:t xml:space="preserve">Live card payments &amp; deposit captures</w:t>
+              <w:t xml:space="preserve">Twilio/email (messaging) is connected</w:t>
             </w:r>
           </w:p>
         </w:tc>
@@ -2544,7 +1923,7 @@
                 <w:sz w:val="19"/>
                 <w:szCs w:val="19"/>
               </w:rPr>
-              <w:t xml:space="preserve">Owner dashboard behind a private sign-in</w:t>
+              <w:t xml:space="preserve">Driver job alerts (text/email)</w:t>
             </w:r>
           </w:p>
         </w:tc>
@@ -2574,7 +1953,7 @@
                 <w:sz w:val="19"/>
                 <w:szCs w:val="19"/>
               </w:rPr>
-              <w:t xml:space="preserve">Automatic booking confirmations &amp; reminders</w:t>
+              <w:t xml:space="preserve">Twilio/email is connected</w:t>
             </w:r>
           </w:p>
         </w:tc>
@@ -2607,7 +1986,7 @@
                 <w:sz w:val="19"/>
                 <w:szCs w:val="19"/>
               </w:rPr>
-              <w:t xml:space="preserve">Individual staff sign-ins (personal PINs)</w:t>
+              <w:t xml:space="preserve">Review requests after a rental</w:t>
             </w:r>
           </w:p>
         </w:tc>
@@ -2638,385 +2017,7 @@
                 <w:sz w:val="19"/>
                 <w:szCs w:val="19"/>
               </w:rPr>
-              <w:t xml:space="preserve">Job alerts texted/emailed to drivers</w:t>
-            </w:r>
-          </w:p>
-        </w:tc>
-      </w:tr>
-      <w:tr>
-        <w:tc>
-          <w:tcPr>
-            <w:tcW w:type="dxa" w:w="4680"/>
-            <w:tcBorders>
-              <w:top w:val="single" w:color="D8DEE2" w:sz="2"/>
-              <w:left w:val="none" w:color="FFFFFF" w:sz="0"/>
-              <w:bottom w:val="single" w:color="D8DEE2" w:sz="2"/>
-              <w:right w:val="none" w:color="FFFFFF" w:sz="0"/>
-            </w:tcBorders>
-            <w:tcMar>
-              <w:top w:type="dxa" w:w="55"/>
-              <w:left w:type="dxa" w:w="120"/>
-              <w:bottom w:type="dxa" w:w="55"/>
-              <w:right w:type="dxa" w:w="120"/>
-            </w:tcMar>
-          </w:tcPr>
-          <w:p>
-            <w:pPr>
-              <w:spacing w:line="264"/>
-            </w:pPr>
-            <w:r>
-              <w:rPr>
-                <w:color w:val="222B30"/>
-                <w:sz w:val="19"/>
-                <w:szCs w:val="19"/>
-              </w:rPr>
-              <w:t xml:space="preserve">Custom positions/roles gating dispatch</w:t>
-            </w:r>
-          </w:p>
-        </w:tc>
-        <w:tc>
-          <w:tcPr>
-            <w:tcW w:type="dxa" w:w="4680"/>
-            <w:tcBorders>
-              <w:top w:val="single" w:color="D8DEE2" w:sz="2"/>
-              <w:left w:val="none" w:color="FFFFFF" w:sz="0"/>
-              <w:bottom w:val="single" w:color="D8DEE2" w:sz="2"/>
-              <w:right w:val="none" w:color="FFFFFF" w:sz="0"/>
-            </w:tcBorders>
-            <w:tcMar>
-              <w:top w:type="dxa" w:w="55"/>
-              <w:left w:type="dxa" w:w="120"/>
-              <w:bottom w:type="dxa" w:w="55"/>
-              <w:right w:type="dxa" w:w="120"/>
-            </w:tcMar>
-          </w:tcPr>
-          <w:p>
-            <w:pPr>
-              <w:spacing w:line="264"/>
-            </w:pPr>
-            <w:r>
-              <w:rPr>
-                <w:color w:val="222B30"/>
-                <w:sz w:val="19"/>
-                <w:szCs w:val="19"/>
-              </w:rPr>
-              <w:t xml:space="preserve">Subscription billing &amp; free trials</w:t>
-            </w:r>
-          </w:p>
-        </w:tc>
-      </w:tr>
-      <w:tr>
-        <w:tc>
-          <w:tcPr>
-            <w:tcW w:type="dxa" w:w="4680"/>
-            <w:tcBorders>
-              <w:top w:val="single" w:color="D8DEE2" w:sz="2"/>
-              <w:left w:val="none" w:color="FFFFFF" w:sz="0"/>
-              <w:bottom w:val="single" w:color="D8DEE2" w:sz="2"/>
-              <w:right w:val="none" w:color="FFFFFF" w:sz="0"/>
-            </w:tcBorders>
-            <w:shd w:fill="F4F6F7" w:color="auto" w:val="clear"/>
-            <w:tcMar>
-              <w:top w:type="dxa" w:w="55"/>
-              <w:left w:type="dxa" w:w="120"/>
-              <w:bottom w:type="dxa" w:w="55"/>
-              <w:right w:type="dxa" w:w="120"/>
-            </w:tcMar>
-          </w:tcPr>
-          <w:p>
-            <w:pPr>
-              <w:spacing w:line="264"/>
-            </w:pPr>
-            <w:r>
-              <w:rPr>
-                <w:color w:val="222B30"/>
-                <w:sz w:val="19"/>
-                <w:szCs w:val="19"/>
-              </w:rPr>
-              <w:t xml:space="preserve">Standing weekly schedules + only-book-when-staffed</w:t>
-            </w:r>
-          </w:p>
-        </w:tc>
-        <w:tc>
-          <w:tcPr>
-            <w:tcW w:type="dxa" w:w="4680"/>
-            <w:tcBorders>
-              <w:top w:val="single" w:color="D8DEE2" w:sz="2"/>
-              <w:left w:val="none" w:color="FFFFFF" w:sz="0"/>
-              <w:bottom w:val="single" w:color="D8DEE2" w:sz="2"/>
-              <w:right w:val="none" w:color="FFFFFF" w:sz="0"/>
-            </w:tcBorders>
-            <w:shd w:fill="F4F6F7" w:color="auto" w:val="clear"/>
-            <w:tcMar>
-              <w:top w:type="dxa" w:w="55"/>
-              <w:left w:type="dxa" w:w="120"/>
-              <w:bottom w:type="dxa" w:w="55"/>
-              <w:right w:type="dxa" w:w="120"/>
-            </w:tcMar>
-          </w:tcPr>
-          <w:p>
-            <w:pPr>
-              <w:spacing w:line="264"/>
-            </w:pPr>
-            <w:r>
-              <w:rPr>
-                <w:color w:val="222B30"/>
-                <w:sz w:val="19"/>
-                <w:szCs w:val="19"/>
-              </w:rPr>
-              <w:t xml:space="preserve">Rock-solid backups + polished mobile (both first-class)</w:t>
-            </w:r>
-          </w:p>
-        </w:tc>
-      </w:tr>
-      <w:tr>
-        <w:tc>
-          <w:tcPr>
-            <w:tcW w:type="dxa" w:w="4680"/>
-            <w:tcBorders>
-              <w:top w:val="single" w:color="D8DEE2" w:sz="2"/>
-              <w:left w:val="none" w:color="FFFFFF" w:sz="0"/>
-              <w:bottom w:val="single" w:color="D8DEE2" w:sz="2"/>
-              <w:right w:val="none" w:color="FFFFFF" w:sz="0"/>
-            </w:tcBorders>
-            <w:tcMar>
-              <w:top w:type="dxa" w:w="55"/>
-              <w:left w:type="dxa" w:w="120"/>
-              <w:bottom w:type="dxa" w:w="55"/>
-              <w:right w:type="dxa" w:w="120"/>
-            </w:tcMar>
-          </w:tcPr>
-          <w:p>
-            <w:pPr>
-              <w:spacing w:line="264"/>
-            </w:pPr>
-            <w:r>
-              <w:rPr>
-                <w:color w:val="222B30"/>
-                <w:sz w:val="19"/>
-                <w:szCs w:val="19"/>
-              </w:rPr>
-              <w:t xml:space="preserve">Two-leg dispatch, auto or manual</w:t>
-            </w:r>
-          </w:p>
-        </w:tc>
-        <w:tc>
-          <w:tcPr>
-            <w:tcW w:type="dxa" w:w="4680"/>
-            <w:tcBorders>
-              <w:top w:val="single" w:color="D8DEE2" w:sz="2"/>
-              <w:left w:val="none" w:color="FFFFFF" w:sz="0"/>
-              <w:bottom w:val="single" w:color="D8DEE2" w:sz="2"/>
-              <w:right w:val="none" w:color="FFFFFF" w:sz="0"/>
-            </w:tcBorders>
-            <w:tcMar>
-              <w:top w:type="dxa" w:w="55"/>
-              <w:left w:type="dxa" w:w="120"/>
-              <w:bottom w:type="dxa" w:w="55"/>
-              <w:right w:type="dxa" w:w="120"/>
-            </w:tcMar>
-          </w:tcPr>
-          <w:p>
-            <w:pPr>
-              <w:spacing w:line="264"/>
-            </w:pPr>
-            <w:r>
-              <w:rPr>
-                <w:color w:val="222B30"/>
-                <w:sz w:val="19"/>
-                <w:szCs w:val="19"/>
-              </w:rPr>
-              <w:t xml:space="preserve"/>
-            </w:r>
-          </w:p>
-        </w:tc>
-      </w:tr>
-      <w:tr>
-        <w:tc>
-          <w:tcPr>
-            <w:tcW w:type="dxa" w:w="4680"/>
-            <w:tcBorders>
-              <w:top w:val="single" w:color="D8DEE2" w:sz="2"/>
-              <w:left w:val="none" w:color="FFFFFF" w:sz="0"/>
-              <w:bottom w:val="single" w:color="D8DEE2" w:sz="2"/>
-              <w:right w:val="none" w:color="FFFFFF" w:sz="0"/>
-            </w:tcBorders>
-            <w:shd w:fill="F4F6F7" w:color="auto" w:val="clear"/>
-            <w:tcMar>
-              <w:top w:type="dxa" w:w="55"/>
-              <w:left w:type="dxa" w:w="120"/>
-              <w:bottom w:type="dxa" w:w="55"/>
-              <w:right w:type="dxa" w:w="120"/>
-            </w:tcMar>
-          </w:tcPr>
-          <w:p>
-            <w:pPr>
-              <w:spacing w:line="264"/>
-            </w:pPr>
-            <w:r>
-              <w:rPr>
-                <w:color w:val="222B30"/>
-                <w:sz w:val="19"/>
-                <w:szCs w:val="19"/>
-              </w:rPr>
-              <w:t xml:space="preserve">Built-in analytics (revenue, utilization, ROI)</w:t>
-            </w:r>
-          </w:p>
-        </w:tc>
-        <w:tc>
-          <w:tcPr>
-            <w:tcW w:type="dxa" w:w="4680"/>
-            <w:tcBorders>
-              <w:top w:val="single" w:color="D8DEE2" w:sz="2"/>
-              <w:left w:val="none" w:color="FFFFFF" w:sz="0"/>
-              <w:bottom w:val="single" w:color="D8DEE2" w:sz="2"/>
-              <w:right w:val="none" w:color="FFFFFF" w:sz="0"/>
-            </w:tcBorders>
-            <w:shd w:fill="F4F6F7" w:color="auto" w:val="clear"/>
-            <w:tcMar>
-              <w:top w:type="dxa" w:w="55"/>
-              <w:left w:type="dxa" w:w="120"/>
-              <w:bottom w:type="dxa" w:w="55"/>
-              <w:right w:type="dxa" w:w="120"/>
-            </w:tcMar>
-          </w:tcPr>
-          <w:p>
-            <w:pPr>
-              <w:spacing w:line="264"/>
-            </w:pPr>
-            <w:r>
-              <w:rPr>
-                <w:color w:val="222B30"/>
-                <w:sz w:val="19"/>
-                <w:szCs w:val="19"/>
-              </w:rPr>
-              <w:t xml:space="preserve"/>
-            </w:r>
-          </w:p>
-        </w:tc>
-      </w:tr>
-      <w:tr>
-        <w:tc>
-          <w:tcPr>
-            <w:tcW w:type="dxa" w:w="4680"/>
-            <w:tcBorders>
-              <w:top w:val="single" w:color="D8DEE2" w:sz="2"/>
-              <w:left w:val="none" w:color="FFFFFF" w:sz="0"/>
-              <w:bottom w:val="single" w:color="D8DEE2" w:sz="2"/>
-              <w:right w:val="none" w:color="FFFFFF" w:sz="0"/>
-            </w:tcBorders>
-            <w:tcMar>
-              <w:top w:type="dxa" w:w="55"/>
-              <w:left w:type="dxa" w:w="120"/>
-              <w:bottom w:type="dxa" w:w="55"/>
-              <w:right w:type="dxa" w:w="120"/>
-            </w:tcMar>
-          </w:tcPr>
-          <w:p>
-            <w:pPr>
-              <w:spacing w:line="264"/>
-            </w:pPr>
-            <w:r>
-              <w:rPr>
-                <w:color w:val="222B30"/>
-                <w:sz w:val="19"/>
-                <w:szCs w:val="19"/>
-              </w:rPr>
-              <w:t xml:space="preserve">Branding, a real website, embeddable booking &amp; SEO</w:t>
-            </w:r>
-          </w:p>
-        </w:tc>
-        <w:tc>
-          <w:tcPr>
-            <w:tcW w:type="dxa" w:w="4680"/>
-            <w:tcBorders>
-              <w:top w:val="single" w:color="D8DEE2" w:sz="2"/>
-              <w:left w:val="none" w:color="FFFFFF" w:sz="0"/>
-              <w:bottom w:val="single" w:color="D8DEE2" w:sz="2"/>
-              <w:right w:val="none" w:color="FFFFFF" w:sz="0"/>
-            </w:tcBorders>
-            <w:tcMar>
-              <w:top w:type="dxa" w:w="55"/>
-              <w:left w:type="dxa" w:w="120"/>
-              <w:bottom w:type="dxa" w:w="55"/>
-              <w:right w:type="dxa" w:w="120"/>
-            </w:tcMar>
-          </w:tcPr>
-          <w:p>
-            <w:pPr>
-              <w:spacing w:line="264"/>
-            </w:pPr>
-            <w:r>
-              <w:rPr>
-                <w:color w:val="222B30"/>
-                <w:sz w:val="19"/>
-                <w:szCs w:val="19"/>
-              </w:rPr>
-              <w:t xml:space="preserve"/>
-            </w:r>
-          </w:p>
-        </w:tc>
-      </w:tr>
-      <w:tr>
-        <w:tc>
-          <w:tcPr>
-            <w:tcW w:type="dxa" w:w="4680"/>
-            <w:tcBorders>
-              <w:top w:val="single" w:color="D8DEE2" w:sz="2"/>
-              <w:left w:val="none" w:color="FFFFFF" w:sz="0"/>
-              <w:bottom w:val="single" w:color="D8DEE2" w:sz="2"/>
-              <w:right w:val="none" w:color="FFFFFF" w:sz="0"/>
-            </w:tcBorders>
-            <w:shd w:fill="F4F6F7" w:color="auto" w:val="clear"/>
-            <w:tcMar>
-              <w:top w:type="dxa" w:w="55"/>
-              <w:left w:type="dxa" w:w="120"/>
-              <w:bottom w:type="dxa" w:w="55"/>
-              <w:right w:type="dxa" w:w="120"/>
-            </w:tcMar>
-          </w:tcPr>
-          <w:p>
-            <w:pPr>
-              <w:spacing w:line="264"/>
-            </w:pPr>
-            <w:r>
-              <w:rPr>
-                <w:color w:val="222B30"/>
-                <w:sz w:val="19"/>
-                <w:szCs w:val="19"/>
-              </w:rPr>
-              <w:t xml:space="preserve">Configurable pricing, fees, policies &amp; yard counter</w:t>
-            </w:r>
-          </w:p>
-        </w:tc>
-        <w:tc>
-          <w:tcPr>
-            <w:tcW w:type="dxa" w:w="4680"/>
-            <w:tcBorders>
-              <w:top w:val="single" w:color="D8DEE2" w:sz="2"/>
-              <w:left w:val="none" w:color="FFFFFF" w:sz="0"/>
-              <w:bottom w:val="single" w:color="D8DEE2" w:sz="2"/>
-              <w:right w:val="none" w:color="FFFFFF" w:sz="0"/>
-            </w:tcBorders>
-            <w:shd w:fill="F4F6F7" w:color="auto" w:val="clear"/>
-            <w:tcMar>
-              <w:top w:type="dxa" w:w="55"/>
-              <w:left w:type="dxa" w:w="120"/>
-              <w:bottom w:type="dxa" w:w="55"/>
-              <w:right w:type="dxa" w:w="120"/>
-            </w:tcMar>
-          </w:tcPr>
-          <w:p>
-            <w:pPr>
-              <w:spacing w:line="264"/>
-            </w:pPr>
-            <w:r>
-              <w:rPr>
-                <w:color w:val="222B30"/>
-                <w:sz w:val="19"/>
-                <w:szCs w:val="19"/>
-              </w:rPr>
-              <w:t xml:space="preserve"/>
+              <w:t xml:space="preserve">Twilio/email is connected</w:t>
             </w:r>
           </w:p>
         </w:tc>
@@ -3024,105 +2025,6 @@
     </w:tbl>
     <w:p>
       <w:pPr>
-        <w:spacing w:after="120"/>
-      </w:pPr>
-    </w:p>
-    <w:tbl>
-      <w:tblPr>
-        <w:tblW w:type="dxa" w:w="9360"/>
-        <w:tblBorders>
-          <w:top w:val="none" w:color="FFFFFF" w:sz="0"/>
-          <w:left w:val="single" w:color="B57A1F" w:sz="24"/>
-          <w:bottom w:val="none" w:color="FFFFFF" w:sz="0"/>
-          <w:right w:val="none" w:color="FFFFFF" w:sz="0"/>
-          <w:insideH w:val="none" w:color="FFFFFF" w:sz="0"/>
-          <w:insideV w:val="none" w:color="FFFFFF" w:sz="0"/>
-        </w:tblBorders>
-      </w:tblPr>
-      <w:tblGrid>
-        <w:gridCol w:w="9360"/>
-      </w:tblGrid>
-      <w:tr>
-        <w:tc>
-          <w:tcPr>
-            <w:tcW w:type="dxa" w:w="9360"/>
-            <w:shd w:fill="F6ECD8" w:color="auto" w:val="clear"/>
-            <w:tcMar>
-              <w:top w:type="dxa" w:w="130"/>
-              <w:left w:type="dxa" w:w="200"/>
-              <w:bottom w:type="dxa" w:w="130"/>
-              <w:right w:type="dxa" w:w="160"/>
-            </w:tcMar>
-          </w:tcPr>
-          <w:p>
-            <w:pPr>
-              <w:spacing w:after="60"/>
-            </w:pPr>
-            <w:r>
-              <w:rPr>
-                <w:b/>
-                <w:bCs/>
-                <w:color w:val="26343C"/>
-                <w:sz w:val="20"/>
-                <w:szCs w:val="20"/>
-              </w:rPr>
-              <w:t xml:space="preserve">Why “pilot partner” is the right time</w:t>
-            </w:r>
-          </w:p>
-          <w:p>
-            <w:pPr>
-              <w:spacing w:after="0" w:line="268"/>
-            </w:pPr>
-            <w:r>
-              <w:rPr>
-                <w:color w:val="222B30"/>
-                <w:sz w:val="21"/>
-                <w:szCs w:val="21"/>
-              </w:rPr>
-              <w:t xml:space="preserve">Coming in now means your operation helps decide what gets built next — and you get a platform tuned to your real workflow, not a one-size-fits-all product handed down after the fact.</w:t>
-            </w:r>
-          </w:p>
-        </w:tc>
-      </w:tr>
-    </w:tbl>
-    <w:p>
-      <w:r>
-        <w:br w:type="page"/>
-      </w:r>
-    </w:p>
-    <w:p>
-      <w:pPr>
-        <w:pStyle w:val="Heading1"/>
-        <w:spacing w:after="140" w:before="360"/>
-      </w:pPr>
-      <w:r>
-        <w:rPr>
-          <w:b/>
-          <w:bCs/>
-          <w:color w:val="26343C"/>
-          <w:sz w:val="32"/>
-          <w:szCs w:val="32"/>
-        </w:rPr>
-        <w:t xml:space="preserve">Part D — Roadmap &amp; What's Simulated</w:t>
-      </w:r>
-    </w:p>
-    <w:p>
-      <w:pPr>
-        <w:spacing w:after="120" w:line="278"/>
-      </w:pPr>
-      <w:r>
-        <w:rPr>
-          <w:i/>
-          <w:iCs/>
-          <w:color w:val="5B6770"/>
-          <w:sz w:val="21"/>
-          <w:szCs w:val="21"/>
-        </w:rPr>
-        <w:t xml:space="preserve">The path from strong prototype to sellable SaaS.</w:t>
-      </w:r>
-    </w:p>
-    <w:p>
-      <w:pPr>
         <w:pStyle w:val="Heading2"/>
         <w:spacing w:after="80" w:before="220"/>
       </w:pPr>
@@ -3134,405 +2036,65 @@
           <w:sz w:val="24"/>
           <w:szCs w:val="24"/>
         </w:rPr>
-        <w:t xml:space="preserve">What's real vs. simulated</w:t>
-      </w:r>
-    </w:p>
-    <w:tbl>
-      <w:tblPr>
-        <w:tblW w:type="dxa" w:w="9360"/>
-        <w:tblBorders>
-          <w:top w:val="single" w:color="auto" w:sz="4"/>
-          <w:left w:val="single" w:color="auto" w:sz="4"/>
-          <w:bottom w:val="single" w:color="auto" w:sz="4"/>
-          <w:right w:val="single" w:color="auto" w:sz="4"/>
-          <w:insideH w:val="single" w:color="auto" w:sz="4"/>
-          <w:insideV w:val="single" w:color="auto" w:sz="4"/>
-        </w:tblBorders>
-      </w:tblPr>
-      <w:tblGrid>
-        <w:gridCol w:w="4680"/>
-        <w:gridCol w:w="4680"/>
-      </w:tblGrid>
-      <w:tr>
-        <w:trPr>
-          <w:tblHeader/>
-        </w:trPr>
-        <w:tc>
-          <w:tcPr>
-            <w:tcW w:type="dxa" w:w="4680"/>
-            <w:tcBorders>
-              <w:top w:val="single" w:color="D8DEE2" w:sz="2"/>
-              <w:left w:val="none" w:color="FFFFFF" w:sz="0"/>
-              <w:bottom w:val="single" w:color="D8DEE2" w:sz="2"/>
-              <w:right w:val="none" w:color="FFFFFF" w:sz="0"/>
-            </w:tcBorders>
-            <w:shd w:fill="26343C" w:color="auto" w:val="clear"/>
-            <w:tcMar>
-              <w:top w:type="dxa" w:w="60"/>
-              <w:left w:type="dxa" w:w="120"/>
-              <w:bottom w:type="dxa" w:w="60"/>
-              <w:right w:type="dxa" w:w="120"/>
-            </w:tcMar>
-          </w:tcPr>
-          <w:p>
-            <w:r>
-              <w:rPr>
-                <w:b/>
-                <w:bCs/>
-                <w:color w:val="FFFFFF"/>
-                <w:sz w:val="19"/>
-                <w:szCs w:val="19"/>
-              </w:rPr>
-              <w:t xml:space="preserve">Today (simulated / prototype)</w:t>
-            </w:r>
-          </w:p>
-        </w:tc>
-        <w:tc>
-          <w:tcPr>
-            <w:tcW w:type="dxa" w:w="4680"/>
-            <w:tcBorders>
-              <w:top w:val="single" w:color="D8DEE2" w:sz="2"/>
-              <w:left w:val="none" w:color="FFFFFF" w:sz="0"/>
-              <w:bottom w:val="single" w:color="D8DEE2" w:sz="2"/>
-              <w:right w:val="none" w:color="FFFFFF" w:sz="0"/>
-            </w:tcBorders>
-            <w:shd w:fill="26343C" w:color="auto" w:val="clear"/>
-            <w:tcMar>
-              <w:top w:type="dxa" w:w="60"/>
-              <w:left w:type="dxa" w:w="120"/>
-              <w:bottom w:type="dxa" w:w="60"/>
-              <w:right w:type="dxa" w:w="120"/>
-            </w:tcMar>
-          </w:tcPr>
-          <w:p>
-            <w:r>
-              <w:rPr>
-                <w:b/>
-                <w:bCs/>
-                <w:color w:val="FFFFFF"/>
-                <w:sz w:val="19"/>
-                <w:szCs w:val="19"/>
-              </w:rPr>
-              <w:t xml:space="preserve">Becomes real in</w:t>
-            </w:r>
-          </w:p>
-        </w:tc>
-      </w:tr>
-      <w:tr>
-        <w:tc>
-          <w:tcPr>
-            <w:tcW w:type="dxa" w:w="4680"/>
-            <w:tcBorders>
-              <w:top w:val="single" w:color="D8DEE2" w:sz="2"/>
-              <w:left w:val="none" w:color="FFFFFF" w:sz="0"/>
-              <w:bottom w:val="single" w:color="D8DEE2" w:sz="2"/>
-              <w:right w:val="none" w:color="FFFFFF" w:sz="0"/>
-            </w:tcBorders>
-            <w:tcMar>
-              <w:top w:type="dxa" w:w="55"/>
-              <w:left w:type="dxa" w:w="120"/>
-              <w:bottom w:type="dxa" w:w="55"/>
-              <w:right w:type="dxa" w:w="120"/>
-            </w:tcMar>
-          </w:tcPr>
-          <w:p>
-            <w:pPr>
-              <w:spacing w:line="264"/>
-            </w:pPr>
-            <w:r>
-              <w:rPr>
-                <w:color w:val="222B30"/>
-                <w:sz w:val="19"/>
-                <w:szCs w:val="19"/>
-              </w:rPr>
-              <w:t xml:space="preserve">Logins (owner password, team code, PINs, operator passcode)</w:t>
-            </w:r>
-          </w:p>
-        </w:tc>
-        <w:tc>
-          <w:tcPr>
-            <w:tcW w:type="dxa" w:w="4680"/>
-            <w:tcBorders>
-              <w:top w:val="single" w:color="D8DEE2" w:sz="2"/>
-              <w:left w:val="none" w:color="FFFFFF" w:sz="0"/>
-              <w:bottom w:val="single" w:color="D8DEE2" w:sz="2"/>
-              <w:right w:val="none" w:color="FFFFFF" w:sz="0"/>
-            </w:tcBorders>
-            <w:tcMar>
-              <w:top w:type="dxa" w:w="55"/>
-              <w:left w:type="dxa" w:w="120"/>
-              <w:bottom w:type="dxa" w:w="55"/>
-              <w:right w:type="dxa" w:w="120"/>
-            </w:tcMar>
-          </w:tcPr>
-          <w:p>
-            <w:pPr>
-              <w:spacing w:line="264"/>
-            </w:pPr>
-            <w:r>
-              <w:rPr>
-                <w:color w:val="222B30"/>
-                <w:sz w:val="19"/>
-                <w:szCs w:val="19"/>
-              </w:rPr>
-              <w:t xml:space="preserve">Phase 1 (real auth)</w:t>
-            </w:r>
-          </w:p>
-        </w:tc>
-      </w:tr>
-      <w:tr>
-        <w:tc>
-          <w:tcPr>
-            <w:tcW w:type="dxa" w:w="4680"/>
-            <w:tcBorders>
-              <w:top w:val="single" w:color="D8DEE2" w:sz="2"/>
-              <w:left w:val="none" w:color="FFFFFF" w:sz="0"/>
-              <w:bottom w:val="single" w:color="D8DEE2" w:sz="2"/>
-              <w:right w:val="none" w:color="FFFFFF" w:sz="0"/>
-            </w:tcBorders>
-            <w:shd w:fill="F4F6F7" w:color="auto" w:val="clear"/>
-            <w:tcMar>
-              <w:top w:type="dxa" w:w="55"/>
-              <w:left w:type="dxa" w:w="120"/>
-              <w:bottom w:type="dxa" w:w="55"/>
-              <w:right w:type="dxa" w:w="120"/>
-            </w:tcMar>
-          </w:tcPr>
-          <w:p>
-            <w:pPr>
-              <w:spacing w:line="264"/>
-            </w:pPr>
-            <w:r>
-              <w:rPr>
-                <w:color w:val="222B30"/>
-                <w:sz w:val="19"/>
-                <w:szCs w:val="19"/>
-              </w:rPr>
-              <w:t xml:space="preserve">One shared workspace</w:t>
-            </w:r>
-          </w:p>
-        </w:tc>
-        <w:tc>
-          <w:tcPr>
-            <w:tcW w:type="dxa" w:w="4680"/>
-            <w:tcBorders>
-              <w:top w:val="single" w:color="D8DEE2" w:sz="2"/>
-              <w:left w:val="none" w:color="FFFFFF" w:sz="0"/>
-              <w:bottom w:val="single" w:color="D8DEE2" w:sz="2"/>
-              <w:right w:val="none" w:color="FFFFFF" w:sz="0"/>
-            </w:tcBorders>
-            <w:shd w:fill="F4F6F7" w:color="auto" w:val="clear"/>
-            <w:tcMar>
-              <w:top w:type="dxa" w:w="55"/>
-              <w:left w:type="dxa" w:w="120"/>
-              <w:bottom w:type="dxa" w:w="55"/>
-              <w:right w:type="dxa" w:w="120"/>
-            </w:tcMar>
-          </w:tcPr>
-          <w:p>
-            <w:pPr>
-              <w:spacing w:line="264"/>
-            </w:pPr>
-            <w:r>
-              <w:rPr>
-                <w:color w:val="222B30"/>
-                <w:sz w:val="19"/>
-                <w:szCs w:val="19"/>
-              </w:rPr>
-              <w:t xml:space="preserve">Phase 2 (multi-tenant isolation)</w:t>
-            </w:r>
-          </w:p>
-        </w:tc>
-      </w:tr>
-      <w:tr>
-        <w:tc>
-          <w:tcPr>
-            <w:tcW w:type="dxa" w:w="4680"/>
-            <w:tcBorders>
-              <w:top w:val="single" w:color="D8DEE2" w:sz="2"/>
-              <w:left w:val="none" w:color="FFFFFF" w:sz="0"/>
-              <w:bottom w:val="single" w:color="D8DEE2" w:sz="2"/>
-              <w:right w:val="none" w:color="FFFFFF" w:sz="0"/>
-            </w:tcBorders>
-            <w:tcMar>
-              <w:top w:type="dxa" w:w="55"/>
-              <w:left w:type="dxa" w:w="120"/>
-              <w:bottom w:type="dxa" w:w="55"/>
-              <w:right w:type="dxa" w:w="120"/>
-            </w:tcMar>
-          </w:tcPr>
-          <w:p>
-            <w:pPr>
-              <w:spacing w:line="264"/>
-            </w:pPr>
-            <w:r>
-              <w:rPr>
-                <w:color w:val="222B30"/>
-                <w:sz w:val="19"/>
-                <w:szCs w:val="19"/>
-              </w:rPr>
-              <w:t xml:space="preserve">Operator portal = sample subscribers</w:t>
-            </w:r>
-          </w:p>
-        </w:tc>
-        <w:tc>
-          <w:tcPr>
-            <w:tcW w:type="dxa" w:w="4680"/>
-            <w:tcBorders>
-              <w:top w:val="single" w:color="D8DEE2" w:sz="2"/>
-              <w:left w:val="none" w:color="FFFFFF" w:sz="0"/>
-              <w:bottom w:val="single" w:color="D8DEE2" w:sz="2"/>
-              <w:right w:val="none" w:color="FFFFFF" w:sz="0"/>
-            </w:tcBorders>
-            <w:tcMar>
-              <w:top w:type="dxa" w:w="55"/>
-              <w:left w:type="dxa" w:w="120"/>
-              <w:bottom w:type="dxa" w:w="55"/>
-              <w:right w:type="dxa" w:w="120"/>
-            </w:tcMar>
-          </w:tcPr>
-          <w:p>
-            <w:pPr>
-              <w:spacing w:line="264"/>
-            </w:pPr>
-            <w:r>
-              <w:rPr>
-                <w:color w:val="222B30"/>
-                <w:sz w:val="19"/>
-                <w:szCs w:val="19"/>
-              </w:rPr>
-              <w:t xml:space="preserve">Phase 5 (real billing)</w:t>
-            </w:r>
-          </w:p>
-        </w:tc>
-      </w:tr>
-      <w:tr>
-        <w:tc>
-          <w:tcPr>
-            <w:tcW w:type="dxa" w:w="4680"/>
-            <w:tcBorders>
-              <w:top w:val="single" w:color="D8DEE2" w:sz="2"/>
-              <w:left w:val="none" w:color="FFFFFF" w:sz="0"/>
-              <w:bottom w:val="single" w:color="D8DEE2" w:sz="2"/>
-              <w:right w:val="none" w:color="FFFFFF" w:sz="0"/>
-            </w:tcBorders>
-            <w:shd w:fill="F4F6F7" w:color="auto" w:val="clear"/>
-            <w:tcMar>
-              <w:top w:type="dxa" w:w="55"/>
-              <w:left w:type="dxa" w:w="120"/>
-              <w:bottom w:type="dxa" w:w="55"/>
-              <w:right w:type="dxa" w:w="120"/>
-            </w:tcMar>
-          </w:tcPr>
-          <w:p>
-            <w:pPr>
-              <w:spacing w:line="264"/>
-            </w:pPr>
-            <w:r>
-              <w:rPr>
-                <w:color w:val="222B30"/>
-                <w:sz w:val="19"/>
-                <w:szCs w:val="19"/>
-              </w:rPr>
-              <w:t xml:space="preserve">Trials &amp; subscription billing</w:t>
-            </w:r>
-          </w:p>
-        </w:tc>
-        <w:tc>
-          <w:tcPr>
-            <w:tcW w:type="dxa" w:w="4680"/>
-            <w:tcBorders>
-              <w:top w:val="single" w:color="D8DEE2" w:sz="2"/>
-              <w:left w:val="none" w:color="FFFFFF" w:sz="0"/>
-              <w:bottom w:val="single" w:color="D8DEE2" w:sz="2"/>
-              <w:right w:val="none" w:color="FFFFFF" w:sz="0"/>
-            </w:tcBorders>
-            <w:shd w:fill="F4F6F7" w:color="auto" w:val="clear"/>
-            <w:tcMar>
-              <w:top w:type="dxa" w:w="55"/>
-              <w:left w:type="dxa" w:w="120"/>
-              <w:bottom w:type="dxa" w:w="55"/>
-              <w:right w:type="dxa" w:w="120"/>
-            </w:tcMar>
-          </w:tcPr>
-          <w:p>
-            <w:pPr>
-              <w:spacing w:line="264"/>
-            </w:pPr>
-            <w:r>
-              <w:rPr>
-                <w:color w:val="222B30"/>
-                <w:sz w:val="19"/>
-                <w:szCs w:val="19"/>
-              </w:rPr>
-              <w:t xml:space="preserve">Phase 5</w:t>
-            </w:r>
-          </w:p>
-        </w:tc>
-      </w:tr>
-      <w:tr>
-        <w:tc>
-          <w:tcPr>
-            <w:tcW w:type="dxa" w:w="4680"/>
-            <w:tcBorders>
-              <w:top w:val="single" w:color="D8DEE2" w:sz="2"/>
-              <w:left w:val="none" w:color="FFFFFF" w:sz="0"/>
-              <w:bottom w:val="single" w:color="D8DEE2" w:sz="2"/>
-              <w:right w:val="none" w:color="FFFFFF" w:sz="0"/>
-            </w:tcBorders>
-            <w:tcMar>
-              <w:top w:type="dxa" w:w="55"/>
-              <w:left w:type="dxa" w:w="120"/>
-              <w:bottom w:type="dxa" w:w="55"/>
-              <w:right w:type="dxa" w:w="120"/>
-            </w:tcMar>
-          </w:tcPr>
-          <w:p>
-            <w:pPr>
-              <w:spacing w:line="264"/>
-            </w:pPr>
-            <w:r>
-              <w:rPr>
-                <w:color w:val="222B30"/>
-                <w:sz w:val="19"/>
-                <w:szCs w:val="19"/>
-              </w:rPr>
-              <w:t xml:space="preserve">Texts / emails / payouts / customer card payments</w:t>
-            </w:r>
-          </w:p>
-        </w:tc>
-        <w:tc>
-          <w:tcPr>
-            <w:tcW w:type="dxa" w:w="4680"/>
-            <w:tcBorders>
-              <w:top w:val="single" w:color="D8DEE2" w:sz="2"/>
-              <w:left w:val="none" w:color="FFFFFF" w:sz="0"/>
-              <w:bottom w:val="single" w:color="D8DEE2" w:sz="2"/>
-              <w:right w:val="none" w:color="FFFFFF" w:sz="0"/>
-            </w:tcBorders>
-            <w:tcMar>
-              <w:top w:type="dxa" w:w="55"/>
-              <w:left w:type="dxa" w:w="120"/>
-              <w:bottom w:type="dxa" w:w="55"/>
-              <w:right w:type="dxa" w:w="120"/>
-            </w:tcMar>
-          </w:tcPr>
-          <w:p>
-            <w:pPr>
-              <w:spacing w:line="264"/>
-            </w:pPr>
-            <w:r>
-              <w:rPr>
-                <w:color w:val="222B30"/>
-                <w:sz w:val="19"/>
-                <w:szCs w:val="19"/>
-              </w:rPr>
-              <w:t xml:space="preserve">Phase 6</w:t>
-            </w:r>
-          </w:p>
-        </w:tc>
-      </w:tr>
-    </w:tbl>
+        <w:t xml:space="preserve">To turn on when you're ready</w:t>
+      </w:r>
+    </w:p>
+    <w:p>
+      <w:pPr>
+        <w:pStyle w:val="ListParagraph"/>
+        <w:numPr>
+          <w:ilvl w:val="0"/>
+          <w:numId w:val="2"/>
+        </w:numPr>
+        <w:spacing w:after="70" w:line="272"/>
+      </w:pPr>
+      <w:r>
+        <w:rPr>
+          <w:b/>
+          <w:bCs/>
+          <w:color w:val="222B30"/>
+          <w:sz w:val="21"/>
+          <w:szCs w:val="21"/>
+        </w:rPr>
+        <w:t xml:space="preserve">Real payments </w:t>
+      </w:r>
+      <w:r>
+        <w:rPr>
+          <w:color w:val="222B30"/>
+          <w:sz w:val="21"/>
+          <w:szCs w:val="21"/>
+        </w:rPr>
+        <w:t xml:space="preserve">— Stripe for rentals &amp; deposits (tokens only, never store card numbers); one-tap crew payouts.</w:t>
+      </w:r>
+    </w:p>
+    <w:p>
+      <w:pPr>
+        <w:pStyle w:val="ListParagraph"/>
+        <w:numPr>
+          <w:ilvl w:val="0"/>
+          <w:numId w:val="2"/>
+        </w:numPr>
+        <w:spacing w:after="70" w:line="272"/>
+      </w:pPr>
+      <w:r>
+        <w:rPr>
+          <w:b/>
+          <w:bCs/>
+          <w:color w:val="222B30"/>
+          <w:sz w:val="21"/>
+          <w:szCs w:val="21"/>
+        </w:rPr>
+        <w:t xml:space="preserve">Real messaging </w:t>
+      </w:r>
+      <w:r>
+        <w:rPr>
+          <w:color w:val="222B30"/>
+          <w:sz w:val="21"/>
+          <w:szCs w:val="21"/>
+        </w:rPr>
+        <w:t xml:space="preserve">— Twilio SMS + email for confirmations, reminders, driver alerts, and review requests; a scheduler for time-based sends (reminders, payday).</w:t>
+      </w:r>
+    </w:p>
     <w:p>
       <w:pPr>
         <w:pStyle w:val="Heading2"/>
@@ -3546,147 +2108,63 @@
           <w:sz w:val="24"/>
           <w:szCs w:val="24"/>
         </w:rPr>
-        <w:t xml:space="preserve">Phased build (order matters)</w:t>
-      </w:r>
-    </w:p>
-    <w:p>
-      <w:pPr>
-        <w:pStyle w:val="ListParagraph"/>
-        <w:numPr>
-          <w:ilvl w:val="0"/>
-          <w:numId w:val="3"/>
-        </w:numPr>
-        <w:spacing w:after="80" w:line="272"/>
-      </w:pPr>
-      <w:r>
-        <w:rPr>
-          <w:b/>
-          <w:bCs/>
-          <w:color w:val="222B30"/>
-          <w:sz w:val="21"/>
-          <w:szCs w:val="21"/>
-        </w:rPr>
-        <w:t xml:space="preserve">Accounts &amp; authentication </w:t>
-      </w:r>
-      <w:r>
-        <w:rPr>
-          <w:color w:val="222B30"/>
-          <w:sz w:val="21"/>
-          <w:szCs w:val="21"/>
-        </w:rPr>
-        <w:t xml:space="preserve">— real sign-up/login, hashed passwords, sessions, roles (platform_owner / business_owner / crew / customer), optional MFA. Blocks everything else.</w:t>
-      </w:r>
-    </w:p>
-    <w:p>
-      <w:pPr>
-        <w:pStyle w:val="ListParagraph"/>
-        <w:numPr>
-          <w:ilvl w:val="0"/>
-          <w:numId w:val="3"/>
-        </w:numPr>
-        <w:spacing w:after="80" w:line="272"/>
-      </w:pPr>
-      <w:r>
-        <w:rPr>
-          <w:b/>
-          <w:bCs/>
-          <w:color w:val="222B30"/>
-          <w:sz w:val="21"/>
-          <w:szCs w:val="21"/>
-        </w:rPr>
-        <w:t xml:space="preserve">Multi-tenant data isolation (the linchpin) </w:t>
-      </w:r>
-      <w:r>
-        <w:rPr>
-          <w:color w:val="222B30"/>
-          <w:sz w:val="21"/>
-          <w:szCs w:val="21"/>
-        </w:rPr>
-        <w:t xml:space="preserve">— every record carries a tenant_id; Row-Level Security so a user only sees their own business's data; migrate the single JSONB workspace to per-tenant rows.</w:t>
-      </w:r>
-    </w:p>
-    <w:p>
-      <w:pPr>
-        <w:pStyle w:val="ListParagraph"/>
-        <w:numPr>
-          <w:ilvl w:val="0"/>
-          <w:numId w:val="3"/>
-        </w:numPr>
-        <w:spacing w:after="80" w:line="272"/>
-      </w:pPr>
-      <w:r>
-        <w:rPr>
-          <w:b/>
-          <w:bCs/>
-          <w:color w:val="222B30"/>
-          <w:sz w:val="21"/>
-          <w:szCs w:val="21"/>
-        </w:rPr>
-        <w:t xml:space="preserve">Security hardening </w:t>
-      </w:r>
-      <w:r>
-        <w:rPr>
-          <w:color w:val="222B30"/>
-          <w:sz w:val="21"/>
-          <w:szCs w:val="21"/>
-        </w:rPr>
-        <w:t xml:space="preserve">— files (COI/signatures) in access-controlled storage; secrets server-side only; audit logging; PII hygiene + privacy policy.</w:t>
-      </w:r>
-    </w:p>
-    <w:p>
-      <w:pPr>
-        <w:pStyle w:val="ListParagraph"/>
-        <w:numPr>
-          <w:ilvl w:val="0"/>
-          <w:numId w:val="3"/>
-        </w:numPr>
-        <w:spacing w:after="80" w:line="272"/>
-      </w:pPr>
-      <w:r>
-        <w:rPr>
-          <w:b/>
-          <w:bCs/>
-          <w:color w:val="222B30"/>
-          <w:sz w:val="21"/>
-          <w:szCs w:val="21"/>
-        </w:rPr>
-        <w:t xml:space="preserve">SaaS billing </w:t>
-      </w:r>
-      <w:r>
-        <w:rPr>
-          <w:color w:val="222B30"/>
-          <w:sz w:val="21"/>
-          <w:szCs w:val="21"/>
-        </w:rPr>
-        <w:t xml:space="preserve">— Stripe Billing: 7-day trial → convert, manual or autopay, plans, dunning; wire the Operator portal to real subscribers.</w:t>
-      </w:r>
-    </w:p>
-    <w:p>
-      <w:pPr>
-        <w:pStyle w:val="ListParagraph"/>
-        <w:numPr>
-          <w:ilvl w:val="0"/>
-          <w:numId w:val="3"/>
-        </w:numPr>
-        <w:spacing w:after="80" w:line="272"/>
-      </w:pPr>
-      <w:r>
-        <w:rPr>
-          <w:b/>
-          <w:bCs/>
-          <w:color w:val="222B30"/>
-          <w:sz w:val="21"/>
-          <w:szCs w:val="21"/>
-        </w:rPr>
-        <w:t xml:space="preserve">Messaging &amp; customer payments go live </w:t>
-      </w:r>
-      <w:r>
-        <w:rPr>
-          <w:color w:val="222B30"/>
-          <w:sz w:val="21"/>
-          <w:szCs w:val="21"/>
-        </w:rPr>
-        <w:t xml:space="preserve">— Stripe for rentals (tokens only, never store cards); Twilio SMS + email for confirmations, reminders, owner alerts, review requests, crew notifications.</w:t>
+        <w:t xml:space="preserve">Keep first-class (they matter even for one business)</w:t>
+      </w:r>
+    </w:p>
+    <w:p>
+      <w:pPr>
+        <w:pStyle w:val="ListParagraph"/>
+        <w:numPr>
+          <w:ilvl w:val="0"/>
+          <w:numId w:val="2"/>
+        </w:numPr>
+        <w:spacing w:after="70" w:line="272"/>
+      </w:pPr>
+      <w:r>
+        <w:rPr>
+          <w:b/>
+          <w:bCs/>
+          <w:color w:val="222B30"/>
+          <w:sz w:val="21"/>
+          <w:szCs w:val="21"/>
+        </w:rPr>
+        <w:t xml:space="preserve">Reliability &amp; data-safety </w:t>
+      </w:r>
+      <w:r>
+        <w:rPr>
+          <w:color w:val="222B30"/>
+          <w:sz w:val="21"/>
+          <w:szCs w:val="21"/>
+        </w:rPr>
+        <w:t xml:space="preserve">— never lose data: automated backups + point-in-time recovery, soft-deletes with a recovery window, version history on bookings/agreements/settings, and a per-business export. Guarded writes so no bad save clobbers your data; a rehearsed restore (a backup you've never restored is a hope, not a backup).</w:t>
+      </w:r>
+    </w:p>
+    <w:p>
+      <w:pPr>
+        <w:pStyle w:val="ListParagraph"/>
+        <w:numPr>
+          <w:ilvl w:val="0"/>
+          <w:numId w:val="2"/>
+        </w:numPr>
+        <w:spacing w:after="70" w:line="272"/>
+      </w:pPr>
+      <w:r>
+        <w:rPr>
+          <w:b/>
+          <w:bCs/>
+          <w:color w:val="222B30"/>
+          <w:sz w:val="21"/>
+          <w:szCs w:val="21"/>
+        </w:rPr>
+        <w:t xml:space="preserve">Mobile experience </w:t>
+      </w:r>
+      <w:r>
+        <w:rPr>
+          <w:color w:val="222B30"/>
+          <w:sz w:val="21"/>
+          <w:szCs w:val="21"/>
+        </w:rPr>
+        <w:t xml:space="preserve">— crew mark jobs done in the field on a phone (one-thumb flow, spotty signal, offline-tolerant); your daily loop and taking a booking comfortable on mobile; the customer booking + /book embed feel native; add-to-home-screen / PWA.</w:t>
       </w:r>
     </w:p>
     <w:p>
@@ -3702,79 +2180,7 @@
           <w:sz w:val="24"/>
           <w:szCs w:val="24"/>
         </w:rPr>
-        <w:t xml:space="preserve">Cross-cutting — FIRST-CLASS, not afterthoughts (they gate launch)</w:t>
-      </w:r>
-    </w:p>
-    <w:p>
-      <w:pPr>
-        <w:pStyle w:val="ListParagraph"/>
-        <w:numPr>
-          <w:ilvl w:val="0"/>
-          <w:numId w:val="2"/>
-        </w:numPr>
-        <w:spacing w:after="70" w:line="272"/>
-      </w:pPr>
-      <w:r>
-        <w:rPr>
-          <w:b/>
-          <w:bCs/>
-          <w:color w:val="222B30"/>
-          <w:sz w:val="21"/>
-          <w:szCs w:val="21"/>
-        </w:rPr>
-        <w:t xml:space="preserve">Reliability &amp; data-safety </w:t>
-      </w:r>
-      <w:r>
-        <w:rPr>
-          <w:color w:val="222B30"/>
-          <w:sz w:val="21"/>
-          <w:szCs w:val="21"/>
-        </w:rPr>
-        <w:t xml:space="preserve">— never lose data (automated backups + point-in-time recovery, soft-deletes, version history, per-business export); guarded writes so no bad save clobbers a workspace; graceful failure/retry, uptime monitoring, and a rehearsed restore.</w:t>
-      </w:r>
-    </w:p>
-    <w:p>
-      <w:pPr>
-        <w:pStyle w:val="ListParagraph"/>
-        <w:numPr>
-          <w:ilvl w:val="0"/>
-          <w:numId w:val="2"/>
-        </w:numPr>
-        <w:spacing w:after="70" w:line="272"/>
-      </w:pPr>
-      <w:r>
-        <w:rPr>
-          <w:b/>
-          <w:bCs/>
-          <w:color w:val="222B30"/>
-          <w:sz w:val="21"/>
-          <w:szCs w:val="21"/>
-        </w:rPr>
-        <w:t xml:space="preserve">Mobile experience </w:t>
-      </w:r>
-      <w:r>
-        <w:rPr>
-          <w:color w:val="222B30"/>
-          <w:sz w:val="21"/>
-          <w:szCs w:val="21"/>
-        </w:rPr>
-        <w:t xml:space="preserve">— crew mark jobs done in the field on a phone (one-thumb flow, spotty signal, offline-tolerant); the owner's daily loop and taking a booking comfortable on mobile; customer booking + /book embed feel native; add-to-home-screen / PWA.</w:t>
-      </w:r>
-    </w:p>
-    <w:p>
-      <w:pPr>
-        <w:pStyle w:val="Heading2"/>
-        <w:spacing w:after="80" w:before="220"/>
-      </w:pPr>
-      <w:r>
-        <w:rPr>
-          <w:b/>
-          <w:bCs/>
-          <w:color w:val="B57A1F"/>
-          <w:sz w:val="24"/>
-          <w:szCs w:val="24"/>
-        </w:rPr>
-        <w:t xml:space="preserve">Security checklist</w:t>
+        <w:t xml:space="preserve">Data-safety checklist</w:t>
       </w:r>
     </w:p>
     <w:p>
@@ -3796,7 +2202,7 @@
           <w:sz w:val="21"/>
           <w:szCs w:val="21"/>
         </w:rPr>
-        <w:t xml:space="preserve">Real auth (hashed passwords, sessions, reset, optional MFA)</w:t>
+        <w:t xml:space="preserve">Supabase project kept active (or on Pro so it never pauses)</w:t>
       </w:r>
     </w:p>
     <w:p>
@@ -3818,7 +2224,7 @@
           <w:sz w:val="21"/>
           <w:szCs w:val="21"/>
         </w:rPr>
-        <w:t xml:space="preserve">Roles: platform_owner / business_owner / crew / customer</w:t>
+        <w:t xml:space="preserve">Automated backups + point-in-time recovery</w:t>
       </w:r>
     </w:p>
     <w:p>
@@ -3840,7 +2246,7 @@
           <w:sz w:val="21"/>
           <w:szCs w:val="21"/>
         </w:rPr>
-        <w:t xml:space="preserve">Row-Level Security on every table (tenant isolation)</w:t>
+        <w:t xml:space="preserve">Soft-deletes with a recovery window</w:t>
       </w:r>
     </w:p>
     <w:p>
@@ -3862,7 +2268,7 @@
           <w:sz w:val="21"/>
           <w:szCs w:val="21"/>
         </w:rPr>
-        <w:t xml:space="preserve">Operator portal gated to platform_owner role</w:t>
+        <w:t xml:space="preserve">Version history on bookings / agreements / settings</w:t>
       </w:r>
     </w:p>
     <w:p>
@@ -3884,7 +2290,7 @@
           <w:sz w:val="21"/>
           <w:szCs w:val="21"/>
         </w:rPr>
-        <w:t xml:space="preserve">Files (COI, signatures) in access-controlled Storage</w:t>
+        <w:t xml:space="preserve">A downloadable export of your data</w:t>
       </w:r>
     </w:p>
     <w:p>
@@ -3906,327 +2312,7 @@
           <w:sz w:val="21"/>
           <w:szCs w:val="21"/>
         </w:rPr>
-        <w:t xml:space="preserve">Secrets server-side only; anon key + RLS on client</w:t>
-      </w:r>
-    </w:p>
-    <w:p>
-      <w:pPr>
-        <w:spacing w:after="60" w:line="268"/>
-        <w:ind w:left="300"/>
-      </w:pPr>
-      <w:r>
-        <w:rPr>
-          <w:color w:val="B57A1F"/>
-          <w:sz w:val="21"/>
-          <w:szCs w:val="21"/>
-        </w:rPr>
-        <w:t xml:space="preserve">☐  </w:t>
-      </w:r>
-      <w:r>
-        <w:rPr>
-          <w:color w:val="222B30"/>
-          <w:sz w:val="21"/>
-          <w:szCs w:val="21"/>
-        </w:rPr>
-        <w:t xml:space="preserve">Payments via Stripe tokens (no raw cards stored)</w:t>
-      </w:r>
-    </w:p>
-    <w:p>
-      <w:pPr>
-        <w:spacing w:after="60" w:line="268"/>
-        <w:ind w:left="300"/>
-      </w:pPr>
-      <w:r>
-        <w:rPr>
-          <w:color w:val="B57A1F"/>
-          <w:sz w:val="21"/>
-          <w:szCs w:val="21"/>
-        </w:rPr>
-        <w:t xml:space="preserve">☐  </w:t>
-      </w:r>
-      <w:r>
-        <w:rPr>
-          <w:color w:val="222B30"/>
-          <w:sz w:val="21"/>
-          <w:szCs w:val="21"/>
-        </w:rPr>
-        <w:t xml:space="preserve">Audit log of sensitive changes</w:t>
-      </w:r>
-    </w:p>
-    <w:p>
-      <w:pPr>
-        <w:spacing w:after="60" w:line="268"/>
-        <w:ind w:left="300"/>
-      </w:pPr>
-      <w:r>
-        <w:rPr>
-          <w:color w:val="B57A1F"/>
-          <w:sz w:val="21"/>
-          <w:szCs w:val="21"/>
-        </w:rPr>
-        <w:t xml:space="preserve">☐  </w:t>
-      </w:r>
-      <w:r>
-        <w:rPr>
-          <w:color w:val="222B30"/>
-          <w:sz w:val="21"/>
-          <w:szCs w:val="21"/>
-        </w:rPr>
-        <w:t xml:space="preserve">PII minimization, retention/deletion, privacy policy + consent</w:t>
-      </w:r>
-    </w:p>
-    <w:p>
-      <w:pPr>
-        <w:pStyle w:val="Heading2"/>
-        <w:spacing w:after="80" w:before="220"/>
-      </w:pPr>
-      <w:r>
-        <w:rPr>
-          <w:b/>
-          <w:bCs/>
-          <w:color w:val="B57A1F"/>
-          <w:sz w:val="24"/>
-          <w:szCs w:val="24"/>
-        </w:rPr>
-        <w:t xml:space="preserve">Durability checklist</w:t>
-      </w:r>
-    </w:p>
-    <w:p>
-      <w:pPr>
-        <w:spacing w:after="60" w:line="268"/>
-        <w:ind w:left="300"/>
-      </w:pPr>
-      <w:r>
-        <w:rPr>
-          <w:color w:val="B57A1F"/>
-          <w:sz w:val="21"/>
-          <w:szCs w:val="21"/>
-        </w:rPr>
-        <w:t xml:space="preserve">☐  </w:t>
-      </w:r>
-      <w:r>
-        <w:rPr>
-          <w:color w:val="222B30"/>
-          <w:sz w:val="21"/>
-          <w:szCs w:val="21"/>
-        </w:rPr>
-        <w:t xml:space="preserve">Automated backups + point-in-time recovery</w:t>
-      </w:r>
-    </w:p>
-    <w:p>
-      <w:pPr>
-        <w:spacing w:after="60" w:line="268"/>
-        <w:ind w:left="300"/>
-      </w:pPr>
-      <w:r>
-        <w:rPr>
-          <w:color w:val="B57A1F"/>
-          <w:sz w:val="21"/>
-          <w:szCs w:val="21"/>
-        </w:rPr>
-        <w:t xml:space="preserve">☐  </w:t>
-      </w:r>
-      <w:r>
-        <w:rPr>
-          <w:color w:val="222B30"/>
-          <w:sz w:val="21"/>
-          <w:szCs w:val="21"/>
-        </w:rPr>
-        <w:t xml:space="preserve">Soft-deletes with a recovery window</w:t>
-      </w:r>
-    </w:p>
-    <w:p>
-      <w:pPr>
-        <w:spacing w:after="60" w:line="268"/>
-        <w:ind w:left="300"/>
-      </w:pPr>
-      <w:r>
-        <w:rPr>
-          <w:color w:val="B57A1F"/>
-          <w:sz w:val="21"/>
-          <w:szCs w:val="21"/>
-        </w:rPr>
-        <w:t xml:space="preserve">☐  </w:t>
-      </w:r>
-      <w:r>
-        <w:rPr>
-          <w:color w:val="222B30"/>
-          <w:sz w:val="21"/>
-          <w:szCs w:val="21"/>
-        </w:rPr>
-        <w:t xml:space="preserve">Version history on bookings / agreements / settings</w:t>
-      </w:r>
-    </w:p>
-    <w:p>
-      <w:pPr>
-        <w:spacing w:after="60" w:line="268"/>
-        <w:ind w:left="300"/>
-      </w:pPr>
-      <w:r>
-        <w:rPr>
-          <w:color w:val="B57A1F"/>
-          <w:sz w:val="21"/>
-          <w:szCs w:val="21"/>
-        </w:rPr>
-        <w:t xml:space="preserve">☐  </w:t>
-      </w:r>
-      <w:r>
-        <w:rPr>
-          <w:color w:val="222B30"/>
-          <w:sz w:val="21"/>
-          <w:szCs w:val="21"/>
-        </w:rPr>
-        <w:t xml:space="preserve">Per-business data export</w:t>
-      </w:r>
-    </w:p>
-    <w:p>
-      <w:pPr>
-        <w:spacing w:after="60" w:line="268"/>
-        <w:ind w:left="300"/>
-      </w:pPr>
-      <w:r>
-        <w:rPr>
-          <w:color w:val="B57A1F"/>
-          <w:sz w:val="21"/>
-          <w:szCs w:val="21"/>
-        </w:rPr>
-        <w:t xml:space="preserve">☐  </w:t>
-      </w:r>
-      <w:r>
-        <w:rPr>
-          <w:color w:val="222B30"/>
-          <w:sz w:val="21"/>
-          <w:szCs w:val="21"/>
-        </w:rPr>
-        <w:t xml:space="preserve">Guarded writes (per-tenant rows; validation)</w:t>
-      </w:r>
-    </w:p>
-    <w:p>
-      <w:pPr>
-        <w:spacing w:after="60" w:line="268"/>
-        <w:ind w:left="300"/>
-      </w:pPr>
-      <w:r>
-        <w:rPr>
-          <w:color w:val="B57A1F"/>
-          <w:sz w:val="21"/>
-          <w:szCs w:val="21"/>
-        </w:rPr>
-        <w:t xml:space="preserve">☐  </w:t>
-      </w:r>
-      <w:r>
-        <w:rPr>
-          <w:color w:val="222B30"/>
-          <w:sz w:val="21"/>
-          <w:szCs w:val="21"/>
-        </w:rPr>
-        <w:t xml:space="preserve">Cloud = source of truth; localStorage = cache only (already true)</w:t>
-      </w:r>
-    </w:p>
-    <w:p>
-      <w:pPr>
-        <w:pStyle w:val="Heading2"/>
-        <w:spacing w:after="80" w:before="220"/>
-      </w:pPr>
-      <w:r>
-        <w:rPr>
-          <w:b/>
-          <w:bCs/>
-          <w:color w:val="B57A1F"/>
-          <w:sz w:val="24"/>
-          <w:szCs w:val="24"/>
-        </w:rPr>
-        <w:t xml:space="preserve">Open decisions (confirm before building the backend)</w:t>
-      </w:r>
-    </w:p>
-    <w:p>
-      <w:pPr>
-        <w:pStyle w:val="ListParagraph"/>
-        <w:numPr>
-          <w:ilvl w:val="0"/>
-          <w:numId w:val="3"/>
-        </w:numPr>
-        <w:spacing w:after="80" w:line="272"/>
-      </w:pPr>
-      <w:r>
-        <w:rPr>
-          <w:color w:val="222B30"/>
-          <w:sz w:val="21"/>
-          <w:szCs w:val="21"/>
-        </w:rPr>
-        <w:t xml:space="preserve">Data model migration: JSONB-per-tenant first (fast) vs. normalize now (robust)? Recommended: JSONB-per-tenant first, normalize incrementally.</w:t>
-      </w:r>
-    </w:p>
-    <w:p>
-      <w:pPr>
-        <w:pStyle w:val="ListParagraph"/>
-        <w:numPr>
-          <w:ilvl w:val="0"/>
-          <w:numId w:val="3"/>
-        </w:numPr>
-        <w:spacing w:after="80" w:line="272"/>
-      </w:pPr>
-      <w:r>
-        <w:rPr>
-          <w:color w:val="222B30"/>
-          <w:sz w:val="21"/>
-          <w:szCs w:val="21"/>
-        </w:rPr>
-        <w:t xml:space="preserve">Hosting/plan: Supabase paid tier (for point-in-time recovery) + Vercel Pro for commercial use.</w:t>
-      </w:r>
-    </w:p>
-    <w:p>
-      <w:pPr>
-        <w:pStyle w:val="ListParagraph"/>
-        <w:numPr>
-          <w:ilvl w:val="0"/>
-          <w:numId w:val="3"/>
-        </w:numPr>
-        <w:spacing w:after="80" w:line="272"/>
-      </w:pPr>
-      <w:r>
-        <w:rPr>
-          <w:color w:val="222B30"/>
-          <w:sz w:val="21"/>
-          <w:szCs w:val="21"/>
-        </w:rPr>
-        <w:t xml:space="preserve">Auth provider: Supabase Auth (fits the stack) vs. an external identity provider.</w:t>
-      </w:r>
-    </w:p>
-    <w:p>
-      <w:pPr>
-        <w:pStyle w:val="ListParagraph"/>
-        <w:numPr>
-          <w:ilvl w:val="0"/>
-          <w:numId w:val="3"/>
-        </w:numPr>
-        <w:spacing w:after="80" w:line="272"/>
-      </w:pPr>
-      <w:r>
-        <w:rPr>
-          <w:color w:val="222B30"/>
-          <w:sz w:val="21"/>
-          <w:szCs w:val="21"/>
-        </w:rPr>
-        <w:t xml:space="preserve">Providers: Stripe (payments/billing) default; SMS via Twilio; email via SendGrid/Resend.</w:t>
-      </w:r>
-    </w:p>
-    <w:p>
-      <w:pPr>
-        <w:pStyle w:val="ListParagraph"/>
-        <w:numPr>
-          <w:ilvl w:val="0"/>
-          <w:numId w:val="3"/>
-        </w:numPr>
-        <w:spacing w:after="80" w:line="272"/>
-      </w:pPr>
-      <w:r>
-        <w:rPr>
-          <w:color w:val="222B30"/>
-          <w:sz w:val="21"/>
-          <w:szCs w:val="21"/>
-        </w:rPr>
-        <w:t xml:space="preserve">Compliance scope: which regions/customers → GDPR/CCPA obligations, privacy-policy owner.</w:t>
+        <w:t xml:space="preserve">Cloud = source of truth; the browser copy is just a cache (already true)</w:t>
       </w:r>
     </w:p>
     <w:tbl>
@@ -4281,7 +2367,7 @@
                 <w:sz w:val="21"/>
                 <w:szCs w:val="21"/>
               </w:rPr>
-              <w:t xml:space="preserve">The product depth and operational modeling are already strong — the hard part most competitors get wrong. The remaining work is the plumbing that makes it a business people trust with their livelihood: real accounts + data isolation, real payments, real messaging, real billing, plus reliability and mobile. Do Phases 1–2 first; everything sellable sits on top of them.</w:t>
+              <w:t xml:space="preserve">The operations are already there — the hard part. What's left is turning on the plumbing so it takes real money and sends real messages, and keeping your data rock-solid safe. Connect payments and messaging when you're ready to go fully live; back up your data in the meantime.</w:t>
             </w:r>
           </w:p>
         </w:tc>
@@ -4305,7 +2391,7 @@
           <w:sz w:val="32"/>
           <w:szCs w:val="32"/>
         </w:rPr>
-        <w:t xml:space="preserve">Part E — Technical Reference</w:t>
+        <w:t xml:space="preserve">Part D — Technical Reference</w:t>
       </w:r>
     </w:p>
     <w:p>
@@ -4364,7 +2450,7 @@
           <w:sz w:val="21"/>
           <w:szCs w:val="21"/>
         </w:rPr>
-        <w:t xml:space="preserve">— the whole client app. Single “use client” file. Exports App (default), OperatorApp, PortalChooser.</w:t>
+        <w:t xml:space="preserve">— the whole client app (owner, crew, customer, storefront, settings). Single “use client” file; default export App.</w:t>
       </w:r>
     </w:p>
     <w:p>
@@ -4504,43 +2590,7 @@
           <w:sz w:val="21"/>
           <w:szCs w:val="21"/>
         </w:rPr>
-        <w:t xml:space="preserve">→ &lt;YardHandApp embed/&gt; (booking only, noindex). </w:t>
-      </w:r>
-      <w:r>
-        <w:rPr>
-          <w:b/>
-          <w:bCs/>
-          <w:color w:val="222B30"/>
-          <w:sz w:val="21"/>
-          <w:szCs w:val="21"/>
-        </w:rPr>
-        <w:t xml:space="preserve">app/operator/page.js </w:t>
-      </w:r>
-      <w:r>
-        <w:rPr>
-          <w:color w:val="222B30"/>
-          <w:sz w:val="21"/>
-          <w:szCs w:val="21"/>
-        </w:rPr>
-        <w:t xml:space="preserve">→ &lt;OperatorApp/&gt;. </w:t>
-      </w:r>
-      <w:r>
-        <w:rPr>
-          <w:b/>
-          <w:bCs/>
-          <w:color w:val="222B30"/>
-          <w:sz w:val="21"/>
-          <w:szCs w:val="21"/>
-        </w:rPr>
-        <w:t xml:space="preserve">app/portal/page.js </w:t>
-      </w:r>
-      <w:r>
-        <w:rPr>
-          <w:color w:val="222B30"/>
-          <w:sz w:val="21"/>
-          <w:szCs w:val="21"/>
-        </w:rPr>
-        <w:t xml:space="preserve">→ &lt;PortalChooser/&gt;. Plus app/robots.js, app/sitemap.js.</w:t>
+        <w:t xml:space="preserve">→ &lt;YardHandApp embed/&gt; (booking only, noindex). Plus app/robots.js, app/sitemap.js.</w:t>
       </w:r>
     </w:p>
     <w:p>
@@ -4571,7 +2621,7 @@
           <w:sz w:val="21"/>
           <w:szCs w:val="21"/>
         </w:rPr>
-        <w:t xml:space="preserve">{ business, types[], trailers[], contractors[], bookings[], locations[], platform }</w:t>
+        <w:t xml:space="preserve">{ business, types[], trailers[], contractors[], bookings[], locations[] }</w:t>
       </w:r>
     </w:p>
     <w:p>
@@ -4655,25 +2705,7 @@
           <w:sz w:val="21"/>
           <w:szCs w:val="21"/>
         </w:rPr>
-        <w:t xml:space="preserve">— branches; each may carry overrides (business fields) + types. </w:t>
-      </w:r>
-      <w:r>
-        <w:rPr>
-          <w:b/>
-          <w:bCs/>
-          <w:color w:val="222B30"/>
-          <w:sz w:val="21"/>
-          <w:szCs w:val="21"/>
-        </w:rPr>
-        <w:t xml:space="preserve">platform </w:t>
-      </w:r>
-      <w:r>
-        <w:rPr>
-          <w:color w:val="222B30"/>
-          <w:sz w:val="21"/>
-          <w:szCs w:val="21"/>
-        </w:rPr>
-        <w:t xml:space="preserve">— simulated SaaS layer: operatorPass, trialDays, plans[], tenants[], site{}.</w:t>
+        <w:t xml:space="preserve">— branches; each may carry overrides (business fields) + types.</w:t>
       </w:r>
     </w:p>
     <w:p>
@@ -4843,7 +2875,7 @@
           <w:sz w:val="21"/>
           <w:szCs w:val="21"/>
         </w:rPr>
-        <w:t xml:space="preserve">All sending (texts/emails/payouts/customer payments/billing) is simulated until backends connect.</w:t>
+        <w:t xml:space="preserve">All sending (texts/emails/payouts/customer payments) is simulated until backends connect.</w:t>
       </w:r>
     </w:p>
     <w:p>

</xml_diff>

<commit_message>
Handbook: document tow gear & add-ons
Add a "Tow gear & add-ons" note to Part B (how-to-use) and regenerate the docx.

Co-Authored-By: Claude Opus 4.8 <noreply@anthropic.com>
Claude-Session: https://claude.ai/code/session_01FEggkQBQsZanbMCUNRbcMq
</commit_message>
<xml_diff>
--- a/Yardhand-Handbook.docx
+++ b/Yardhand-Handbook.docx
@@ -1478,6 +1478,89 @@
           <w:szCs w:val="21"/>
         </w:rPr>
         <w:t xml:space="preserve">Per-unit daily/weekly/2-week/monthly rates; delivery/self-pickup fees; a refundable deposit hold (not a charge); optional damage waiver; sales tax; cancellation rules. Crew pay: choose their tax status (1099/W2) and how you pay (per-job / hourly / salary), any mix; payroll views total what's owed with a Pay/Mark-paid button.</w:t>
+      </w:r>
+    </w:p>
+    <w:p>
+      <w:pPr>
+        <w:pStyle w:val="Heading2"/>
+        <w:spacing w:after="80" w:before="220"/>
+      </w:pPr>
+      <w:r>
+        <w:rPr>
+          <w:b/>
+          <w:bCs/>
+          <w:color w:val="B57A1F"/>
+          <w:sz w:val="24"/>
+          <w:szCs w:val="24"/>
+        </w:rPr>
+        <w:t xml:space="preserve">Tow gear &amp; add-ons</w:t>
+      </w:r>
+    </w:p>
+    <w:p>
+      <w:pPr>
+        <w:spacing w:after="120" w:line="278"/>
+      </w:pPr>
+      <w:r>
+        <w:rPr>
+          <w:color w:val="222B30"/>
+          <w:sz w:val="21"/>
+          <w:szCs w:val="21"/>
+        </w:rPr>
+        <w:t xml:space="preserve">Customers often show up without the right hitch. In </w:t>
+      </w:r>
+      <w:r>
+        <w:rPr>
+          <w:b/>
+          <w:bCs/>
+          <w:color w:val="222B30"/>
+          <w:sz w:val="21"/>
+          <w:szCs w:val="21"/>
+        </w:rPr>
+        <w:t xml:space="preserve">Settings → Tow gear &amp; add-ons</w:t>
+      </w:r>
+      <w:r>
+        <w:rPr>
+          <w:color w:val="222B30"/>
+          <w:sz w:val="21"/>
+          <w:szCs w:val="21"/>
+        </w:rPr>
+        <w:t xml:space="preserve">, stock the parts they might need — hitch balls, a ball mount, a 7-pin → 4-flat adapter, a plug-in brake controller, straps, a pin &amp; lock — with your own prices. They appear on the booking page under </w:t>
+      </w:r>
+      <w:r>
+        <w:rPr>
+          <w:b/>
+          <w:bCs/>
+          <w:color w:val="222B30"/>
+          <w:sz w:val="21"/>
+          <w:szCs w:val="21"/>
+        </w:rPr>
+        <w:t xml:space="preserve">“Don't have the right hitch?”</w:t>
+      </w:r>
+      <w:r>
+        <w:rPr>
+          <w:color w:val="222B30"/>
+          <w:sz w:val="21"/>
+          <w:szCs w:val="21"/>
+        </w:rPr>
+        <w:t xml:space="preserve">, get charged once per order, and show on the booking as </w:t>
+      </w:r>
+      <w:r>
+        <w:rPr>
+          <w:b/>
+          <w:bCs/>
+          <w:color w:val="222B30"/>
+          <w:sz w:val="21"/>
+          <w:szCs w:val="21"/>
+        </w:rPr>
+        <w:t xml:space="preserve">“Tow gear to have ready”</w:t>
+      </w:r>
+      <w:r>
+        <w:rPr>
+          <w:color w:val="222B30"/>
+          <w:sz w:val="21"/>
+          <w:szCs w:val="21"/>
+        </w:rPr>
+        <w:t xml:space="preserve"> so you can set it out at pickup. Keep each equipment type's “You'll need to tow this” note accurate so customers know what to grab.</w:t>
       </w:r>
     </w:p>
     <w:p>

</xml_diff>

<commit_message>
Tow gear: rental-only wording + handbook "what to figure out" list
- Frame add-ons as rentals in the app (customer picker + Settings copy): the
  gear comes back with the trailer; no purchase option.
- Handbook: expand the Tow gear section — clarifies the trailer has its half
  (coupler/chains/jack/7-pin) while the customer supplies the truck-side gear,
  notes the items are editable in-app, and adds a "what you still need to figure
  out" list (ball sizes, your rental prices, quantity on hand, getting it back,
  brake controller). Regenerated the docx.
- Confirmed the Settings "Tow gear & add-ons" editor is fully editable
  (name/description/price/add/remove).

Co-Authored-By: Claude Opus 4.8 <noreply@anthropic.com>
Claude-Session: https://claude.ai/code/session_01FEggkQBQsZanbMCUNRbcMq
</commit_message>
<xml_diff>
--- a/Yardhand-Handbook.docx
+++ b/Yardhand-Handbook.docx
@@ -1493,7 +1493,7 @@
           <w:sz w:val="24"/>
           <w:szCs w:val="24"/>
         </w:rPr>
-        <w:t xml:space="preserve">Tow gear &amp; add-ons</w:t>
+        <w:t xml:space="preserve">Tow gear &amp; add-ons (rentals)</w:t>
       </w:r>
     </w:p>
     <w:p>
@@ -1506,7 +1506,43 @@
           <w:sz w:val="21"/>
           <w:szCs w:val="21"/>
         </w:rPr>
-        <w:t xml:space="preserve">Customers often show up without the right hitch. In </w:t>
+        <w:t xml:space="preserve">Customers often show up without the right hitch. The trailer already has </w:t>
+      </w:r>
+      <w:r>
+        <w:rPr>
+          <w:b/>
+          <w:bCs/>
+          <w:color w:val="222B30"/>
+          <w:sz w:val="21"/>
+          <w:szCs w:val="21"/>
+        </w:rPr>
+        <w:t xml:space="preserve">its half</w:t>
+      </w:r>
+      <w:r>
+        <w:rPr>
+          <w:color w:val="222B30"/>
+          <w:sz w:val="21"/>
+          <w:szCs w:val="21"/>
+        </w:rPr>
+        <w:t xml:space="preserve"> — the coupler, safety chains, jack, and 7-pin plug — but the customer's </w:t>
+      </w:r>
+      <w:r>
+        <w:rPr>
+          <w:b/>
+          <w:bCs/>
+          <w:color w:val="222B30"/>
+          <w:sz w:val="21"/>
+          <w:szCs w:val="21"/>
+        </w:rPr>
+        <w:t xml:space="preserve">truck</w:t>
+      </w:r>
+      <w:r>
+        <w:rPr>
+          <w:color w:val="222B30"/>
+          <w:sz w:val="21"/>
+          <w:szCs w:val="21"/>
+        </w:rPr>
+        <w:t xml:space="preserve"> needs a ball mount, the right-size ball, a brake controller, and a matching connector. In </w:t>
       </w:r>
       <w:r>
         <w:rPr>
@@ -1524,7 +1560,25 @@
           <w:sz w:val="21"/>
           <w:szCs w:val="21"/>
         </w:rPr>
-        <w:t xml:space="preserve">, stock the parts they might need — hitch balls, a ball mount, a 7-pin → 4-flat adapter, a plug-in brake controller, straps, a pin &amp; lock — with your own prices. They appear on the booking page under </w:t>
+        <w:t xml:space="preserve">, stock that truck-side gear as </w:t>
+      </w:r>
+      <w:r>
+        <w:rPr>
+          <w:b/>
+          <w:bCs/>
+          <w:color w:val="222B30"/>
+          <w:sz w:val="21"/>
+          <w:szCs w:val="21"/>
+        </w:rPr>
+        <w:t xml:space="preserve">rentals</w:t>
+      </w:r>
+      <w:r>
+        <w:rPr>
+          <w:color w:val="222B30"/>
+          <w:sz w:val="21"/>
+          <w:szCs w:val="21"/>
+        </w:rPr>
+        <w:t xml:space="preserve"> (it comes back with the trailer) with your own prices. It appears on the booking page under </w:t>
       </w:r>
       <w:r>
         <w:rPr>
@@ -1542,7 +1596,7 @@
           <w:sz w:val="21"/>
           <w:szCs w:val="21"/>
         </w:rPr>
-        <w:t xml:space="preserve">, get charged once per order, and show on the booking as </w:t>
+        <w:t xml:space="preserve">, is charged once per order, and shows on the booking as </w:t>
       </w:r>
       <w:r>
         <w:rPr>
@@ -1560,7 +1614,162 @@
           <w:sz w:val="21"/>
           <w:szCs w:val="21"/>
         </w:rPr>
-        <w:t xml:space="preserve"> so you can set it out at pickup. Keep each equipment type's “You'll need to tow this” note accurate so customers know what to grab.</w:t>
+        <w:t xml:space="preserve"> so you can set it out at pickup. You add, rename, re-price, or remove items yourself — it's fully editable in the app.</w:t>
+      </w:r>
+    </w:p>
+    <w:p>
+      <w:pPr>
+        <w:spacing w:after="120" w:line="278"/>
+      </w:pPr>
+      <w:r>
+        <w:rPr>
+          <w:b/>
+          <w:bCs/>
+          <w:color w:val="222B30"/>
+          <w:sz w:val="21"/>
+          <w:szCs w:val="21"/>
+        </w:rPr>
+        <w:t xml:space="preserve">What you still need to figure out:</w:t>
+      </w:r>
+    </w:p>
+    <w:p>
+      <w:pPr>
+        <w:pStyle w:val="ListParagraph"/>
+        <w:numPr>
+          <w:ilvl w:val="0"/>
+          <w:numId w:val="2"/>
+        </w:numPr>
+        <w:spacing w:after="70" w:line="272"/>
+      </w:pPr>
+      <w:r>
+        <w:rPr>
+          <w:b/>
+          <w:bCs/>
+          <w:color w:val="222B30"/>
+          <w:sz w:val="21"/>
+          <w:szCs w:val="21"/>
+        </w:rPr>
+        <w:t xml:space="preserve">Ball sizes that match your trailers </w:t>
+      </w:r>
+      <w:r>
+        <w:rPr>
+          <w:color w:val="222B30"/>
+          <w:sz w:val="21"/>
+          <w:szCs w:val="21"/>
+        </w:rPr>
+        <w:t xml:space="preserve">— 2-5/16" for the heavy ones (14K / 9,990), 2" for the 5x8. Stock the right ones.</w:t>
+      </w:r>
+    </w:p>
+    <w:p>
+      <w:pPr>
+        <w:pStyle w:val="ListParagraph"/>
+        <w:numPr>
+          <w:ilvl w:val="0"/>
+          <w:numId w:val="2"/>
+        </w:numPr>
+        <w:spacing w:after="70" w:line="272"/>
+      </w:pPr>
+      <w:r>
+        <w:rPr>
+          <w:b/>
+          <w:bCs/>
+          <w:color w:val="222B30"/>
+          <w:sz w:val="21"/>
+          <w:szCs w:val="21"/>
+        </w:rPr>
+        <w:t xml:space="preserve">Your rental price per item </w:t>
+      </w:r>
+      <w:r>
+        <w:rPr>
+          <w:color w:val="222B30"/>
+          <w:sz w:val="21"/>
+          <w:szCs w:val="21"/>
+        </w:rPr>
+        <w:t xml:space="preserve">— the seeded numbers ($8–$35) are placeholders; set what you'll actually charge.</w:t>
+      </w:r>
+    </w:p>
+    <w:p>
+      <w:pPr>
+        <w:pStyle w:val="ListParagraph"/>
+        <w:numPr>
+          <w:ilvl w:val="0"/>
+          <w:numId w:val="2"/>
+        </w:numPr>
+        <w:spacing w:after="70" w:line="272"/>
+      </w:pPr>
+      <w:r>
+        <w:rPr>
+          <w:b/>
+          <w:bCs/>
+          <w:color w:val="222B30"/>
+          <w:sz w:val="21"/>
+          <w:szCs w:val="21"/>
+        </w:rPr>
+        <w:t xml:space="preserve">How many of each you keep on hand </w:t>
+      </w:r>
+      <w:r>
+        <w:rPr>
+          <w:color w:val="222B30"/>
+          <w:sz w:val="21"/>
+          <w:szCs w:val="21"/>
+        </w:rPr>
+        <w:t xml:space="preserve">— the app doesn't track add-on quantity yet, so watch it manually so you don't promise a ball mount that's already out with another rental.</w:t>
+      </w:r>
+    </w:p>
+    <w:p>
+      <w:pPr>
+        <w:pStyle w:val="ListParagraph"/>
+        <w:numPr>
+          <w:ilvl w:val="0"/>
+          <w:numId w:val="2"/>
+        </w:numPr>
+        <w:spacing w:after="70" w:line="272"/>
+      </w:pPr>
+      <w:r>
+        <w:rPr>
+          <w:b/>
+          <w:bCs/>
+          <w:color w:val="222B30"/>
+          <w:sz w:val="21"/>
+          <w:szCs w:val="21"/>
+        </w:rPr>
+        <w:t xml:space="preserve">Getting it back </w:t>
+      </w:r>
+      <w:r>
+        <w:rPr>
+          <w:color w:val="222B30"/>
+          <w:sz w:val="21"/>
+          <w:szCs w:val="21"/>
+        </w:rPr>
+        <w:t xml:space="preserve">— it's a rental, so decide how you handle non-returns (e.g. add a small deposit or charge for a missing part). The trailer's deposit is separate.</w:t>
+      </w:r>
+    </w:p>
+    <w:p>
+      <w:pPr>
+        <w:pStyle w:val="ListParagraph"/>
+        <w:numPr>
+          <w:ilvl w:val="0"/>
+          <w:numId w:val="2"/>
+        </w:numPr>
+        <w:spacing w:after="70" w:line="272"/>
+      </w:pPr>
+      <w:r>
+        <w:rPr>
+          <w:b/>
+          <w:bCs/>
+          <w:color w:val="222B30"/>
+          <w:sz w:val="21"/>
+          <w:szCs w:val="21"/>
+        </w:rPr>
+        <w:t xml:space="preserve">Brake controller </w:t>
+      </w:r>
+      <w:r>
+        <w:rPr>
+          <w:color w:val="222B30"/>
+          <w:sz w:val="21"/>
+          <w:szCs w:val="21"/>
+        </w:rPr>
+        <w:t xml:space="preserve">— decide whether you stock a plug-in one, and confirm it works with the trucks your customers drive.</w:t>
       </w:r>
     </w:p>
     <w:p>

</xml_diff>

<commit_message>
Handbook: document add-on inventory tracking and load rating
Note that On-hand quantity is now tracked (an item stops being offered
once all units are out on overlapping rentals), the amber
keep-one-per-trailer guidance, and that the truck's hitch, ball mount,
and ball must be rated for the loaded trailer weight.

Co-Authored-By: Claude Opus 4.8 <noreply@anthropic.com>
Claude-Session: https://claude.ai/code/session_01FEggkQBQsZanbMCUNRbcMq
</commit_message>
<xml_diff>
--- a/Yardhand-Handbook.docx
+++ b/Yardhand-Handbook.docx
@@ -1629,6 +1629,160 @@
           <w:sz w:val="21"/>
           <w:szCs w:val="21"/>
         </w:rPr>
+        <w:t xml:space="preserve">On-hand quantity is now tracked. </w:t>
+      </w:r>
+      <w:r>
+        <w:rPr>
+          <w:color w:val="222B30"/>
+          <w:sz w:val="21"/>
+          <w:szCs w:val="21"/>
+        </w:rPr>
+        <w:t xml:space="preserve">Each item has an </w:t>
+      </w:r>
+      <w:r>
+        <w:rPr>
+          <w:b/>
+          <w:bCs/>
+          <w:color w:val="222B30"/>
+          <w:sz w:val="21"/>
+          <w:szCs w:val="21"/>
+        </w:rPr>
+        <w:t xml:space="preserve">On hand</w:t>
+      </w:r>
+      <w:r>
+        <w:rPr>
+          <w:color w:val="222B30"/>
+          <w:sz w:val="21"/>
+          <w:szCs w:val="21"/>
+        </w:rPr>
+        <w:t xml:space="preserve"> count. When all units of an item are already out on rentals that overlap a customer's dates, the app stops offering it for those dates (</w:t>
+      </w:r>
+      <w:r>
+        <w:rPr>
+          <w:b/>
+          <w:bCs/>
+          <w:color w:val="222B30"/>
+          <w:sz w:val="21"/>
+          <w:szCs w:val="21"/>
+        </w:rPr>
+        <w:t xml:space="preserve">“Out for these dates”</w:t>
+      </w:r>
+      <w:r>
+        <w:rPr>
+          <w:color w:val="222B30"/>
+          <w:sz w:val="21"/>
+          <w:szCs w:val="21"/>
+        </w:rPr>
+        <w:t xml:space="preserve">) — so you can't promise a ball mount that's already gone. The editor turns the count </w:t>
+      </w:r>
+      <w:r>
+        <w:rPr>
+          <w:b/>
+          <w:bCs/>
+          <w:color w:val="222B30"/>
+          <w:sz w:val="21"/>
+          <w:szCs w:val="21"/>
+        </w:rPr>
+        <w:t xml:space="preserve">amber</w:t>
+      </w:r>
+      <w:r>
+        <w:rPr>
+          <w:color w:val="222B30"/>
+          <w:sz w:val="21"/>
+          <w:szCs w:val="21"/>
+        </w:rPr>
+        <w:t xml:space="preserve"> if you drop below one per trailer; keeping roughly one of each common attachment per trailer means any customer can be set up even when several trailers are out at once.</w:t>
+      </w:r>
+    </w:p>
+    <w:p>
+      <w:pPr>
+        <w:spacing w:after="120" w:line="278"/>
+      </w:pPr>
+      <w:r>
+        <w:rPr>
+          <w:b/>
+          <w:bCs/>
+          <w:color w:val="222B30"/>
+          <w:sz w:val="21"/>
+          <w:szCs w:val="21"/>
+        </w:rPr>
+        <w:t xml:space="preserve">Load rating matters. </w:t>
+      </w:r>
+      <w:r>
+        <w:rPr>
+          <w:color w:val="222B30"/>
+          <w:sz w:val="21"/>
+          <w:szCs w:val="21"/>
+        </w:rPr>
+        <w:t xml:space="preserve">The truck-side parts — the </w:t>
+      </w:r>
+      <w:r>
+        <w:rPr>
+          <w:b/>
+          <w:bCs/>
+          <w:color w:val="222B30"/>
+          <w:sz w:val="21"/>
+          <w:szCs w:val="21"/>
+        </w:rPr>
+        <w:t xml:space="preserve">hitch, ball mount, and ball</w:t>
+      </w:r>
+      <w:r>
+        <w:rPr>
+          <w:color w:val="222B30"/>
+          <w:sz w:val="21"/>
+          <w:szCs w:val="21"/>
+        </w:rPr>
+        <w:t xml:space="preserve"> — must each be </w:t>
+      </w:r>
+      <w:r>
+        <w:rPr>
+          <w:b/>
+          <w:bCs/>
+          <w:color w:val="222B30"/>
+          <w:sz w:val="21"/>
+          <w:szCs w:val="21"/>
+        </w:rPr>
+        <w:t xml:space="preserve">rated for the loaded trailer weight</w:t>
+      </w:r>
+      <w:r>
+        <w:rPr>
+          <w:color w:val="222B30"/>
+          <w:sz w:val="21"/>
+          <w:szCs w:val="21"/>
+        </w:rPr>
+        <w:t xml:space="preserve"> (e.g. a 2-5/16" ball and a Class IV+ mount for the 14K trailers). The booking page reminds customers of this, and each equipment type carries a </w:t>
+      </w:r>
+      <w:r>
+        <w:rPr>
+          <w:b/>
+          <w:bCs/>
+          <w:color w:val="222B30"/>
+          <w:sz w:val="21"/>
+          <w:szCs w:val="21"/>
+        </w:rPr>
+        <w:t xml:space="preserve">“You'll need to tow this”</w:t>
+      </w:r>
+      <w:r>
+        <w:rPr>
+          <w:color w:val="222B30"/>
+          <w:sz w:val="21"/>
+          <w:szCs w:val="21"/>
+        </w:rPr>
+        <w:t xml:space="preserve"> note you should keep accurate. Stock only add-ons rated for the trailers you pair them with.</w:t>
+      </w:r>
+    </w:p>
+    <w:p>
+      <w:pPr>
+        <w:spacing w:after="120" w:line="278"/>
+      </w:pPr>
+      <w:r>
+        <w:rPr>
+          <w:b/>
+          <w:bCs/>
+          <w:color w:val="222B30"/>
+          <w:sz w:val="21"/>
+          <w:szCs w:val="21"/>
+        </w:rPr>
         <w:t xml:space="preserve">What you still need to figure out:</w:t>
       </w:r>
     </w:p>
@@ -1705,15 +1859,33 @@
           <w:sz w:val="21"/>
           <w:szCs w:val="21"/>
         </w:rPr>
-        <w:t xml:space="preserve">How many of each you keep on hand </w:t>
-      </w:r>
-      <w:r>
-        <w:rPr>
-          <w:color w:val="222B30"/>
-          <w:sz w:val="21"/>
-          <w:szCs w:val="21"/>
-        </w:rPr>
-        <w:t xml:space="preserve">— the app doesn't track add-on quantity yet, so watch it manually so you don't promise a ball mount that's already out with another rental.</w:t>
+        <w:t xml:space="preserve">How many of each to buy </w:t>
+      </w:r>
+      <w:r>
+        <w:rPr>
+          <w:color w:val="222B30"/>
+          <w:sz w:val="21"/>
+          <w:szCs w:val="21"/>
+        </w:rPr>
+        <w:t xml:space="preserve">— set each </w:t>
+      </w:r>
+      <w:r>
+        <w:rPr>
+          <w:b/>
+          <w:bCs/>
+          <w:color w:val="222B30"/>
+          <w:sz w:val="21"/>
+          <w:szCs w:val="21"/>
+        </w:rPr>
+        <w:t xml:space="preserve">On hand</w:t>
+      </w:r>
+      <w:r>
+        <w:rPr>
+          <w:color w:val="222B30"/>
+          <w:sz w:val="21"/>
+          <w:szCs w:val="21"/>
+        </w:rPr>
+        <w:t xml:space="preserve"> count to what you actually own. Aim for at least one of every common attachment per trailer so you're never short when the fleet is busy.</w:t>
       </w:r>
     </w:p>
     <w:p>

</xml_diff>

<commit_message>
Add liability protections: tow-gear agreement clause, startup + legal handbook sections
App:
- New rental-agreement clause covering rented tow gear/attachments
  (as-is, customer confirms size/rating, hitches/secures, holds owner
  harmless), renumbered ownership clause.
- Booking-page tow-gear note reframed to put fitment/rating
  responsibility on the customer rather than implying the yard certifies it.

Handbook:
- 'Before you open — your startup checklist' (LLC, commercial insurance,
  attorney-reviewed agreement, COI rule, licenses/tax, then app setup).
- 'Protecting yourself — insurance, agreements & liability' section
  (not legal advice) covering what really protects the owner, the
  customer-fault case, and the wrong-attachment product-liability risk.

Co-Authored-By: Claude Opus 4.8 <noreply@anthropic.com>
Claude-Session: https://claude.ai/code/session_01FEggkQBQsZanbMCUNRbcMq
</commit_message>
<xml_diff>
--- a/Yardhand-Handbook.docx
+++ b/Yardhand-Handbook.docx
@@ -777,7 +777,7 @@
           <w:sz w:val="24"/>
           <w:szCs w:val="24"/>
         </w:rPr>
-        <w:t xml:space="preserve">The one idea worth understanding: two legs</w:t>
+        <w:t xml:space="preserve">Before you open — your startup checklist</w:t>
       </w:r>
     </w:p>
     <w:p>
@@ -790,25 +790,323 @@
           <w:sz w:val="21"/>
           <w:szCs w:val="21"/>
         </w:rPr>
-        <w:t xml:space="preserve">Every rental is </w:t>
-      </w:r>
-      <w:r>
-        <w:rPr>
-          <w:b/>
-          <w:bCs/>
-          <w:color w:val="222B30"/>
-          <w:sz w:val="21"/>
-          <w:szCs w:val="21"/>
-        </w:rPr>
-        <w:t xml:space="preserve">two separate trips</w:t>
-      </w:r>
-      <w:r>
-        <w:rPr>
-          <w:color w:val="222B30"/>
-          <w:sz w:val="21"/>
-          <w:szCs w:val="21"/>
-        </w:rPr>
-        <w:t xml:space="preserve"> — the OUT leg (getting the trailer to the customer) and the RETURN leg (getting it back). Each is scheduled on its own, so a month-long rental never ties up a driver for a month. Each leg is either self-serve (customer picks up / drops off at your yard — needs nobody) or you handle it (delivery / collection — needs a driver).</w:t>
+        <w:t xml:space="preserve">Do these before you take your first real booking. The first block is legal/business setup (off-app, but the app can't substitute for it); the second is getting the app ready.</w:t>
+      </w:r>
+    </w:p>
+    <w:p>
+      <w:pPr>
+        <w:spacing w:after="120" w:line="278"/>
+      </w:pPr>
+      <w:r>
+        <w:rPr>
+          <w:b/>
+          <w:bCs/>
+          <w:color w:val="222B30"/>
+          <w:sz w:val="21"/>
+          <w:szCs w:val="21"/>
+        </w:rPr>
+        <w:t xml:space="preserve">Set up the business:</w:t>
+      </w:r>
+    </w:p>
+    <w:p>
+      <w:pPr>
+        <w:spacing w:after="60" w:line="268"/>
+        <w:ind w:left="300"/>
+      </w:pPr>
+      <w:r>
+        <w:rPr>
+          <w:color w:val="B57A1F"/>
+          <w:sz w:val="21"/>
+          <w:szCs w:val="21"/>
+        </w:rPr>
+        <w:t xml:space="preserve">☐  </w:t>
+      </w:r>
+      <w:r>
+        <w:rPr>
+          <w:color w:val="222B30"/>
+          <w:sz w:val="21"/>
+          <w:szCs w:val="21"/>
+        </w:rPr>
+        <w:t xml:space="preserve">Form an LLC (or have your attorney/CPA advise on the right entity) so a claim comes after the business, not your personal assets.</w:t>
+      </w:r>
+    </w:p>
+    <w:p>
+      <w:pPr>
+        <w:spacing w:after="60" w:line="268"/>
+        <w:ind w:left="300"/>
+      </w:pPr>
+      <w:r>
+        <w:rPr>
+          <w:color w:val="B57A1F"/>
+          <w:sz w:val="21"/>
+          <w:szCs w:val="21"/>
+        </w:rPr>
+        <w:t xml:space="preserve">☐  </w:t>
+      </w:r>
+      <w:r>
+        <w:rPr>
+          <w:color w:val="222B30"/>
+          <w:sz w:val="21"/>
+          <w:szCs w:val="21"/>
+        </w:rPr>
+        <w:t xml:space="preserve">Get commercial general-liability insurance written for trailer/equipment rental — call a commercial agent, not your personal auto insurer. This is your real protection in a crash or injury; don't rent until it's in force.</w:t>
+      </w:r>
+    </w:p>
+    <w:p>
+      <w:pPr>
+        <w:spacing w:after="60" w:line="268"/>
+        <w:ind w:left="300"/>
+      </w:pPr>
+      <w:r>
+        <w:rPr>
+          <w:color w:val="B57A1F"/>
+          <w:sz w:val="21"/>
+          <w:szCs w:val="21"/>
+        </w:rPr>
+        <w:t xml:space="preserve">☐  </w:t>
+      </w:r>
+      <w:r>
+        <w:rPr>
+          <w:color w:val="222B30"/>
+          <w:sz w:val="21"/>
+          <w:szCs w:val="21"/>
+        </w:rPr>
+        <w:t xml:space="preserve">Have a North Carolina attorney review and finalize your rental agreement (the app's built-in text is a solid starting draft, not a lawyer-reviewed contract).</w:t>
+      </w:r>
+    </w:p>
+    <w:p>
+      <w:pPr>
+        <w:spacing w:after="60" w:line="268"/>
+        <w:ind w:left="300"/>
+      </w:pPr>
+      <w:r>
+        <w:rPr>
+          <w:color w:val="B57A1F"/>
+          <w:sz w:val="21"/>
+          <w:szCs w:val="21"/>
+        </w:rPr>
+        <w:t xml:space="preserve">☐  </w:t>
+      </w:r>
+      <w:r>
+        <w:rPr>
+          <w:color w:val="222B30"/>
+          <w:sz w:val="21"/>
+          <w:szCs w:val="21"/>
+        </w:rPr>
+        <w:t xml:space="preserve">Decide your Certificate-of-Insurance rule (Settings → who must show proof of insurance) and require it where it makes sense — commercial customers at minimum.</w:t>
+      </w:r>
+    </w:p>
+    <w:p>
+      <w:pPr>
+        <w:spacing w:after="60" w:line="268"/>
+        <w:ind w:left="300"/>
+      </w:pPr>
+      <w:r>
+        <w:rPr>
+          <w:color w:val="B57A1F"/>
+          <w:sz w:val="21"/>
+          <w:szCs w:val="21"/>
+        </w:rPr>
+        <w:t xml:space="preserve">☐  </w:t>
+      </w:r>
+      <w:r>
+        <w:rPr>
+          <w:color w:val="222B30"/>
+          <w:sz w:val="21"/>
+          <w:szCs w:val="21"/>
+        </w:rPr>
+        <w:t xml:space="preserve">Register for state/local business licenses and sales-tax collection as required; confirm your tax rate in Settings.</w:t>
+      </w:r>
+    </w:p>
+    <w:p>
+      <w:pPr>
+        <w:spacing w:after="60" w:line="268"/>
+        <w:ind w:left="300"/>
+      </w:pPr>
+      <w:r>
+        <w:rPr>
+          <w:color w:val="B57A1F"/>
+          <w:sz w:val="21"/>
+          <w:szCs w:val="21"/>
+        </w:rPr>
+        <w:t xml:space="preserve">☐  </w:t>
+      </w:r>
+      <w:r>
+        <w:rPr>
+          <w:color w:val="222B30"/>
+          <w:sz w:val="21"/>
+          <w:szCs w:val="21"/>
+        </w:rPr>
+        <w:t xml:space="preserve">Open a business bank account and set up how you'll take deposits and payments.</w:t>
+      </w:r>
+    </w:p>
+    <w:p>
+      <w:pPr>
+        <w:spacing w:after="120" w:line="278"/>
+      </w:pPr>
+      <w:r>
+        <w:rPr>
+          <w:b/>
+          <w:bCs/>
+          <w:color w:val="222B30"/>
+          <w:sz w:val="21"/>
+          <w:szCs w:val="21"/>
+        </w:rPr>
+        <w:t xml:space="preserve">Get the app ready:</w:t>
+      </w:r>
+    </w:p>
+    <w:p>
+      <w:pPr>
+        <w:spacing w:after="60" w:line="268"/>
+        <w:ind w:left="300"/>
+      </w:pPr>
+      <w:r>
+        <w:rPr>
+          <w:color w:val="B57A1F"/>
+          <w:sz w:val="21"/>
+          <w:szCs w:val="21"/>
+        </w:rPr>
+        <w:t xml:space="preserve">☐  </w:t>
+      </w:r>
+      <w:r>
+        <w:rPr>
+          <w:color w:val="222B30"/>
+          <w:sz w:val="21"/>
+          <w:szCs w:val="21"/>
+        </w:rPr>
+        <w:t xml:space="preserve">Settings → business name, yard/location, phone, hours, time zone, and logo.</w:t>
+      </w:r>
+    </w:p>
+    <w:p>
+      <w:pPr>
+        <w:spacing w:after="60" w:line="268"/>
+        <w:ind w:left="300"/>
+      </w:pPr>
+      <w:r>
+        <w:rPr>
+          <w:color w:val="B57A1F"/>
+          <w:sz w:val="21"/>
+          <w:szCs w:val="21"/>
+        </w:rPr>
+        <w:t xml:space="preserve">☐  </w:t>
+      </w:r>
+      <w:r>
+        <w:rPr>
+          <w:color w:val="222B30"/>
+          <w:sz w:val="21"/>
+          <w:szCs w:val="21"/>
+        </w:rPr>
+        <w:t xml:space="preserve">Fleet → add your real trailers (size, GVWR/payload) and remove the sample ones.</w:t>
+      </w:r>
+    </w:p>
+    <w:p>
+      <w:pPr>
+        <w:spacing w:after="60" w:line="268"/>
+        <w:ind w:left="300"/>
+      </w:pPr>
+      <w:r>
+        <w:rPr>
+          <w:color w:val="B57A1F"/>
+          <w:sz w:val="21"/>
+          <w:szCs w:val="21"/>
+        </w:rPr>
+        <w:t xml:space="preserve">☐  </w:t>
+      </w:r>
+      <w:r>
+        <w:rPr>
+          <w:color w:val="222B30"/>
+          <w:sz w:val="21"/>
+          <w:szCs w:val="21"/>
+        </w:rPr>
+        <w:t xml:space="preserve">Settings → prices, delivery/collection fees, deposit, tax rate, and cancellation policy.</w:t>
+      </w:r>
+    </w:p>
+    <w:p>
+      <w:pPr>
+        <w:spacing w:after="60" w:line="268"/>
+        <w:ind w:left="300"/>
+      </w:pPr>
+      <w:r>
+        <w:rPr>
+          <w:color w:val="B57A1F"/>
+          <w:sz w:val="21"/>
+          <w:szCs w:val="21"/>
+        </w:rPr>
+        <w:t xml:space="preserve">☐  </w:t>
+      </w:r>
+      <w:r>
+        <w:rPr>
+          <w:color w:val="222B30"/>
+          <w:sz w:val="21"/>
+          <w:szCs w:val="21"/>
+        </w:rPr>
+        <w:t xml:space="preserve">Settings → Tow gear &amp; add-ons → set each item's On-hand count to what you actually own (buy quality, load-rated hardware).</w:t>
+      </w:r>
+    </w:p>
+    <w:p>
+      <w:pPr>
+        <w:spacing w:after="60" w:line="268"/>
+        <w:ind w:left="300"/>
+      </w:pPr>
+      <w:r>
+        <w:rPr>
+          <w:color w:val="B57A1F"/>
+          <w:sz w:val="21"/>
+          <w:szCs w:val="21"/>
+        </w:rPr>
+        <w:t xml:space="preserve">☐  </w:t>
+      </w:r>
+      <w:r>
+        <w:rPr>
+          <w:color w:val="222B30"/>
+          <w:sz w:val="21"/>
+          <w:szCs w:val="21"/>
+        </w:rPr>
+        <w:t xml:space="preserve">Settings → Owner access → change the owner password off the demo default; add your crew and their PINs.</w:t>
+      </w:r>
+    </w:p>
+    <w:p>
+      <w:pPr>
+        <w:spacing w:after="60" w:line="268"/>
+        <w:ind w:left="300"/>
+      </w:pPr>
+      <w:r>
+        <w:rPr>
+          <w:color w:val="B57A1F"/>
+          <w:sz w:val="21"/>
+          <w:szCs w:val="21"/>
+        </w:rPr>
+        <w:t xml:space="preserve">☐  </w:t>
+      </w:r>
+      <w:r>
+        <w:rPr>
+          <w:color w:val="222B30"/>
+          <w:sz w:val="21"/>
+          <w:szCs w:val="21"/>
+        </w:rPr>
+        <w:t xml:space="preserve">Settings → your website copy, hero photo, and site mode (full site / booking-only / owner-only); point your domain at it when ready.</w:t>
+      </w:r>
+    </w:p>
+    <w:p>
+      <w:pPr>
+        <w:spacing w:after="60" w:line="268"/>
+        <w:ind w:left="300"/>
+      </w:pPr>
+      <w:r>
+        <w:rPr>
+          <w:color w:val="B57A1F"/>
+          <w:sz w:val="21"/>
+          <w:szCs w:val="21"/>
+        </w:rPr>
+        <w:t xml:space="preserve">☐  </w:t>
+      </w:r>
+      <w:r>
+        <w:rPr>
+          <w:color w:val="222B30"/>
+          <w:sz w:val="21"/>
+          <w:szCs w:val="21"/>
+        </w:rPr>
+        <w:t xml:space="preserve">Do a full test booking yourself end-to-end (book → agreement → pay → dispatch → return) before you go live.</w:t>
       </w:r>
     </w:p>
     <w:p>
@@ -824,79 +1122,38 @@
           <w:sz w:val="24"/>
           <w:szCs w:val="24"/>
         </w:rPr>
-        <w:t xml:space="preserve">Your daily routine</w:t>
-      </w:r>
-    </w:p>
-    <w:p>
-      <w:pPr>
-        <w:pStyle w:val="ListParagraph"/>
-        <w:numPr>
-          <w:ilvl w:val="0"/>
-          <w:numId w:val="3"/>
-        </w:numPr>
-        <w:spacing w:after="80" w:line="272"/>
-      </w:pPr>
-      <w:r>
-        <w:rPr>
-          <w:color w:val="222B30"/>
-          <w:sz w:val="21"/>
-          <w:szCs w:val="21"/>
-        </w:rPr>
-        <w:t xml:space="preserve">Open the </w:t>
-      </w:r>
-      <w:r>
-        <w:rPr>
-          <w:b/>
-          <w:bCs/>
-          <w:color w:val="222B30"/>
-          <w:sz w:val="21"/>
-          <w:szCs w:val="21"/>
-        </w:rPr>
-        <w:t xml:space="preserve">Dashboard</w:t>
-      </w:r>
-      <w:r>
-        <w:rPr>
-          <w:color w:val="222B30"/>
-          <w:sz w:val="21"/>
-          <w:szCs w:val="21"/>
-        </w:rPr>
-        <w:t xml:space="preserve"> first. The “Start here” box lists everything needing you today, named and color-ranked: red = urgent, amber = today, blue = money &amp; housekeeping.</w:t>
-      </w:r>
-    </w:p>
-    <w:p>
-      <w:pPr>
-        <w:pStyle w:val="ListParagraph"/>
-        <w:numPr>
-          <w:ilvl w:val="0"/>
-          <w:numId w:val="3"/>
-        </w:numPr>
-        <w:spacing w:after="80" w:line="272"/>
-      </w:pPr>
-      <w:r>
-        <w:rPr>
-          <w:color w:val="222B30"/>
-          <w:sz w:val="21"/>
-          <w:szCs w:val="21"/>
-        </w:rPr>
-        <w:t xml:space="preserve">Clear the list: mark today's pickups out and returns back; chase any red items (overdue, unsigned agreement, expired COI, a delivery/collection within 3 days with no driver).</w:t>
-      </w:r>
-    </w:p>
-    <w:p>
-      <w:pPr>
-        <w:pStyle w:val="ListParagraph"/>
-        <w:numPr>
-          <w:ilvl w:val="0"/>
-          <w:numId w:val="3"/>
-        </w:numPr>
-        <w:spacing w:after="80" w:line="272"/>
-      </w:pPr>
-      <w:r>
-        <w:rPr>
-          <w:color w:val="222B30"/>
-          <w:sz w:val="21"/>
-          <w:szCs w:val="21"/>
-        </w:rPr>
-        <w:t xml:space="preserve">Everything updates live across your devices and your crew's.</w:t>
+        <w:t xml:space="preserve">The one idea worth understanding: two legs</w:t>
+      </w:r>
+    </w:p>
+    <w:p>
+      <w:pPr>
+        <w:spacing w:after="120" w:line="278"/>
+      </w:pPr>
+      <w:r>
+        <w:rPr>
+          <w:color w:val="222B30"/>
+          <w:sz w:val="21"/>
+          <w:szCs w:val="21"/>
+        </w:rPr>
+        <w:t xml:space="preserve">Every rental is </w:t>
+      </w:r>
+      <w:r>
+        <w:rPr>
+          <w:b/>
+          <w:bCs/>
+          <w:color w:val="222B30"/>
+          <w:sz w:val="21"/>
+          <w:szCs w:val="21"/>
+        </w:rPr>
+        <w:t xml:space="preserve">two separate trips</w:t>
+      </w:r>
+      <w:r>
+        <w:rPr>
+          <w:color w:val="222B30"/>
+          <w:sz w:val="21"/>
+          <w:szCs w:val="21"/>
+        </w:rPr>
+        <w:t xml:space="preserve"> — the OUT leg (getting the trailer to the customer) and the RETURN leg (getting it back). Each is scheduled on its own, so a month-long rental never ties up a driver for a month. Each leg is either self-serve (customer picks up / drops off at your yard — needs nobody) or you handle it (delivery / collection — needs a driver).</w:t>
       </w:r>
     </w:p>
     <w:p>
@@ -912,18 +1169,26 @@
           <w:sz w:val="24"/>
           <w:szCs w:val="24"/>
         </w:rPr>
-        <w:t xml:space="preserve">Every screen</w:t>
-      </w:r>
-    </w:p>
-    <w:p>
-      <w:pPr>
-        <w:pStyle w:val="ListParagraph"/>
-        <w:numPr>
-          <w:ilvl w:val="0"/>
-          <w:numId w:val="2"/>
-        </w:numPr>
-        <w:spacing w:after="70" w:line="272"/>
-      </w:pPr>
+        <w:t xml:space="preserve">Your daily routine</w:t>
+      </w:r>
+    </w:p>
+    <w:p>
+      <w:pPr>
+        <w:pStyle w:val="ListParagraph"/>
+        <w:numPr>
+          <w:ilvl w:val="0"/>
+          <w:numId w:val="3"/>
+        </w:numPr>
+        <w:spacing w:after="80" w:line="272"/>
+      </w:pPr>
+      <w:r>
+        <w:rPr>
+          <w:color w:val="222B30"/>
+          <w:sz w:val="21"/>
+          <w:szCs w:val="21"/>
+        </w:rPr>
+        <w:t xml:space="preserve">Open the </w:t>
+      </w:r>
       <w:r>
         <w:rPr>
           <w:b/>
@@ -940,175 +1205,43 @@
           <w:sz w:val="21"/>
           <w:szCs w:val="21"/>
         </w:rPr>
-        <w:t xml:space="preserve"> — today's work + the Start-here checklist + at-a-glance tiles.</w:t>
-      </w:r>
-    </w:p>
-    <w:p>
-      <w:pPr>
-        <w:pStyle w:val="ListParagraph"/>
-        <w:numPr>
-          <w:ilvl w:val="0"/>
-          <w:numId w:val="2"/>
-        </w:numPr>
-        <w:spacing w:after="70" w:line="272"/>
-      </w:pPr>
-      <w:r>
-        <w:rPr>
-          <w:b/>
-          <w:bCs/>
-          <w:color w:val="222B30"/>
-          <w:sz w:val="21"/>
-          <w:szCs w:val="21"/>
-        </w:rPr>
-        <w:t xml:space="preserve">Calendar / Bookings</w:t>
-      </w:r>
-      <w:r>
-        <w:rPr>
-          <w:color w:val="222B30"/>
-          <w:sz w:val="21"/>
-          <w:szCs w:val="21"/>
-        </w:rPr>
-        <w:t xml:space="preserve"> — the schedule and every reservation.</w:t>
-      </w:r>
-    </w:p>
-    <w:p>
-      <w:pPr>
-        <w:pStyle w:val="ListParagraph"/>
-        <w:numPr>
-          <w:ilvl w:val="0"/>
-          <w:numId w:val="2"/>
-        </w:numPr>
-        <w:spacing w:after="70" w:line="272"/>
-      </w:pPr>
-      <w:r>
-        <w:rPr>
-          <w:b/>
-          <w:bCs/>
-          <w:color w:val="222B30"/>
-          <w:sz w:val="21"/>
-          <w:szCs w:val="21"/>
-        </w:rPr>
-        <w:t xml:space="preserve">Customers</w:t>
-      </w:r>
-      <w:r>
-        <w:rPr>
-          <w:color w:val="222B30"/>
-          <w:sz w:val="21"/>
-          <w:szCs w:val="21"/>
-        </w:rPr>
-        <w:t xml:space="preserve"> — who's rented, repeat rate, per-customer rebooking reminders.</w:t>
-      </w:r>
-    </w:p>
-    <w:p>
-      <w:pPr>
-        <w:pStyle w:val="ListParagraph"/>
-        <w:numPr>
-          <w:ilvl w:val="0"/>
-          <w:numId w:val="2"/>
-        </w:numPr>
-        <w:spacing w:after="70" w:line="272"/>
-      </w:pPr>
-      <w:r>
-        <w:rPr>
-          <w:b/>
-          <w:bCs/>
-          <w:color w:val="222B30"/>
-          <w:sz w:val="21"/>
-          <w:szCs w:val="21"/>
-        </w:rPr>
-        <w:t xml:space="preserve">Team &amp; dispatch</w:t>
-      </w:r>
-      <w:r>
-        <w:rPr>
-          <w:color w:val="222B30"/>
-          <w:sz w:val="21"/>
-          <w:szCs w:val="21"/>
-        </w:rPr>
-        <w:t xml:space="preserve"> — assign jobs, set crew hours/roles/PINs, run payroll.</w:t>
-      </w:r>
-    </w:p>
-    <w:p>
-      <w:pPr>
-        <w:pStyle w:val="ListParagraph"/>
-        <w:numPr>
-          <w:ilvl w:val="0"/>
-          <w:numId w:val="2"/>
-        </w:numPr>
-        <w:spacing w:after="70" w:line="272"/>
-      </w:pPr>
-      <w:r>
-        <w:rPr>
-          <w:b/>
-          <w:bCs/>
-          <w:color w:val="222B30"/>
-          <w:sz w:val="21"/>
-          <w:szCs w:val="21"/>
-        </w:rPr>
-        <w:t xml:space="preserve">Fleet</w:t>
-      </w:r>
-      <w:r>
-        <w:rPr>
-          <w:color w:val="222B30"/>
-          <w:sz w:val="21"/>
-          <w:szCs w:val="21"/>
-        </w:rPr>
-        <w:t xml:space="preserve"> — every unit and its status; maintenance in/out.</w:t>
-      </w:r>
-    </w:p>
-    <w:p>
-      <w:pPr>
-        <w:pStyle w:val="ListParagraph"/>
-        <w:numPr>
-          <w:ilvl w:val="0"/>
-          <w:numId w:val="2"/>
-        </w:numPr>
-        <w:spacing w:after="70" w:line="272"/>
-      </w:pPr>
-      <w:r>
-        <w:rPr>
-          <w:b/>
-          <w:bCs/>
-          <w:color w:val="222B30"/>
-          <w:sz w:val="21"/>
-          <w:szCs w:val="21"/>
-        </w:rPr>
-        <w:t xml:space="preserve">Insights</w:t>
-      </w:r>
-      <w:r>
-        <w:rPr>
-          <w:color w:val="222B30"/>
-          <w:sz w:val="21"/>
-          <w:szCs w:val="21"/>
-        </w:rPr>
-        <w:t xml:space="preserve"> — revenue, utilization, and ROI per unit.</w:t>
-      </w:r>
-    </w:p>
-    <w:p>
-      <w:pPr>
-        <w:pStyle w:val="ListParagraph"/>
-        <w:numPr>
-          <w:ilvl w:val="0"/>
-          <w:numId w:val="2"/>
-        </w:numPr>
-        <w:spacing w:after="70" w:line="272"/>
-      </w:pPr>
-      <w:r>
-        <w:rPr>
-          <w:b/>
-          <w:bCs/>
-          <w:color w:val="222B30"/>
-          <w:sz w:val="21"/>
-          <w:szCs w:val="21"/>
-        </w:rPr>
-        <w:t xml:space="preserve">Settings</w:t>
-      </w:r>
-      <w:r>
-        <w:rPr>
-          <w:color w:val="222B30"/>
-          <w:sz w:val="21"/>
-          <w:szCs w:val="21"/>
-        </w:rPr>
-        <w:t xml:space="preserve"> — everything below.</w:t>
+        <w:t xml:space="preserve"> first. The “Start here” box lists everything needing you today, named and color-ranked: red = urgent, amber = today, blue = money &amp; housekeeping.</w:t>
+      </w:r>
+    </w:p>
+    <w:p>
+      <w:pPr>
+        <w:pStyle w:val="ListParagraph"/>
+        <w:numPr>
+          <w:ilvl w:val="0"/>
+          <w:numId w:val="3"/>
+        </w:numPr>
+        <w:spacing w:after="80" w:line="272"/>
+      </w:pPr>
+      <w:r>
+        <w:rPr>
+          <w:color w:val="222B30"/>
+          <w:sz w:val="21"/>
+          <w:szCs w:val="21"/>
+        </w:rPr>
+        <w:t xml:space="preserve">Clear the list: mark today's pickups out and returns back; chase any red items (overdue, unsigned agreement, expired COI, a delivery/collection within 3 days with no driver).</w:t>
+      </w:r>
+    </w:p>
+    <w:p>
+      <w:pPr>
+        <w:pStyle w:val="ListParagraph"/>
+        <w:numPr>
+          <w:ilvl w:val="0"/>
+          <w:numId w:val="3"/>
+        </w:numPr>
+        <w:spacing w:after="80" w:line="272"/>
+      </w:pPr>
+      <w:r>
+        <w:rPr>
+          <w:color w:val="222B30"/>
+          <w:sz w:val="21"/>
+          <w:szCs w:val="21"/>
+        </w:rPr>
+        <w:t xml:space="preserve">Everything updates live across your devices and your crew's.</w:t>
       </w:r>
     </w:p>
     <w:p>
@@ -1124,122 +1257,203 @@
           <w:sz w:val="24"/>
           <w:szCs w:val="24"/>
         </w:rPr>
-        <w:t xml:space="preserve">Your crew — positions, hours &amp; private sign-ins</w:t>
-      </w:r>
-    </w:p>
-    <w:p>
-      <w:pPr>
-        <w:spacing w:after="120" w:line="278"/>
-      </w:pPr>
-      <w:r>
-        <w:rPr>
-          <w:b/>
-          <w:bCs/>
-          <w:color w:val="222B30"/>
-          <w:sz w:val="21"/>
-          <w:szCs w:val="21"/>
-        </w:rPr>
-        <w:t xml:space="preserve">Positions (roles): </w:t>
-      </w:r>
-      <w:r>
-        <w:rPr>
-          <w:color w:val="222B30"/>
-          <w:sz w:val="21"/>
-          <w:szCs w:val="21"/>
-        </w:rPr>
-        <w:t xml:space="preserve">in Settings → Job roles, make your own roles and set what each can do — Delivery (drives) and/or Yard (counter handoffs). A role with neither (Mechanic, Manager) is never dispatched but is still a normal scheduled, paid employee.</w:t>
-      </w:r>
-    </w:p>
-    <w:p>
-      <w:pPr>
-        <w:spacing w:after="120" w:line="278"/>
-      </w:pPr>
-      <w:r>
-        <w:rPr>
-          <w:b/>
-          <w:bCs/>
-          <w:color w:val="222B30"/>
-          <w:sz w:val="21"/>
-          <w:szCs w:val="21"/>
-        </w:rPr>
-        <w:t xml:space="preserve">Hours &amp; the repeating week: </w:t>
-      </w:r>
-      <w:r>
-        <w:rPr>
-          <w:color w:val="222B30"/>
-          <w:sz w:val="21"/>
-          <w:szCs w:val="21"/>
-        </w:rPr>
-        <w:t xml:space="preserve">tap a person's name in Team &amp; dispatch to set their repeating week once (e.g. Mon–Fri 7–4); it fills every week automatically. Tap any single day to override. In Settings → Who sets work hours, choose workers set their own / you set it / either.</w:t>
-      </w:r>
-    </w:p>
-    <w:p>
-      <w:pPr>
-        <w:spacing w:after="120" w:line="278"/>
-      </w:pPr>
-      <w:r>
-        <w:rPr>
-          <w:b/>
-          <w:bCs/>
-          <w:color w:val="222B30"/>
-          <w:sz w:val="21"/>
-          <w:szCs w:val="21"/>
-        </w:rPr>
-        <w:t xml:space="preserve">Only book when someone's working: </w:t>
-      </w:r>
-      <w:r>
-        <w:rPr>
-          <w:color w:val="222B30"/>
-          <w:sz w:val="21"/>
-          <w:szCs w:val="21"/>
-        </w:rPr>
-        <w:t xml:space="preserve">in Settings → When customers can book delivery &amp; pickup, pick Only when we're staffed / Strict up close, flexible further out (default) / Take it now, staff it later. Self drop-off never needs anyone. “How far ahead you take bookings” sets the furthest out a customer can book.</w:t>
-      </w:r>
-    </w:p>
-    <w:p>
-      <w:pPr>
-        <w:spacing w:after="120" w:line="278"/>
-      </w:pPr>
-      <w:r>
-        <w:rPr>
-          <w:b/>
-          <w:bCs/>
-          <w:color w:val="222B30"/>
-          <w:sz w:val="21"/>
-          <w:szCs w:val="21"/>
-        </w:rPr>
-        <w:t xml:space="preserve">Assigning: </w:t>
-      </w:r>
-      <w:r>
-        <w:rPr>
-          <w:color w:val="222B30"/>
-          <w:sz w:val="21"/>
-          <w:szCs w:val="21"/>
-        </w:rPr>
-        <w:t xml:space="preserve">jobs auto-assign to an available, qualified person (or press Auto-assign all); reassign by hand anytime. “Sick today” hands off someone's day; anything within 3 days with no one assigned turns red on your dashboard.</w:t>
-      </w:r>
-    </w:p>
-    <w:p>
-      <w:pPr>
-        <w:spacing w:after="120" w:line="278"/>
-      </w:pPr>
-      <w:r>
-        <w:rPr>
-          <w:b/>
-          <w:bCs/>
-          <w:color w:val="222B30"/>
-          <w:sz w:val="21"/>
-          <w:szCs w:val="21"/>
-        </w:rPr>
-        <w:t xml:space="preserve">Private sign-ins: </w:t>
-      </w:r>
-      <w:r>
-        <w:rPr>
-          <w:color w:val="222B30"/>
-          <w:sz w:val="21"/>
-          <w:szCs w:val="21"/>
-        </w:rPr>
-        <w:t xml:space="preserve">each crew member signs in on your public site (Team sign-in) with their phone/email + their own personal PIN (you set it on their card). They see only their own jobs, hours &amp; pay — never your dashboard, another person's schedule, your customers, or the money.</w:t>
+        <w:t xml:space="preserve">Every screen</w:t>
+      </w:r>
+    </w:p>
+    <w:p>
+      <w:pPr>
+        <w:pStyle w:val="ListParagraph"/>
+        <w:numPr>
+          <w:ilvl w:val="0"/>
+          <w:numId w:val="2"/>
+        </w:numPr>
+        <w:spacing w:after="70" w:line="272"/>
+      </w:pPr>
+      <w:r>
+        <w:rPr>
+          <w:b/>
+          <w:bCs/>
+          <w:color w:val="222B30"/>
+          <w:sz w:val="21"/>
+          <w:szCs w:val="21"/>
+        </w:rPr>
+        <w:t xml:space="preserve">Dashboard</w:t>
+      </w:r>
+      <w:r>
+        <w:rPr>
+          <w:color w:val="222B30"/>
+          <w:sz w:val="21"/>
+          <w:szCs w:val="21"/>
+        </w:rPr>
+        <w:t xml:space="preserve"> — today's work + the Start-here checklist + at-a-glance tiles.</w:t>
+      </w:r>
+    </w:p>
+    <w:p>
+      <w:pPr>
+        <w:pStyle w:val="ListParagraph"/>
+        <w:numPr>
+          <w:ilvl w:val="0"/>
+          <w:numId w:val="2"/>
+        </w:numPr>
+        <w:spacing w:after="70" w:line="272"/>
+      </w:pPr>
+      <w:r>
+        <w:rPr>
+          <w:b/>
+          <w:bCs/>
+          <w:color w:val="222B30"/>
+          <w:sz w:val="21"/>
+          <w:szCs w:val="21"/>
+        </w:rPr>
+        <w:t xml:space="preserve">Calendar / Bookings</w:t>
+      </w:r>
+      <w:r>
+        <w:rPr>
+          <w:color w:val="222B30"/>
+          <w:sz w:val="21"/>
+          <w:szCs w:val="21"/>
+        </w:rPr>
+        <w:t xml:space="preserve"> — the schedule and every reservation.</w:t>
+      </w:r>
+    </w:p>
+    <w:p>
+      <w:pPr>
+        <w:pStyle w:val="ListParagraph"/>
+        <w:numPr>
+          <w:ilvl w:val="0"/>
+          <w:numId w:val="2"/>
+        </w:numPr>
+        <w:spacing w:after="70" w:line="272"/>
+      </w:pPr>
+      <w:r>
+        <w:rPr>
+          <w:b/>
+          <w:bCs/>
+          <w:color w:val="222B30"/>
+          <w:sz w:val="21"/>
+          <w:szCs w:val="21"/>
+        </w:rPr>
+        <w:t xml:space="preserve">Customers</w:t>
+      </w:r>
+      <w:r>
+        <w:rPr>
+          <w:color w:val="222B30"/>
+          <w:sz w:val="21"/>
+          <w:szCs w:val="21"/>
+        </w:rPr>
+        <w:t xml:space="preserve"> — who's rented, repeat rate, per-customer rebooking reminders.</w:t>
+      </w:r>
+    </w:p>
+    <w:p>
+      <w:pPr>
+        <w:pStyle w:val="ListParagraph"/>
+        <w:numPr>
+          <w:ilvl w:val="0"/>
+          <w:numId w:val="2"/>
+        </w:numPr>
+        <w:spacing w:after="70" w:line="272"/>
+      </w:pPr>
+      <w:r>
+        <w:rPr>
+          <w:b/>
+          <w:bCs/>
+          <w:color w:val="222B30"/>
+          <w:sz w:val="21"/>
+          <w:szCs w:val="21"/>
+        </w:rPr>
+        <w:t xml:space="preserve">Team &amp; dispatch</w:t>
+      </w:r>
+      <w:r>
+        <w:rPr>
+          <w:color w:val="222B30"/>
+          <w:sz w:val="21"/>
+          <w:szCs w:val="21"/>
+        </w:rPr>
+        <w:t xml:space="preserve"> — assign jobs, set crew hours/roles/PINs, run payroll.</w:t>
+      </w:r>
+    </w:p>
+    <w:p>
+      <w:pPr>
+        <w:pStyle w:val="ListParagraph"/>
+        <w:numPr>
+          <w:ilvl w:val="0"/>
+          <w:numId w:val="2"/>
+        </w:numPr>
+        <w:spacing w:after="70" w:line="272"/>
+      </w:pPr>
+      <w:r>
+        <w:rPr>
+          <w:b/>
+          <w:bCs/>
+          <w:color w:val="222B30"/>
+          <w:sz w:val="21"/>
+          <w:szCs w:val="21"/>
+        </w:rPr>
+        <w:t xml:space="preserve">Fleet</w:t>
+      </w:r>
+      <w:r>
+        <w:rPr>
+          <w:color w:val="222B30"/>
+          <w:sz w:val="21"/>
+          <w:szCs w:val="21"/>
+        </w:rPr>
+        <w:t xml:space="preserve"> — every unit and its status; maintenance in/out.</w:t>
+      </w:r>
+    </w:p>
+    <w:p>
+      <w:pPr>
+        <w:pStyle w:val="ListParagraph"/>
+        <w:numPr>
+          <w:ilvl w:val="0"/>
+          <w:numId w:val="2"/>
+        </w:numPr>
+        <w:spacing w:after="70" w:line="272"/>
+      </w:pPr>
+      <w:r>
+        <w:rPr>
+          <w:b/>
+          <w:bCs/>
+          <w:color w:val="222B30"/>
+          <w:sz w:val="21"/>
+          <w:szCs w:val="21"/>
+        </w:rPr>
+        <w:t xml:space="preserve">Insights</w:t>
+      </w:r>
+      <w:r>
+        <w:rPr>
+          <w:color w:val="222B30"/>
+          <w:sz w:val="21"/>
+          <w:szCs w:val="21"/>
+        </w:rPr>
+        <w:t xml:space="preserve"> — revenue, utilization, and ROI per unit.</w:t>
+      </w:r>
+    </w:p>
+    <w:p>
+      <w:pPr>
+        <w:pStyle w:val="ListParagraph"/>
+        <w:numPr>
+          <w:ilvl w:val="0"/>
+          <w:numId w:val="2"/>
+        </w:numPr>
+        <w:spacing w:after="70" w:line="272"/>
+      </w:pPr>
+      <w:r>
+        <w:rPr>
+          <w:b/>
+          <w:bCs/>
+          <w:color w:val="222B30"/>
+          <w:sz w:val="21"/>
+          <w:szCs w:val="21"/>
+        </w:rPr>
+        <w:t xml:space="preserve">Settings</w:t>
+      </w:r>
+      <w:r>
+        <w:rPr>
+          <w:color w:val="222B30"/>
+          <w:sz w:val="21"/>
+          <w:szCs w:val="21"/>
+        </w:rPr>
+        <w:t xml:space="preserve"> — everything below.</w:t>
       </w:r>
     </w:p>
     <w:p>
@@ -1255,7 +1469,7 @@
           <w:sz w:val="24"/>
           <w:szCs w:val="24"/>
         </w:rPr>
-        <w:t xml:space="preserve">Your website &amp; getting found on Google</w:t>
+        <w:t xml:space="preserve">Your crew — positions, hours &amp; private sign-ins</w:t>
       </w:r>
     </w:p>
     <w:p>
@@ -1270,15 +1484,15 @@
           <w:sz w:val="21"/>
           <w:szCs w:val="21"/>
         </w:rPr>
-        <w:t xml:space="preserve">Three site modes</w:t>
-      </w:r>
-      <w:r>
-        <w:rPr>
-          <w:color w:val="222B30"/>
-          <w:sz w:val="21"/>
-          <w:szCs w:val="21"/>
-        </w:rPr>
-        <w:t xml:space="preserve"> (Settings → Your website): Full site (complete hosted page + booking), Booking only (equipment + booking to link from your own site), Owner-only (no public page; you take bookings yourself). Every word + the hero image are editable; it wears your logo &amp; colors.</w:t>
+        <w:t xml:space="preserve">Positions (roles): </w:t>
+      </w:r>
+      <w:r>
+        <w:rPr>
+          <w:color w:val="222B30"/>
+          <w:sz w:val="21"/>
+          <w:szCs w:val="21"/>
+        </w:rPr>
+        <w:t xml:space="preserve">in Settings → Job roles, make your own roles and set what each can do — Delivery (drives) and/or Yard (counter handoffs). A role with neither (Mechanic, Manager) is never dispatched but is still a normal scheduled, paid employee.</w:t>
       </w:r>
     </w:p>
     <w:p>
@@ -1293,15 +1507,15 @@
           <w:sz w:val="21"/>
           <w:szCs w:val="21"/>
         </w:rPr>
-        <w:t xml:space="preserve">Link or embed: </w:t>
-      </w:r>
-      <w:r>
-        <w:rPr>
-          <w:color w:val="222B30"/>
-          <w:sz w:val="21"/>
-          <w:szCs w:val="21"/>
-        </w:rPr>
-        <w:t xml:space="preserve">copy a link (“Book now” button) or an embed snippet (booking shows up inside your own website). Either way it's brand-themed and bookings land in your dashboard.</w:t>
+        <w:t xml:space="preserve">Hours &amp; the repeating week: </w:t>
+      </w:r>
+      <w:r>
+        <w:rPr>
+          <w:color w:val="222B30"/>
+          <w:sz w:val="21"/>
+          <w:szCs w:val="21"/>
+        </w:rPr>
+        <w:t xml:space="preserve">tap a person's name in Team &amp; dispatch to set their repeating week once (e.g. Mon–Fri 7–4); it fills every week automatically. Tap any single day to override. In Settings → Who sets work hours, choose workers set their own / you set it / either.</w:t>
       </w:r>
     </w:p>
     <w:p>
@@ -1316,139 +1530,61 @@
           <w:sz w:val="21"/>
           <w:szCs w:val="21"/>
         </w:rPr>
-        <w:t xml:space="preserve">SEO: </w:t>
-      </w:r>
-      <w:r>
-        <w:rPr>
-          <w:color w:val="222B30"/>
-          <w:sz w:val="21"/>
-          <w:szCs w:val="21"/>
-        </w:rPr>
-        <w:t xml:space="preserve">in Settings → Get found on Google, fill in page title, description, and keywords (each pre-filled with a smart suggestion) — they become your real Google listing. Then work the checklist:</w:t>
-      </w:r>
-    </w:p>
-    <w:p>
-      <w:pPr>
-        <w:pStyle w:val="ListParagraph"/>
-        <w:numPr>
-          <w:ilvl w:val="0"/>
-          <w:numId w:val="2"/>
-        </w:numPr>
-        <w:spacing w:after="70" w:line="272"/>
-      </w:pPr>
-      <w:r>
-        <w:rPr>
-          <w:b/>
-          <w:bCs/>
-          <w:color w:val="222B30"/>
-          <w:sz w:val="21"/>
-          <w:szCs w:val="21"/>
-        </w:rPr>
-        <w:t xml:space="preserve">Set up a free Google Business Profile </w:t>
-      </w:r>
-      <w:r>
-        <w:rPr>
-          <w:color w:val="222B30"/>
-          <w:sz w:val="21"/>
-          <w:szCs w:val="21"/>
-        </w:rPr>
-        <w:t xml:space="preserve">(google.com/business) — the #1 thing for Google Maps &amp; local results.</w:t>
-      </w:r>
-    </w:p>
-    <w:p>
-      <w:pPr>
-        <w:pStyle w:val="ListParagraph"/>
-        <w:numPr>
-          <w:ilvl w:val="0"/>
-          <w:numId w:val="2"/>
-        </w:numPr>
-        <w:spacing w:after="70" w:line="272"/>
-      </w:pPr>
-      <w:r>
-        <w:rPr>
-          <w:b/>
-          <w:bCs/>
-          <w:color w:val="222B30"/>
-          <w:sz w:val="21"/>
-          <w:szCs w:val="21"/>
-        </w:rPr>
-        <w:t xml:space="preserve">Ask every happy customer for a Google review.</w:t>
-      </w:r>
-    </w:p>
-    <w:p>
-      <w:pPr>
-        <w:pStyle w:val="ListParagraph"/>
-        <w:numPr>
-          <w:ilvl w:val="0"/>
-          <w:numId w:val="2"/>
-        </w:numPr>
-        <w:spacing w:after="70" w:line="272"/>
-      </w:pPr>
-      <w:r>
-        <w:rPr>
-          <w:b/>
-          <w:bCs/>
-          <w:color w:val="222B30"/>
-          <w:sz w:val="21"/>
-          <w:szCs w:val="21"/>
-        </w:rPr>
-        <w:t xml:space="preserve">Use your city + what you rent </w:t>
-      </w:r>
-      <w:r>
-        <w:rPr>
-          <w:color w:val="222B30"/>
-          <w:sz w:val="21"/>
-          <w:szCs w:val="21"/>
-        </w:rPr>
-        <w:t xml:space="preserve">in your title, description, and headline.</w:t>
-      </w:r>
-    </w:p>
-    <w:p>
-      <w:pPr>
-        <w:pStyle w:val="ListParagraph"/>
-        <w:numPr>
-          <w:ilvl w:val="0"/>
-          <w:numId w:val="2"/>
-        </w:numPr>
-        <w:spacing w:after="70" w:line="272"/>
-      </w:pPr>
-      <w:r>
-        <w:rPr>
-          <w:b/>
-          <w:bCs/>
-          <w:color w:val="222B30"/>
-          <w:sz w:val="21"/>
-          <w:szCs w:val="21"/>
-        </w:rPr>
-        <w:t xml:space="preserve">Connect your own domain name.</w:t>
-      </w:r>
-    </w:p>
-    <w:p>
-      <w:pPr>
-        <w:pStyle w:val="ListParagraph"/>
-        <w:numPr>
-          <w:ilvl w:val="0"/>
-          <w:numId w:val="2"/>
-        </w:numPr>
-        <w:spacing w:after="70" w:line="272"/>
-      </w:pPr>
-      <w:r>
-        <w:rPr>
-          <w:b/>
-          <w:bCs/>
-          <w:color w:val="222B30"/>
-          <w:sz w:val="21"/>
-          <w:szCs w:val="21"/>
-        </w:rPr>
-        <w:t xml:space="preserve">List your business in a few local directories </w:t>
-      </w:r>
-      <w:r>
-        <w:rPr>
-          <w:color w:val="222B30"/>
-          <w:sz w:val="21"/>
-          <w:szCs w:val="21"/>
-        </w:rPr>
-        <w:t xml:space="preserve">(Yelp, Bing Places).</w:t>
+        <w:t xml:space="preserve">Only book when someone's working: </w:t>
+      </w:r>
+      <w:r>
+        <w:rPr>
+          <w:color w:val="222B30"/>
+          <w:sz w:val="21"/>
+          <w:szCs w:val="21"/>
+        </w:rPr>
+        <w:t xml:space="preserve">in Settings → When customers can book delivery &amp; pickup, pick Only when we're staffed / Strict up close, flexible further out (default) / Take it now, staff it later. Self drop-off never needs anyone. “How far ahead you take bookings” sets the furthest out a customer can book.</w:t>
+      </w:r>
+    </w:p>
+    <w:p>
+      <w:pPr>
+        <w:spacing w:after="120" w:line="278"/>
+      </w:pPr>
+      <w:r>
+        <w:rPr>
+          <w:b/>
+          <w:bCs/>
+          <w:color w:val="222B30"/>
+          <w:sz w:val="21"/>
+          <w:szCs w:val="21"/>
+        </w:rPr>
+        <w:t xml:space="preserve">Assigning: </w:t>
+      </w:r>
+      <w:r>
+        <w:rPr>
+          <w:color w:val="222B30"/>
+          <w:sz w:val="21"/>
+          <w:szCs w:val="21"/>
+        </w:rPr>
+        <w:t xml:space="preserve">jobs auto-assign to an available, qualified person (or press Auto-assign all); reassign by hand anytime. “Sick today” hands off someone's day; anything within 3 days with no one assigned turns red on your dashboard.</w:t>
+      </w:r>
+    </w:p>
+    <w:p>
+      <w:pPr>
+        <w:spacing w:after="120" w:line="278"/>
+      </w:pPr>
+      <w:r>
+        <w:rPr>
+          <w:b/>
+          <w:bCs/>
+          <w:color w:val="222B30"/>
+          <w:sz w:val="21"/>
+          <w:szCs w:val="21"/>
+        </w:rPr>
+        <w:t xml:space="preserve">Private sign-ins: </w:t>
+      </w:r>
+      <w:r>
+        <w:rPr>
+          <w:color w:val="222B30"/>
+          <w:sz w:val="21"/>
+          <w:szCs w:val="21"/>
+        </w:rPr>
+        <w:t xml:space="preserve">each crew member signs in on your public site (Team sign-in) with their phone/email + their own personal PIN (you set it on their card). They see only their own jobs, hours &amp; pay — never your dashboard, another person's schedule, your customers, or the money.</w:t>
       </w:r>
     </w:p>
     <w:p>
@@ -1464,7 +1600,7 @@
           <w:sz w:val="24"/>
           <w:szCs w:val="24"/>
         </w:rPr>
-        <w:t xml:space="preserve">How the money works</w:t>
+        <w:t xml:space="preserve">Your website &amp; getting found on Google</w:t>
       </w:r>
     </w:p>
     <w:p>
@@ -1473,11 +1609,191 @@
       </w:pPr>
       <w:r>
         <w:rPr>
-          <w:color w:val="222B30"/>
-          <w:sz w:val="21"/>
-          <w:szCs w:val="21"/>
-        </w:rPr>
-        <w:t xml:space="preserve">Per-unit daily/weekly/2-week/monthly rates; delivery/self-pickup fees; a refundable deposit hold (not a charge); optional damage waiver; sales tax; cancellation rules. Crew pay: choose their tax status (1099/W2) and how you pay (per-job / hourly / salary), any mix; payroll views total what's owed with a Pay/Mark-paid button.</w:t>
+          <w:b/>
+          <w:bCs/>
+          <w:color w:val="222B30"/>
+          <w:sz w:val="21"/>
+          <w:szCs w:val="21"/>
+        </w:rPr>
+        <w:t xml:space="preserve">Three site modes</w:t>
+      </w:r>
+      <w:r>
+        <w:rPr>
+          <w:color w:val="222B30"/>
+          <w:sz w:val="21"/>
+          <w:szCs w:val="21"/>
+        </w:rPr>
+        <w:t xml:space="preserve"> (Settings → Your website): Full site (complete hosted page + booking), Booking only (equipment + booking to link from your own site), Owner-only (no public page; you take bookings yourself). Every word + the hero image are editable; it wears your logo &amp; colors.</w:t>
+      </w:r>
+    </w:p>
+    <w:p>
+      <w:pPr>
+        <w:spacing w:after="120" w:line="278"/>
+      </w:pPr>
+      <w:r>
+        <w:rPr>
+          <w:b/>
+          <w:bCs/>
+          <w:color w:val="222B30"/>
+          <w:sz w:val="21"/>
+          <w:szCs w:val="21"/>
+        </w:rPr>
+        <w:t xml:space="preserve">Link or embed: </w:t>
+      </w:r>
+      <w:r>
+        <w:rPr>
+          <w:color w:val="222B30"/>
+          <w:sz w:val="21"/>
+          <w:szCs w:val="21"/>
+        </w:rPr>
+        <w:t xml:space="preserve">copy a link (“Book now” button) or an embed snippet (booking shows up inside your own website). Either way it's brand-themed and bookings land in your dashboard.</w:t>
+      </w:r>
+    </w:p>
+    <w:p>
+      <w:pPr>
+        <w:spacing w:after="120" w:line="278"/>
+      </w:pPr>
+      <w:r>
+        <w:rPr>
+          <w:b/>
+          <w:bCs/>
+          <w:color w:val="222B30"/>
+          <w:sz w:val="21"/>
+          <w:szCs w:val="21"/>
+        </w:rPr>
+        <w:t xml:space="preserve">SEO: </w:t>
+      </w:r>
+      <w:r>
+        <w:rPr>
+          <w:color w:val="222B30"/>
+          <w:sz w:val="21"/>
+          <w:szCs w:val="21"/>
+        </w:rPr>
+        <w:t xml:space="preserve">in Settings → Get found on Google, fill in page title, description, and keywords (each pre-filled with a smart suggestion) — they become your real Google listing. Then work the checklist:</w:t>
+      </w:r>
+    </w:p>
+    <w:p>
+      <w:pPr>
+        <w:pStyle w:val="ListParagraph"/>
+        <w:numPr>
+          <w:ilvl w:val="0"/>
+          <w:numId w:val="2"/>
+        </w:numPr>
+        <w:spacing w:after="70" w:line="272"/>
+      </w:pPr>
+      <w:r>
+        <w:rPr>
+          <w:b/>
+          <w:bCs/>
+          <w:color w:val="222B30"/>
+          <w:sz w:val="21"/>
+          <w:szCs w:val="21"/>
+        </w:rPr>
+        <w:t xml:space="preserve">Set up a free Google Business Profile </w:t>
+      </w:r>
+      <w:r>
+        <w:rPr>
+          <w:color w:val="222B30"/>
+          <w:sz w:val="21"/>
+          <w:szCs w:val="21"/>
+        </w:rPr>
+        <w:t xml:space="preserve">(google.com/business) — the #1 thing for Google Maps &amp; local results.</w:t>
+      </w:r>
+    </w:p>
+    <w:p>
+      <w:pPr>
+        <w:pStyle w:val="ListParagraph"/>
+        <w:numPr>
+          <w:ilvl w:val="0"/>
+          <w:numId w:val="2"/>
+        </w:numPr>
+        <w:spacing w:after="70" w:line="272"/>
+      </w:pPr>
+      <w:r>
+        <w:rPr>
+          <w:b/>
+          <w:bCs/>
+          <w:color w:val="222B30"/>
+          <w:sz w:val="21"/>
+          <w:szCs w:val="21"/>
+        </w:rPr>
+        <w:t xml:space="preserve">Ask every happy customer for a Google review.</w:t>
+      </w:r>
+    </w:p>
+    <w:p>
+      <w:pPr>
+        <w:pStyle w:val="ListParagraph"/>
+        <w:numPr>
+          <w:ilvl w:val="0"/>
+          <w:numId w:val="2"/>
+        </w:numPr>
+        <w:spacing w:after="70" w:line="272"/>
+      </w:pPr>
+      <w:r>
+        <w:rPr>
+          <w:b/>
+          <w:bCs/>
+          <w:color w:val="222B30"/>
+          <w:sz w:val="21"/>
+          <w:szCs w:val="21"/>
+        </w:rPr>
+        <w:t xml:space="preserve">Use your city + what you rent </w:t>
+      </w:r>
+      <w:r>
+        <w:rPr>
+          <w:color w:val="222B30"/>
+          <w:sz w:val="21"/>
+          <w:szCs w:val="21"/>
+        </w:rPr>
+        <w:t xml:space="preserve">in your title, description, and headline.</w:t>
+      </w:r>
+    </w:p>
+    <w:p>
+      <w:pPr>
+        <w:pStyle w:val="ListParagraph"/>
+        <w:numPr>
+          <w:ilvl w:val="0"/>
+          <w:numId w:val="2"/>
+        </w:numPr>
+        <w:spacing w:after="70" w:line="272"/>
+      </w:pPr>
+      <w:r>
+        <w:rPr>
+          <w:b/>
+          <w:bCs/>
+          <w:color w:val="222B30"/>
+          <w:sz w:val="21"/>
+          <w:szCs w:val="21"/>
+        </w:rPr>
+        <w:t xml:space="preserve">Connect your own domain name.</w:t>
+      </w:r>
+    </w:p>
+    <w:p>
+      <w:pPr>
+        <w:pStyle w:val="ListParagraph"/>
+        <w:numPr>
+          <w:ilvl w:val="0"/>
+          <w:numId w:val="2"/>
+        </w:numPr>
+        <w:spacing w:after="70" w:line="272"/>
+      </w:pPr>
+      <w:r>
+        <w:rPr>
+          <w:b/>
+          <w:bCs/>
+          <w:color w:val="222B30"/>
+          <w:sz w:val="21"/>
+          <w:szCs w:val="21"/>
+        </w:rPr>
+        <w:t xml:space="preserve">List your business in a few local directories </w:t>
+      </w:r>
+      <w:r>
+        <w:rPr>
+          <w:color w:val="222B30"/>
+          <w:sz w:val="21"/>
+          <w:szCs w:val="21"/>
+        </w:rPr>
+        <w:t xml:space="preserve">(Yelp, Bing Places).</w:t>
       </w:r>
     </w:p>
     <w:p>
@@ -1493,6 +1809,35 @@
           <w:sz w:val="24"/>
           <w:szCs w:val="24"/>
         </w:rPr>
+        <w:t xml:space="preserve">How the money works</w:t>
+      </w:r>
+    </w:p>
+    <w:p>
+      <w:pPr>
+        <w:spacing w:after="120" w:line="278"/>
+      </w:pPr>
+      <w:r>
+        <w:rPr>
+          <w:color w:val="222B30"/>
+          <w:sz w:val="21"/>
+          <w:szCs w:val="21"/>
+        </w:rPr>
+        <w:t xml:space="preserve">Per-unit daily/weekly/2-week/monthly rates; delivery/self-pickup fees; a refundable deposit hold (not a charge); optional damage waiver; sales tax; cancellation rules. Crew pay: choose their tax status (1099/W2) and how you pay (per-job / hourly / salary), any mix; payroll views total what's owed with a Pay/Mark-paid button.</w:t>
+      </w:r>
+    </w:p>
+    <w:p>
+      <w:pPr>
+        <w:pStyle w:val="Heading2"/>
+        <w:spacing w:after="80" w:before="220"/>
+      </w:pPr>
+      <w:r>
+        <w:rPr>
+          <w:b/>
+          <w:bCs/>
+          <w:color w:val="B57A1F"/>
+          <w:sz w:val="24"/>
+          <w:szCs w:val="24"/>
+        </w:rPr>
         <w:t xml:space="preserve">Tow gear &amp; add-ons (rentals)</w:t>
       </w:r>
     </w:p>
@@ -1942,6 +2287,351 @@
           <w:szCs w:val="21"/>
         </w:rPr>
         <w:t xml:space="preserve">— decide whether you stock a plug-in one, and confirm it works with the trucks your customers drive.</w:t>
+      </w:r>
+    </w:p>
+    <w:p>
+      <w:pPr>
+        <w:pStyle w:val="Heading2"/>
+        <w:spacing w:after="80" w:before="220"/>
+      </w:pPr>
+      <w:r>
+        <w:rPr>
+          <w:b/>
+          <w:bCs/>
+          <w:color w:val="B57A1F"/>
+          <w:sz w:val="24"/>
+          <w:szCs w:val="24"/>
+        </w:rPr>
+        <w:t xml:space="preserve">Protecting yourself — insurance, agreements &amp; liability</w:t>
+      </w:r>
+    </w:p>
+    <w:tbl>
+      <w:tblPr>
+        <w:tblW w:type="dxa" w:w="9360"/>
+        <w:tblBorders>
+          <w:top w:val="none" w:color="FFFFFF" w:sz="0"/>
+          <w:left w:val="single" w:color="B57A1F" w:sz="24"/>
+          <w:bottom w:val="none" w:color="FFFFFF" w:sz="0"/>
+          <w:right w:val="none" w:color="FFFFFF" w:sz="0"/>
+          <w:insideH w:val="none" w:color="FFFFFF" w:sz="0"/>
+          <w:insideV w:val="none" w:color="FFFFFF" w:sz="0"/>
+        </w:tblBorders>
+      </w:tblPr>
+      <w:tblGrid>
+        <w:gridCol w:w="9360"/>
+      </w:tblGrid>
+      <w:tr>
+        <w:tc>
+          <w:tcPr>
+            <w:tcW w:type="dxa" w:w="9360"/>
+            <w:shd w:fill="F6ECD8" w:color="auto" w:val="clear"/>
+            <w:tcMar>
+              <w:top w:type="dxa" w:w="130"/>
+              <w:left w:type="dxa" w:w="200"/>
+              <w:bottom w:type="dxa" w:w="130"/>
+              <w:right w:type="dxa" w:w="160"/>
+            </w:tcMar>
+          </w:tcPr>
+          <w:p>
+            <w:pPr>
+              <w:spacing w:after="60"/>
+            </w:pPr>
+            <w:r>
+              <w:rPr>
+                <w:b/>
+                <w:bCs/>
+                <w:color w:val="26343C"/>
+                <w:sz w:val="20"/>
+                <w:szCs w:val="20"/>
+              </w:rPr>
+              <w:t xml:space="preserve">This is not legal advice.</w:t>
+            </w:r>
+          </w:p>
+          <w:p>
+            <w:pPr>
+              <w:spacing w:after="0" w:line="268"/>
+            </w:pPr>
+            <w:r>
+              <w:rPr>
+                <w:color w:val="222B30"/>
+                <w:sz w:val="21"/>
+                <w:szCs w:val="21"/>
+              </w:rPr>
+              <w:t xml:space="preserve">It's a plain-English summary so you know what to ask a licensed insurance agent and a North Carolina business attorney. Get their sign-off before you rent to anyone.</w:t>
+            </w:r>
+          </w:p>
+        </w:tc>
+      </w:tr>
+    </w:tbl>
+    <w:p>
+      <w:pPr>
+        <w:spacing w:after="120" w:line="278"/>
+      </w:pPr>
+      <w:r>
+        <w:rPr>
+          <w:b/>
+          <w:bCs/>
+          <w:color w:val="222B30"/>
+          <w:sz w:val="21"/>
+          <w:szCs w:val="21"/>
+        </w:rPr>
+        <w:t xml:space="preserve">The app is a record-keeper, not a shield. </w:t>
+      </w:r>
+      <w:r>
+        <w:rPr>
+          <w:color w:val="222B30"/>
+          <w:sz w:val="21"/>
+          <w:szCs w:val="21"/>
+        </w:rPr>
+        <w:t xml:space="preserve">It captures a signed rental agreement, a Certificate of Insurance, and a waiver, and it flags on the Dashboard when any are missing (red alerts). That paperwork is </w:t>
+      </w:r>
+      <w:r>
+        <w:rPr>
+          <w:b/>
+          <w:bCs/>
+          <w:color w:val="222B30"/>
+          <w:sz w:val="21"/>
+          <w:szCs w:val="21"/>
+        </w:rPr>
+        <w:t xml:space="preserve">evidence that helps you</w:t>
+      </w:r>
+      <w:r>
+        <w:rPr>
+          <w:color w:val="222B30"/>
+          <w:sz w:val="21"/>
+          <w:szCs w:val="21"/>
+        </w:rPr>
+        <w:t xml:space="preserve"> — it is not legal protection by itself. Your real protection comes from four things, none of them software:</w:t>
+      </w:r>
+    </w:p>
+    <w:p>
+      <w:pPr>
+        <w:pStyle w:val="ListParagraph"/>
+        <w:numPr>
+          <w:ilvl w:val="0"/>
+          <w:numId w:val="3"/>
+        </w:numPr>
+        <w:spacing w:after="80" w:line="272"/>
+      </w:pPr>
+      <w:r>
+        <w:rPr>
+          <w:b/>
+          <w:bCs/>
+          <w:color w:val="222B30"/>
+          <w:sz w:val="21"/>
+          <w:szCs w:val="21"/>
+        </w:rPr>
+        <w:t xml:space="preserve">Commercial insurance. </w:t>
+      </w:r>
+      <w:r>
+        <w:rPr>
+          <w:color w:val="222B30"/>
+          <w:sz w:val="21"/>
+          <w:szCs w:val="21"/>
+        </w:rPr>
+        <w:t xml:space="preserve">A general-liability policy written for equipment/trailer rental is what actually covers a crash, injury, or death. Also require customers to carry and show their own auto/liability insurance — the app collects that Certificate of Insurance and warns you when it's missing or expired.</w:t>
+      </w:r>
+    </w:p>
+    <w:p>
+      <w:pPr>
+        <w:pStyle w:val="ListParagraph"/>
+        <w:numPr>
+          <w:ilvl w:val="0"/>
+          <w:numId w:val="3"/>
+        </w:numPr>
+        <w:spacing w:after="80" w:line="272"/>
+      </w:pPr>
+      <w:r>
+        <w:rPr>
+          <w:b/>
+          <w:bCs/>
+          <w:color w:val="222B30"/>
+          <w:sz w:val="21"/>
+          <w:szCs w:val="21"/>
+        </w:rPr>
+        <w:t xml:space="preserve">An LLC. </w:t>
+      </w:r>
+      <w:r>
+        <w:rPr>
+          <w:color w:val="222B30"/>
+          <w:sz w:val="21"/>
+          <w:szCs w:val="21"/>
+        </w:rPr>
+        <w:t xml:space="preserve">Renting under a business entity keeps a lawsuit off your personal house, savings, and vehicle.</w:t>
+      </w:r>
+    </w:p>
+    <w:p>
+      <w:pPr>
+        <w:pStyle w:val="ListParagraph"/>
+        <w:numPr>
+          <w:ilvl w:val="0"/>
+          <w:numId w:val="3"/>
+        </w:numPr>
+        <w:spacing w:after="80" w:line="272"/>
+      </w:pPr>
+      <w:r>
+        <w:rPr>
+          <w:b/>
+          <w:bCs/>
+          <w:color w:val="222B30"/>
+          <w:sz w:val="21"/>
+          <w:szCs w:val="21"/>
+        </w:rPr>
+        <w:t xml:space="preserve">An attorney-reviewed agreement. </w:t>
+      </w:r>
+      <w:r>
+        <w:rPr>
+          <w:color w:val="222B30"/>
+          <w:sz w:val="21"/>
+          <w:szCs w:val="21"/>
+        </w:rPr>
+        <w:t xml:space="preserve">Have a NC attorney finalize the rental agreement. Note the limits of any waiver: in most states it </w:t>
+      </w:r>
+      <w:r>
+        <w:rPr>
+          <w:b/>
+          <w:bCs/>
+          <w:color w:val="222B30"/>
+          <w:sz w:val="21"/>
+          <w:szCs w:val="21"/>
+        </w:rPr>
+        <w:t xml:space="preserve">cannot</w:t>
+      </w:r>
+      <w:r>
+        <w:rPr>
+          <w:color w:val="222B30"/>
+          <w:sz w:val="21"/>
+          <w:szCs w:val="21"/>
+        </w:rPr>
+        <w:t xml:space="preserve"> fully release you from your own gross negligence, and it's hard to waive away a personal-injury or wrongful-death claim by the person who was hurt. That's exactly why insurance is non-negotiable.</w:t>
+      </w:r>
+    </w:p>
+    <w:p>
+      <w:pPr>
+        <w:pStyle w:val="ListParagraph"/>
+        <w:numPr>
+          <w:ilvl w:val="0"/>
+          <w:numId w:val="3"/>
+        </w:numPr>
+        <w:spacing w:after="80" w:line="272"/>
+      </w:pPr>
+      <w:r>
+        <w:rPr>
+          <w:b/>
+          <w:bCs/>
+          <w:color w:val="222B30"/>
+          <w:sz w:val="21"/>
+          <w:szCs w:val="21"/>
+        </w:rPr>
+        <w:t xml:space="preserve">A careful, documented process. </w:t>
+      </w:r>
+      <w:r>
+        <w:rPr>
+          <w:color w:val="222B30"/>
+          <w:sz w:val="21"/>
+          <w:szCs w:val="21"/>
+        </w:rPr>
+        <w:t xml:space="preserve">Inspect every trailer and every attachment before it goes out, keep only quality rated hardware, and keep records. “We inspected it and it was rated for the load” is what keeps a negligence claim off you.</w:t>
+      </w:r>
+    </w:p>
+    <w:p>
+      <w:pPr>
+        <w:spacing w:after="120" w:line="278"/>
+      </w:pPr>
+      <w:r>
+        <w:rPr>
+          <w:b/>
+          <w:bCs/>
+          <w:color w:val="222B30"/>
+          <w:sz w:val="21"/>
+          <w:szCs w:val="21"/>
+        </w:rPr>
+        <w:t xml:space="preserve">If a customer does something wrong (a crash, overloading, illegal disposal): </w:t>
+      </w:r>
+      <w:r>
+        <w:rPr>
+          <w:color w:val="222B30"/>
+          <w:sz w:val="21"/>
+          <w:szCs w:val="21"/>
+        </w:rPr>
+        <w:t xml:space="preserve">your signed agreement puts responsibility for safe, legal towing and loading on them, and their own insurance is the first line — but you'll still want your own liability policy in case you're named too. Never hand over a trailer without the agreement signed; the Dashboard flags any that aren't.</w:t>
+      </w:r>
+    </w:p>
+    <w:p>
+      <w:pPr>
+        <w:spacing w:after="120" w:line="278"/>
+      </w:pPr>
+      <w:r>
+        <w:rPr>
+          <w:b/>
+          <w:bCs/>
+          <w:color w:val="222B30"/>
+          <w:sz w:val="21"/>
+          <w:szCs w:val="21"/>
+        </w:rPr>
+        <w:t xml:space="preserve">The wrong-attachment scenario is your sharpest risk. </w:t>
+      </w:r>
+      <w:r>
+        <w:rPr>
+          <w:color w:val="222B30"/>
+          <w:sz w:val="21"/>
+          <w:szCs w:val="21"/>
+        </w:rPr>
+        <w:t xml:space="preserve">Because you now supply tow gear, a failed ball mount can pull you into a </w:t>
+      </w:r>
+      <w:r>
+        <w:rPr>
+          <w:b/>
+          <w:bCs/>
+          <w:color w:val="222B30"/>
+          <w:sz w:val="21"/>
+          <w:szCs w:val="21"/>
+        </w:rPr>
+        <w:t xml:space="preserve">product-liability</w:t>
+      </w:r>
+      <w:r>
+        <w:rPr>
+          <w:color w:val="222B30"/>
+          <w:sz w:val="21"/>
+          <w:szCs w:val="21"/>
+        </w:rPr>
+        <w:t xml:space="preserve"> claim on top of negligence — and a waiver may not save you from that. The app is built to reduce it: the booking page tells the customer </w:t>
+      </w:r>
+      <w:r>
+        <w:rPr>
+          <w:b/>
+          <w:bCs/>
+          <w:color w:val="222B30"/>
+          <w:sz w:val="21"/>
+          <w:szCs w:val="21"/>
+        </w:rPr>
+        <w:t xml:space="preserve">they</w:t>
+      </w:r>
+      <w:r>
+        <w:rPr>
+          <w:color w:val="222B30"/>
+          <w:sz w:val="21"/>
+          <w:szCs w:val="21"/>
+        </w:rPr>
+        <w:t xml:space="preserve"> are responsible for confirming size and load rating, gear is offered “as-is,” and the agreement has a dedicated tow-gear clause. Keep it that way — don't </w:t>
+      </w:r>
+      <w:r>
+        <w:rPr>
+          <w:b/>
+          <w:bCs/>
+          <w:color w:val="222B30"/>
+          <w:sz w:val="21"/>
+          <w:szCs w:val="21"/>
+        </w:rPr>
+        <w:t xml:space="preserve">certify</w:t>
+      </w:r>
+      <w:r>
+        <w:rPr>
+          <w:color w:val="222B30"/>
+          <w:sz w:val="21"/>
+          <w:szCs w:val="21"/>
+        </w:rPr>
+        <w:t xml:space="preserve"> that a given ball or mount fits a customer's truck; supply rated gear and let them confirm the fit. Stock only stamped, load-rated hardware from reputable makers, and inspect it every time.</w:t>
       </w:r>
     </w:p>
     <w:p>

</xml_diff>

<commit_message>
Handbook: add tow-gear liability rule to the startup checklist
Mirror the don't-certify-fitment / product-liability guidance into the
'Before you open' startup checklist so it's not only in the protection
section.

Co-Authored-By: Claude Opus 4.8 <noreply@anthropic.com>
Claude-Session: https://claude.ai/code/session_01FEggkQBQsZanbMCUNRbcMq
</commit_message>
<xml_diff>
--- a/Yardhand-Handbook.docx
+++ b/Yardhand-Handbook.docx
@@ -1041,6 +1041,28 @@
           <w:szCs w:val="21"/>
         </w:rPr>
         <w:t xml:space="preserve">Settings → Tow gear &amp; add-ons → set each item's On-hand count to what you actually own (buy quality, load-rated hardware).</w:t>
+      </w:r>
+    </w:p>
+    <w:p>
+      <w:pPr>
+        <w:spacing w:after="60" w:line="268"/>
+        <w:ind w:left="300"/>
+      </w:pPr>
+      <w:r>
+        <w:rPr>
+          <w:color w:val="B57A1F"/>
+          <w:sz w:val="21"/>
+          <w:szCs w:val="21"/>
+        </w:rPr>
+        <w:t xml:space="preserve">☐  </w:t>
+      </w:r>
+      <w:r>
+        <w:rPr>
+          <w:color w:val="222B30"/>
+          <w:sz w:val="21"/>
+          <w:szCs w:val="21"/>
+        </w:rPr>
+        <w:t xml:space="preserve">Adopt the tow-gear rule that protects you: supplying gear is your sharpest liability (a failed ball mount can mean a product-liability claim a waiver may not cover). Never certify that a ball or mount fits a customer's truck — supply rated, inspected gear and let them confirm the fit. The booking page already tells customers they're responsible for size/rating, offers gear as-is, and the rental agreement has a dedicated tow-gear clause; keep all three in place.</w:t>
       </w:r>
     </w:p>
     <w:p>

</xml_diff>